<commit_message>
docs: split AquaChek guidance by test pad
</commit_message>
<xml_diff>
--- a/docs/pool-chemistry-review-guide.docx
+++ b/docs/pool-chemistry-review-guide.docx
@@ -1220,6 +1220,996 @@
         <w:t>זהו פד פיזי אחד עם שתי סקאלות. בבריכת כלור קוראים את שורת הכלור; בבריכת ברום קוראים את שורת הברום.</w:t>
       </w:r>
     </w:p>
+    <w:tbl>
+      <w:tblPr>
+        <w:tblW w:type="auto" w:w="0"/>
+        <w:tblLayout w:type="fixed"/>
+        <w:tblLook w:firstColumn="1" w:firstRow="1" w:lastColumn="0" w:lastRow="0" w:noHBand="0" w:noVBand="1" w:val="04A0"/>
+      </w:tblPr>
+      <w:tblGrid>
+        <w:gridCol w:w="2088"/>
+        <w:gridCol w:w="1152"/>
+        <w:gridCol w:w="1728"/>
+        <w:gridCol w:w="4032"/>
+      </w:tblGrid>
+      <w:tr>
+        <w:tc>
+          <w:tcPr>
+            <w:tcW w:type="dxa" w:w="2592"/>
+            <w:shd w:fill="E6F9FC"/>
+            <w:tcBorders>
+              <w:top w:val="single" w:sz="6" w:space="0" w:color="D8E6EA"/>
+              <w:left w:val="single" w:sz="6" w:space="0" w:color="D8E6EA"/>
+              <w:bottom w:val="single" w:sz="6" w:space="0" w:color="D8E6EA"/>
+              <w:right w:val="single" w:sz="6" w:space="0" w:color="D8E6EA"/>
+            </w:tcBorders>
+            <w:tcMar>
+              <w:top w:w="110" w:type="dxa"/>
+              <w:start w:w="120" w:type="dxa"/>
+              <w:bottom w:w="110" w:type="dxa"/>
+              <w:end w:w="120" w:type="dxa"/>
+            </w:tcMar>
+            <w:vAlign w:val="center"/>
+          </w:tcPr>
+          <w:p>
+            <w:pPr>
+              <w:spacing w:after="0"/>
+              <w:jc w:val="right"/>
+              <w:bidi w:val="1"/>
+            </w:pPr>
+            <w:r>
+              <w:rPr>
+                <w:rFonts w:ascii="Arial" w:hAnsi="Arial" w:cs="Arial"/>
+                <w:b/>
+                <w:color w:val="0B2545"/>
+                <w:sz w:val="19"/>
+              </w:rPr>
+              <w:t>הצבע שרואים על הפד</w:t>
+            </w:r>
+          </w:p>
+        </w:tc>
+        <w:tc>
+          <w:tcPr>
+            <w:tcW w:type="dxa" w:w="2592"/>
+            <w:shd w:fill="E6F9FC"/>
+            <w:tcBorders>
+              <w:top w:val="single" w:sz="6" w:space="0" w:color="D8E6EA"/>
+              <w:left w:val="single" w:sz="6" w:space="0" w:color="D8E6EA"/>
+              <w:bottom w:val="single" w:sz="6" w:space="0" w:color="D8E6EA"/>
+              <w:right w:val="single" w:sz="6" w:space="0" w:color="D8E6EA"/>
+            </w:tcBorders>
+            <w:tcMar>
+              <w:top w:w="110" w:type="dxa"/>
+              <w:start w:w="120" w:type="dxa"/>
+              <w:bottom w:w="110" w:type="dxa"/>
+              <w:end w:w="120" w:type="dxa"/>
+            </w:tcMar>
+            <w:vAlign w:val="center"/>
+          </w:tcPr>
+          <w:p>
+            <w:pPr>
+              <w:spacing w:after="0"/>
+              <w:jc w:val="right"/>
+              <w:bidi w:val="1"/>
+            </w:pPr>
+            <w:r>
+              <w:rPr>
+                <w:rFonts w:ascii="Arial" w:hAnsi="Arial" w:cs="Arial"/>
+                <w:b/>
+                <w:color w:val="0B2545"/>
+                <w:sz w:val="19"/>
+              </w:rPr>
+              <w:t>ערך</w:t>
+            </w:r>
+          </w:p>
+        </w:tc>
+        <w:tc>
+          <w:tcPr>
+            <w:tcW w:type="dxa" w:w="2592"/>
+            <w:shd w:fill="E6F9FC"/>
+            <w:tcBorders>
+              <w:top w:val="single" w:sz="6" w:space="0" w:color="D8E6EA"/>
+              <w:left w:val="single" w:sz="6" w:space="0" w:color="D8E6EA"/>
+              <w:bottom w:val="single" w:sz="6" w:space="0" w:color="D8E6EA"/>
+              <w:right w:val="single" w:sz="6" w:space="0" w:color="D8E6EA"/>
+            </w:tcBorders>
+            <w:tcMar>
+              <w:top w:w="110" w:type="dxa"/>
+              <w:start w:w="120" w:type="dxa"/>
+              <w:bottom w:w="110" w:type="dxa"/>
+              <w:end w:w="120" w:type="dxa"/>
+            </w:tcMar>
+            <w:vAlign w:val="center"/>
+          </w:tcPr>
+          <w:p>
+            <w:pPr>
+              <w:spacing w:after="0"/>
+              <w:jc w:val="right"/>
+              <w:bidi w:val="1"/>
+            </w:pPr>
+            <w:r>
+              <w:rPr>
+                <w:rFonts w:ascii="Arial" w:hAnsi="Arial" w:cs="Arial"/>
+                <w:b/>
+                <w:color w:val="0B2545"/>
+                <w:sz w:val="19"/>
+              </w:rPr>
+              <w:t>משמעות</w:t>
+            </w:r>
+          </w:p>
+        </w:tc>
+        <w:tc>
+          <w:tcPr>
+            <w:tcW w:type="dxa" w:w="2592"/>
+            <w:shd w:fill="E6F9FC"/>
+            <w:tcBorders>
+              <w:top w:val="single" w:sz="6" w:space="0" w:color="D8E6EA"/>
+              <w:left w:val="single" w:sz="6" w:space="0" w:color="D8E6EA"/>
+              <w:bottom w:val="single" w:sz="6" w:space="0" w:color="D8E6EA"/>
+              <w:right w:val="single" w:sz="6" w:space="0" w:color="D8E6EA"/>
+            </w:tcBorders>
+            <w:tcMar>
+              <w:top w:w="110" w:type="dxa"/>
+              <w:start w:w="120" w:type="dxa"/>
+              <w:bottom w:w="110" w:type="dxa"/>
+              <w:end w:w="120" w:type="dxa"/>
+            </w:tcMar>
+            <w:vAlign w:val="center"/>
+          </w:tcPr>
+          <w:p>
+            <w:pPr>
+              <w:spacing w:after="0"/>
+              <w:jc w:val="right"/>
+              <w:bidi w:val="1"/>
+            </w:pPr>
+            <w:r>
+              <w:rPr>
+                <w:rFonts w:ascii="Arial" w:hAnsi="Arial" w:cs="Arial"/>
+                <w:b/>
+                <w:color w:val="0B2545"/>
+                <w:sz w:val="19"/>
+              </w:rPr>
+              <w:t>מה מציעים למשתמש</w:t>
+            </w:r>
+          </w:p>
+        </w:tc>
+      </w:tr>
+      <w:tr>
+        <w:tc>
+          <w:tcPr>
+            <w:tcW w:type="dxa" w:w="2088"/>
+            <w:shd w:fill="FFF9A8"/>
+            <w:tcBorders>
+              <w:top w:val="single" w:sz="6" w:space="0" w:color="D8E6EA"/>
+              <w:left w:val="single" w:sz="6" w:space="0" w:color="D8E6EA"/>
+              <w:bottom w:val="single" w:sz="6" w:space="0" w:color="D8E6EA"/>
+              <w:right w:val="single" w:sz="6" w:space="0" w:color="D8E6EA"/>
+            </w:tcBorders>
+            <w:tcMar>
+              <w:top w:w="110" w:type="dxa"/>
+              <w:start w:w="120" w:type="dxa"/>
+              <w:bottom w:w="110" w:type="dxa"/>
+              <w:end w:w="120" w:type="dxa"/>
+            </w:tcMar>
+            <w:vAlign w:val="center"/>
+          </w:tcPr>
+          <w:p>
+            <w:pPr>
+              <w:spacing w:after="0"/>
+              <w:jc w:val="right"/>
+              <w:bidi w:val="1"/>
+            </w:pPr>
+            <w:r>
+              <w:rPr>
+                <w:rFonts w:ascii="Arial" w:hAnsi="Arial" w:cs="Arial"/>
+                <w:b/>
+                <w:color w:val="0B2545"/>
+                <w:sz w:val="18"/>
+              </w:rPr>
+              <w:t>צהוב בהיר</w:t>
+            </w:r>
+          </w:p>
+        </w:tc>
+        <w:tc>
+          <w:tcPr>
+            <w:tcW w:type="dxa" w:w="1152"/>
+            <w:tcBorders>
+              <w:top w:val="single" w:sz="6" w:space="0" w:color="D8E6EA"/>
+              <w:left w:val="single" w:sz="6" w:space="0" w:color="D8E6EA"/>
+              <w:bottom w:val="single" w:sz="6" w:space="0" w:color="D8E6EA"/>
+              <w:right w:val="single" w:sz="6" w:space="0" w:color="D8E6EA"/>
+            </w:tcBorders>
+            <w:tcMar>
+              <w:top w:w="110" w:type="dxa"/>
+              <w:start w:w="120" w:type="dxa"/>
+              <w:bottom w:w="110" w:type="dxa"/>
+              <w:end w:w="120" w:type="dxa"/>
+            </w:tcMar>
+            <w:vAlign w:val="center"/>
+          </w:tcPr>
+          <w:p>
+            <w:pPr>
+              <w:spacing w:after="0"/>
+              <w:jc w:val="right"/>
+              <w:bidi w:val="1"/>
+            </w:pPr>
+            <w:r>
+              <w:rPr>
+                <w:rFonts w:ascii="Arial" w:hAnsi="Arial" w:cs="Arial"/>
+                <w:b w:val="0"/>
+                <w:color w:val="0B2545"/>
+                <w:sz w:val="18"/>
+              </w:rPr>
+              <w:t>TC 0 / TB 0</w:t>
+            </w:r>
+          </w:p>
+        </w:tc>
+        <w:tc>
+          <w:tcPr>
+            <w:tcW w:type="dxa" w:w="1728"/>
+            <w:tcBorders>
+              <w:top w:val="single" w:sz="6" w:space="0" w:color="D8E6EA"/>
+              <w:left w:val="single" w:sz="6" w:space="0" w:color="D8E6EA"/>
+              <w:bottom w:val="single" w:sz="6" w:space="0" w:color="D8E6EA"/>
+              <w:right w:val="single" w:sz="6" w:space="0" w:color="D8E6EA"/>
+            </w:tcBorders>
+            <w:tcMar>
+              <w:top w:w="110" w:type="dxa"/>
+              <w:start w:w="120" w:type="dxa"/>
+              <w:bottom w:w="110" w:type="dxa"/>
+              <w:end w:w="120" w:type="dxa"/>
+            </w:tcMar>
+            <w:vAlign w:val="center"/>
+          </w:tcPr>
+          <w:p>
+            <w:pPr>
+              <w:spacing w:after="0"/>
+              <w:jc w:val="right"/>
+              <w:bidi w:val="1"/>
+            </w:pPr>
+            <w:r>
+              <w:rPr>
+                <w:rFonts w:ascii="Arial" w:hAnsi="Arial" w:cs="Arial"/>
+                <w:b w:val="0"/>
+                <w:color w:val="0B2545"/>
+                <w:sz w:val="18"/>
+              </w:rPr>
+              <w:t>נמוך מאוד</w:t>
+            </w:r>
+          </w:p>
+        </w:tc>
+        <w:tc>
+          <w:tcPr>
+            <w:tcW w:type="dxa" w:w="4032"/>
+            <w:tcBorders>
+              <w:top w:val="single" w:sz="6" w:space="0" w:color="D8E6EA"/>
+              <w:left w:val="single" w:sz="6" w:space="0" w:color="D8E6EA"/>
+              <w:bottom w:val="single" w:sz="6" w:space="0" w:color="D8E6EA"/>
+              <w:right w:val="single" w:sz="6" w:space="0" w:color="D8E6EA"/>
+            </w:tcBorders>
+            <w:tcMar>
+              <w:top w:w="110" w:type="dxa"/>
+              <w:start w:w="120" w:type="dxa"/>
+              <w:bottom w:w="110" w:type="dxa"/>
+              <w:end w:w="120" w:type="dxa"/>
+            </w:tcMar>
+            <w:vAlign w:val="center"/>
+          </w:tcPr>
+          <w:p>
+            <w:pPr>
+              <w:spacing w:after="0"/>
+              <w:jc w:val="right"/>
+              <w:bidi w:val="1"/>
+            </w:pPr>
+            <w:r>
+              <w:rPr>
+                <w:rFonts w:ascii="Arial" w:hAnsi="Arial" w:cs="Arial"/>
+                <w:b w:val="0"/>
+                <w:color w:val="0B2545"/>
+                <w:sz w:val="18"/>
+              </w:rPr>
+              <w:t>אין כמעט חומר חיטוי; לבדוק גם כלור חופשי ולהוסיף לפי סוג הבריכה.</w:t>
+            </w:r>
+          </w:p>
+        </w:tc>
+      </w:tr>
+      <w:tr>
+        <w:tc>
+          <w:tcPr>
+            <w:tcW w:type="dxa" w:w="2088"/>
+            <w:shd w:fill="F2FEAA"/>
+            <w:tcBorders>
+              <w:top w:val="single" w:sz="6" w:space="0" w:color="D8E6EA"/>
+              <w:left w:val="single" w:sz="6" w:space="0" w:color="D8E6EA"/>
+              <w:bottom w:val="single" w:sz="6" w:space="0" w:color="D8E6EA"/>
+              <w:right w:val="single" w:sz="6" w:space="0" w:color="D8E6EA"/>
+            </w:tcBorders>
+            <w:tcMar>
+              <w:top w:w="110" w:type="dxa"/>
+              <w:start w:w="120" w:type="dxa"/>
+              <w:bottom w:w="110" w:type="dxa"/>
+              <w:end w:w="120" w:type="dxa"/>
+            </w:tcMar>
+            <w:vAlign w:val="center"/>
+          </w:tcPr>
+          <w:p>
+            <w:pPr>
+              <w:spacing w:after="0"/>
+              <w:jc w:val="right"/>
+              <w:bidi w:val="1"/>
+            </w:pPr>
+            <w:r>
+              <w:rPr>
+                <w:rFonts w:ascii="Arial" w:hAnsi="Arial" w:cs="Arial"/>
+                <w:b/>
+                <w:color w:val="0B2545"/>
+                <w:sz w:val="18"/>
+              </w:rPr>
+              <w:t>צהוב-ירקרק</w:t>
+            </w:r>
+          </w:p>
+        </w:tc>
+        <w:tc>
+          <w:tcPr>
+            <w:tcW w:type="dxa" w:w="1152"/>
+            <w:tcBorders>
+              <w:top w:val="single" w:sz="6" w:space="0" w:color="D8E6EA"/>
+              <w:left w:val="single" w:sz="6" w:space="0" w:color="D8E6EA"/>
+              <w:bottom w:val="single" w:sz="6" w:space="0" w:color="D8E6EA"/>
+              <w:right w:val="single" w:sz="6" w:space="0" w:color="D8E6EA"/>
+            </w:tcBorders>
+            <w:tcMar>
+              <w:top w:w="110" w:type="dxa"/>
+              <w:start w:w="120" w:type="dxa"/>
+              <w:bottom w:w="110" w:type="dxa"/>
+              <w:end w:w="120" w:type="dxa"/>
+            </w:tcMar>
+            <w:vAlign w:val="center"/>
+          </w:tcPr>
+          <w:p>
+            <w:pPr>
+              <w:spacing w:after="0"/>
+              <w:jc w:val="right"/>
+              <w:bidi w:val="1"/>
+            </w:pPr>
+            <w:r>
+              <w:rPr>
+                <w:rFonts w:ascii="Arial" w:hAnsi="Arial" w:cs="Arial"/>
+                <w:b w:val="0"/>
+                <w:color w:val="0B2545"/>
+                <w:sz w:val="18"/>
+              </w:rPr>
+              <w:t>TC 0.5 / TB 1</w:t>
+            </w:r>
+          </w:p>
+        </w:tc>
+        <w:tc>
+          <w:tcPr>
+            <w:tcW w:type="dxa" w:w="1728"/>
+            <w:tcBorders>
+              <w:top w:val="single" w:sz="6" w:space="0" w:color="D8E6EA"/>
+              <w:left w:val="single" w:sz="6" w:space="0" w:color="D8E6EA"/>
+              <w:bottom w:val="single" w:sz="6" w:space="0" w:color="D8E6EA"/>
+              <w:right w:val="single" w:sz="6" w:space="0" w:color="D8E6EA"/>
+            </w:tcBorders>
+            <w:tcMar>
+              <w:top w:w="110" w:type="dxa"/>
+              <w:start w:w="120" w:type="dxa"/>
+              <w:bottom w:w="110" w:type="dxa"/>
+              <w:end w:w="120" w:type="dxa"/>
+            </w:tcMar>
+            <w:vAlign w:val="center"/>
+          </w:tcPr>
+          <w:p>
+            <w:pPr>
+              <w:spacing w:after="0"/>
+              <w:jc w:val="right"/>
+              <w:bidi w:val="1"/>
+            </w:pPr>
+            <w:r>
+              <w:rPr>
+                <w:rFonts w:ascii="Arial" w:hAnsi="Arial" w:cs="Arial"/>
+                <w:b w:val="0"/>
+                <w:color w:val="0B2545"/>
+                <w:sz w:val="18"/>
+              </w:rPr>
+              <w:t>נמוך</w:t>
+            </w:r>
+          </w:p>
+        </w:tc>
+        <w:tc>
+          <w:tcPr>
+            <w:tcW w:type="dxa" w:w="4032"/>
+            <w:tcBorders>
+              <w:top w:val="single" w:sz="6" w:space="0" w:color="D8E6EA"/>
+              <w:left w:val="single" w:sz="6" w:space="0" w:color="D8E6EA"/>
+              <w:bottom w:val="single" w:sz="6" w:space="0" w:color="D8E6EA"/>
+              <w:right w:val="single" w:sz="6" w:space="0" w:color="D8E6EA"/>
+            </w:tcBorders>
+            <w:tcMar>
+              <w:top w:w="110" w:type="dxa"/>
+              <w:start w:w="120" w:type="dxa"/>
+              <w:bottom w:w="110" w:type="dxa"/>
+              <w:end w:w="120" w:type="dxa"/>
+            </w:tcMar>
+            <w:vAlign w:val="center"/>
+          </w:tcPr>
+          <w:p>
+            <w:pPr>
+              <w:spacing w:after="0"/>
+              <w:jc w:val="right"/>
+              <w:bidi w:val="1"/>
+            </w:pPr>
+            <w:r>
+              <w:rPr>
+                <w:rFonts w:ascii="Arial" w:hAnsi="Arial" w:cs="Arial"/>
+                <w:b w:val="0"/>
+                <w:color w:val="0B2545"/>
+                <w:sz w:val="18"/>
+              </w:rPr>
+              <w:t>רמת החיטוי נמוכה; להעלות בהדרגה.</w:t>
+            </w:r>
+          </w:p>
+        </w:tc>
+      </w:tr>
+      <w:tr>
+        <w:tc>
+          <w:tcPr>
+            <w:tcW w:type="dxa" w:w="2088"/>
+            <w:shd w:fill="E7F5A0"/>
+            <w:tcBorders>
+              <w:top w:val="single" w:sz="6" w:space="0" w:color="D8E6EA"/>
+              <w:left w:val="single" w:sz="6" w:space="0" w:color="D8E6EA"/>
+              <w:bottom w:val="single" w:sz="6" w:space="0" w:color="D8E6EA"/>
+              <w:right w:val="single" w:sz="6" w:space="0" w:color="D8E6EA"/>
+            </w:tcBorders>
+            <w:tcMar>
+              <w:top w:w="110" w:type="dxa"/>
+              <w:start w:w="120" w:type="dxa"/>
+              <w:bottom w:w="110" w:type="dxa"/>
+              <w:end w:w="120" w:type="dxa"/>
+            </w:tcMar>
+            <w:vAlign w:val="center"/>
+          </w:tcPr>
+          <w:p>
+            <w:pPr>
+              <w:spacing w:after="0"/>
+              <w:jc w:val="right"/>
+              <w:bidi w:val="1"/>
+            </w:pPr>
+            <w:r>
+              <w:rPr>
+                <w:rFonts w:ascii="Arial" w:hAnsi="Arial" w:cs="Arial"/>
+                <w:b/>
+                <w:color w:val="0B2545"/>
+                <w:sz w:val="18"/>
+              </w:rPr>
+              <w:t>ירוק בהיר</w:t>
+            </w:r>
+          </w:p>
+        </w:tc>
+        <w:tc>
+          <w:tcPr>
+            <w:tcW w:type="dxa" w:w="1152"/>
+            <w:tcBorders>
+              <w:top w:val="single" w:sz="6" w:space="0" w:color="D8E6EA"/>
+              <w:left w:val="single" w:sz="6" w:space="0" w:color="D8E6EA"/>
+              <w:bottom w:val="single" w:sz="6" w:space="0" w:color="D8E6EA"/>
+              <w:right w:val="single" w:sz="6" w:space="0" w:color="D8E6EA"/>
+            </w:tcBorders>
+            <w:tcMar>
+              <w:top w:w="110" w:type="dxa"/>
+              <w:start w:w="120" w:type="dxa"/>
+              <w:bottom w:w="110" w:type="dxa"/>
+              <w:end w:w="120" w:type="dxa"/>
+            </w:tcMar>
+            <w:vAlign w:val="center"/>
+          </w:tcPr>
+          <w:p>
+            <w:pPr>
+              <w:spacing w:after="0"/>
+              <w:jc w:val="right"/>
+              <w:bidi w:val="1"/>
+            </w:pPr>
+            <w:r>
+              <w:rPr>
+                <w:rFonts w:ascii="Arial" w:hAnsi="Arial" w:cs="Arial"/>
+                <w:b w:val="0"/>
+                <w:color w:val="0B2545"/>
+                <w:sz w:val="18"/>
+              </w:rPr>
+              <w:t>TC 1 / TB 2</w:t>
+            </w:r>
+          </w:p>
+        </w:tc>
+        <w:tc>
+          <w:tcPr>
+            <w:tcW w:type="dxa" w:w="1728"/>
+            <w:tcBorders>
+              <w:top w:val="single" w:sz="6" w:space="0" w:color="D8E6EA"/>
+              <w:left w:val="single" w:sz="6" w:space="0" w:color="D8E6EA"/>
+              <w:bottom w:val="single" w:sz="6" w:space="0" w:color="D8E6EA"/>
+              <w:right w:val="single" w:sz="6" w:space="0" w:color="D8E6EA"/>
+            </w:tcBorders>
+            <w:tcMar>
+              <w:top w:w="110" w:type="dxa"/>
+              <w:start w:w="120" w:type="dxa"/>
+              <w:bottom w:w="110" w:type="dxa"/>
+              <w:end w:w="120" w:type="dxa"/>
+            </w:tcMar>
+            <w:vAlign w:val="center"/>
+          </w:tcPr>
+          <w:p>
+            <w:pPr>
+              <w:spacing w:after="0"/>
+              <w:jc w:val="right"/>
+              <w:bidi w:val="1"/>
+            </w:pPr>
+            <w:r>
+              <w:rPr>
+                <w:rFonts w:ascii="Arial" w:hAnsi="Arial" w:cs="Arial"/>
+                <w:b w:val="0"/>
+                <w:color w:val="0B2545"/>
+                <w:sz w:val="18"/>
+              </w:rPr>
+              <w:t>קצה תחתון תקין</w:t>
+            </w:r>
+          </w:p>
+        </w:tc>
+        <w:tc>
+          <w:tcPr>
+            <w:tcW w:type="dxa" w:w="4032"/>
+            <w:tcBorders>
+              <w:top w:val="single" w:sz="6" w:space="0" w:color="D8E6EA"/>
+              <w:left w:val="single" w:sz="6" w:space="0" w:color="D8E6EA"/>
+              <w:bottom w:val="single" w:sz="6" w:space="0" w:color="D8E6EA"/>
+              <w:right w:val="single" w:sz="6" w:space="0" w:color="D8E6EA"/>
+            </w:tcBorders>
+            <w:tcMar>
+              <w:top w:w="110" w:type="dxa"/>
+              <w:start w:w="120" w:type="dxa"/>
+              <w:bottom w:w="110" w:type="dxa"/>
+              <w:end w:w="120" w:type="dxa"/>
+            </w:tcMar>
+            <w:vAlign w:val="center"/>
+          </w:tcPr>
+          <w:p>
+            <w:pPr>
+              <w:spacing w:after="0"/>
+              <w:jc w:val="right"/>
+              <w:bidi w:val="1"/>
+            </w:pPr>
+            <w:r>
+              <w:rPr>
+                <w:rFonts w:ascii="Arial" w:hAnsi="Arial" w:cs="Arial"/>
+                <w:b w:val="0"/>
+                <w:color w:val="0B2545"/>
+                <w:sz w:val="18"/>
+              </w:rPr>
+              <w:t>לרוב אין תיקון מיידי; לוודא שכלור חופשי תקין.</w:t>
+            </w:r>
+          </w:p>
+        </w:tc>
+      </w:tr>
+      <w:tr>
+        <w:tc>
+          <w:tcPr>
+            <w:tcW w:type="dxa" w:w="2088"/>
+            <w:shd w:fill="B8D88C"/>
+            <w:tcBorders>
+              <w:top w:val="single" w:sz="6" w:space="0" w:color="D8E6EA"/>
+              <w:left w:val="single" w:sz="6" w:space="0" w:color="D8E6EA"/>
+              <w:bottom w:val="single" w:sz="6" w:space="0" w:color="D8E6EA"/>
+              <w:right w:val="single" w:sz="6" w:space="0" w:color="D8E6EA"/>
+            </w:tcBorders>
+            <w:tcMar>
+              <w:top w:w="110" w:type="dxa"/>
+              <w:start w:w="120" w:type="dxa"/>
+              <w:bottom w:w="110" w:type="dxa"/>
+              <w:end w:w="120" w:type="dxa"/>
+            </w:tcMar>
+            <w:vAlign w:val="center"/>
+          </w:tcPr>
+          <w:p>
+            <w:pPr>
+              <w:spacing w:after="0"/>
+              <w:jc w:val="right"/>
+              <w:bidi w:val="1"/>
+            </w:pPr>
+            <w:r>
+              <w:rPr>
+                <w:rFonts w:ascii="Arial" w:hAnsi="Arial" w:cs="Arial"/>
+                <w:b/>
+                <w:color w:val="0B2545"/>
+                <w:sz w:val="18"/>
+              </w:rPr>
+              <w:t>ירוק</w:t>
+            </w:r>
+          </w:p>
+        </w:tc>
+        <w:tc>
+          <w:tcPr>
+            <w:tcW w:type="dxa" w:w="1152"/>
+            <w:tcBorders>
+              <w:top w:val="single" w:sz="6" w:space="0" w:color="D8E6EA"/>
+              <w:left w:val="single" w:sz="6" w:space="0" w:color="D8E6EA"/>
+              <w:bottom w:val="single" w:sz="6" w:space="0" w:color="D8E6EA"/>
+              <w:right w:val="single" w:sz="6" w:space="0" w:color="D8E6EA"/>
+            </w:tcBorders>
+            <w:tcMar>
+              <w:top w:w="110" w:type="dxa"/>
+              <w:start w:w="120" w:type="dxa"/>
+              <w:bottom w:w="110" w:type="dxa"/>
+              <w:end w:w="120" w:type="dxa"/>
+            </w:tcMar>
+            <w:vAlign w:val="center"/>
+          </w:tcPr>
+          <w:p>
+            <w:pPr>
+              <w:spacing w:after="0"/>
+              <w:jc w:val="right"/>
+              <w:bidi w:val="1"/>
+            </w:pPr>
+            <w:r>
+              <w:rPr>
+                <w:rFonts w:ascii="Arial" w:hAnsi="Arial" w:cs="Arial"/>
+                <w:b w:val="0"/>
+                <w:color w:val="0B2545"/>
+                <w:sz w:val="18"/>
+              </w:rPr>
+              <w:t>TC 3 / TB 5</w:t>
+            </w:r>
+          </w:p>
+        </w:tc>
+        <w:tc>
+          <w:tcPr>
+            <w:tcW w:type="dxa" w:w="1728"/>
+            <w:tcBorders>
+              <w:top w:val="single" w:sz="6" w:space="0" w:color="D8E6EA"/>
+              <w:left w:val="single" w:sz="6" w:space="0" w:color="D8E6EA"/>
+              <w:bottom w:val="single" w:sz="6" w:space="0" w:color="D8E6EA"/>
+              <w:right w:val="single" w:sz="6" w:space="0" w:color="D8E6EA"/>
+            </w:tcBorders>
+            <w:tcMar>
+              <w:top w:w="110" w:type="dxa"/>
+              <w:start w:w="120" w:type="dxa"/>
+              <w:bottom w:w="110" w:type="dxa"/>
+              <w:end w:w="120" w:type="dxa"/>
+            </w:tcMar>
+            <w:vAlign w:val="center"/>
+          </w:tcPr>
+          <w:p>
+            <w:pPr>
+              <w:spacing w:after="0"/>
+              <w:jc w:val="right"/>
+              <w:bidi w:val="1"/>
+            </w:pPr>
+            <w:r>
+              <w:rPr>
+                <w:rFonts w:ascii="Arial" w:hAnsi="Arial" w:cs="Arial"/>
+                <w:b w:val="0"/>
+                <w:color w:val="0B2545"/>
+                <w:sz w:val="18"/>
+              </w:rPr>
+              <w:t>אידיאלי</w:t>
+            </w:r>
+          </w:p>
+        </w:tc>
+        <w:tc>
+          <w:tcPr>
+            <w:tcW w:type="dxa" w:w="4032"/>
+            <w:tcBorders>
+              <w:top w:val="single" w:sz="6" w:space="0" w:color="D8E6EA"/>
+              <w:left w:val="single" w:sz="6" w:space="0" w:color="D8E6EA"/>
+              <w:bottom w:val="single" w:sz="6" w:space="0" w:color="D8E6EA"/>
+              <w:right w:val="single" w:sz="6" w:space="0" w:color="D8E6EA"/>
+            </w:tcBorders>
+            <w:tcMar>
+              <w:top w:w="110" w:type="dxa"/>
+              <w:start w:w="120" w:type="dxa"/>
+              <w:bottom w:w="110" w:type="dxa"/>
+              <w:end w:w="120" w:type="dxa"/>
+            </w:tcMar>
+            <w:vAlign w:val="center"/>
+          </w:tcPr>
+          <w:p>
+            <w:pPr>
+              <w:spacing w:after="0"/>
+              <w:jc w:val="right"/>
+              <w:bidi w:val="1"/>
+            </w:pPr>
+            <w:r>
+              <w:rPr>
+                <w:rFonts w:ascii="Arial" w:hAnsi="Arial" w:cs="Arial"/>
+                <w:b w:val="0"/>
+                <w:color w:val="0B2545"/>
+                <w:sz w:val="18"/>
+              </w:rPr>
+              <w:t>אין פעולה.</w:t>
+            </w:r>
+          </w:p>
+        </w:tc>
+      </w:tr>
+      <w:tr>
+        <w:tc>
+          <w:tcPr>
+            <w:tcW w:type="dxa" w:w="2088"/>
+            <w:shd w:fill="64B469"/>
+            <w:tcBorders>
+              <w:top w:val="single" w:sz="6" w:space="0" w:color="D8E6EA"/>
+              <w:left w:val="single" w:sz="6" w:space="0" w:color="D8E6EA"/>
+              <w:bottom w:val="single" w:sz="6" w:space="0" w:color="D8E6EA"/>
+              <w:right w:val="single" w:sz="6" w:space="0" w:color="D8E6EA"/>
+            </w:tcBorders>
+            <w:tcMar>
+              <w:top w:w="110" w:type="dxa"/>
+              <w:start w:w="120" w:type="dxa"/>
+              <w:bottom w:w="110" w:type="dxa"/>
+              <w:end w:w="120" w:type="dxa"/>
+            </w:tcMar>
+            <w:vAlign w:val="center"/>
+          </w:tcPr>
+          <w:p>
+            <w:pPr>
+              <w:spacing w:after="0"/>
+              <w:jc w:val="right"/>
+              <w:bidi w:val="1"/>
+            </w:pPr>
+            <w:r>
+              <w:rPr>
+                <w:rFonts w:ascii="Arial" w:hAnsi="Arial" w:cs="Arial"/>
+                <w:b/>
+                <w:color w:val="FFFFFF"/>
+                <w:sz w:val="18"/>
+              </w:rPr>
+              <w:t>ירוק בינוני</w:t>
+            </w:r>
+          </w:p>
+        </w:tc>
+        <w:tc>
+          <w:tcPr>
+            <w:tcW w:type="dxa" w:w="1152"/>
+            <w:tcBorders>
+              <w:top w:val="single" w:sz="6" w:space="0" w:color="D8E6EA"/>
+              <w:left w:val="single" w:sz="6" w:space="0" w:color="D8E6EA"/>
+              <w:bottom w:val="single" w:sz="6" w:space="0" w:color="D8E6EA"/>
+              <w:right w:val="single" w:sz="6" w:space="0" w:color="D8E6EA"/>
+            </w:tcBorders>
+            <w:tcMar>
+              <w:top w:w="110" w:type="dxa"/>
+              <w:start w:w="120" w:type="dxa"/>
+              <w:bottom w:w="110" w:type="dxa"/>
+              <w:end w:w="120" w:type="dxa"/>
+            </w:tcMar>
+            <w:vAlign w:val="center"/>
+          </w:tcPr>
+          <w:p>
+            <w:pPr>
+              <w:spacing w:after="0"/>
+              <w:jc w:val="right"/>
+              <w:bidi w:val="1"/>
+            </w:pPr>
+            <w:r>
+              <w:rPr>
+                <w:rFonts w:ascii="Arial" w:hAnsi="Arial" w:cs="Arial"/>
+                <w:b w:val="0"/>
+                <w:color w:val="0B2545"/>
+                <w:sz w:val="18"/>
+              </w:rPr>
+              <w:t>TC 5 / TB 10</w:t>
+            </w:r>
+          </w:p>
+        </w:tc>
+        <w:tc>
+          <w:tcPr>
+            <w:tcW w:type="dxa" w:w="1728"/>
+            <w:tcBorders>
+              <w:top w:val="single" w:sz="6" w:space="0" w:color="D8E6EA"/>
+              <w:left w:val="single" w:sz="6" w:space="0" w:color="D8E6EA"/>
+              <w:bottom w:val="single" w:sz="6" w:space="0" w:color="D8E6EA"/>
+              <w:right w:val="single" w:sz="6" w:space="0" w:color="D8E6EA"/>
+            </w:tcBorders>
+            <w:tcMar>
+              <w:top w:w="110" w:type="dxa"/>
+              <w:start w:w="120" w:type="dxa"/>
+              <w:bottom w:w="110" w:type="dxa"/>
+              <w:end w:w="120" w:type="dxa"/>
+            </w:tcMar>
+            <w:vAlign w:val="center"/>
+          </w:tcPr>
+          <w:p>
+            <w:pPr>
+              <w:spacing w:after="0"/>
+              <w:jc w:val="right"/>
+              <w:bidi w:val="1"/>
+            </w:pPr>
+            <w:r>
+              <w:rPr>
+                <w:rFonts w:ascii="Arial" w:hAnsi="Arial" w:cs="Arial"/>
+                <w:b w:val="0"/>
+                <w:color w:val="0B2545"/>
+                <w:sz w:val="18"/>
+              </w:rPr>
+              <w:t>קצה עליון</w:t>
+            </w:r>
+          </w:p>
+        </w:tc>
+        <w:tc>
+          <w:tcPr>
+            <w:tcW w:type="dxa" w:w="4032"/>
+            <w:tcBorders>
+              <w:top w:val="single" w:sz="6" w:space="0" w:color="D8E6EA"/>
+              <w:left w:val="single" w:sz="6" w:space="0" w:color="D8E6EA"/>
+              <w:bottom w:val="single" w:sz="6" w:space="0" w:color="D8E6EA"/>
+              <w:right w:val="single" w:sz="6" w:space="0" w:color="D8E6EA"/>
+            </w:tcBorders>
+            <w:tcMar>
+              <w:top w:w="110" w:type="dxa"/>
+              <w:start w:w="120" w:type="dxa"/>
+              <w:bottom w:w="110" w:type="dxa"/>
+              <w:end w:w="120" w:type="dxa"/>
+            </w:tcMar>
+            <w:vAlign w:val="center"/>
+          </w:tcPr>
+          <w:p>
+            <w:pPr>
+              <w:spacing w:after="0"/>
+              <w:jc w:val="right"/>
+              <w:bidi w:val="1"/>
+            </w:pPr>
+            <w:r>
+              <w:rPr>
+                <w:rFonts w:ascii="Arial" w:hAnsi="Arial" w:cs="Arial"/>
+                <w:b w:val="0"/>
+                <w:color w:val="0B2545"/>
+                <w:sz w:val="18"/>
+              </w:rPr>
+              <w:t>לא להוסיף חומר כרגע; לבדוק שוב בהמשך.</w:t>
+            </w:r>
+          </w:p>
+        </w:tc>
+      </w:tr>
+      <w:tr>
+        <w:tc>
+          <w:tcPr>
+            <w:tcW w:type="dxa" w:w="2088"/>
+            <w:shd w:fill="378C50"/>
+            <w:tcBorders>
+              <w:top w:val="single" w:sz="6" w:space="0" w:color="D8E6EA"/>
+              <w:left w:val="single" w:sz="6" w:space="0" w:color="D8E6EA"/>
+              <w:bottom w:val="single" w:sz="6" w:space="0" w:color="D8E6EA"/>
+              <w:right w:val="single" w:sz="6" w:space="0" w:color="D8E6EA"/>
+            </w:tcBorders>
+            <w:tcMar>
+              <w:top w:w="110" w:type="dxa"/>
+              <w:start w:w="120" w:type="dxa"/>
+              <w:bottom w:w="110" w:type="dxa"/>
+              <w:end w:w="120" w:type="dxa"/>
+            </w:tcMar>
+            <w:vAlign w:val="center"/>
+          </w:tcPr>
+          <w:p>
+            <w:pPr>
+              <w:spacing w:after="0"/>
+              <w:jc w:val="right"/>
+              <w:bidi w:val="1"/>
+            </w:pPr>
+            <w:r>
+              <w:rPr>
+                <w:rFonts w:ascii="Arial" w:hAnsi="Arial" w:cs="Arial"/>
+                <w:b/>
+                <w:color w:val="FFFFFF"/>
+                <w:sz w:val="18"/>
+              </w:rPr>
+              <w:t>ירוק כהה</w:t>
+            </w:r>
+          </w:p>
+        </w:tc>
+        <w:tc>
+          <w:tcPr>
+            <w:tcW w:type="dxa" w:w="1152"/>
+            <w:tcBorders>
+              <w:top w:val="single" w:sz="6" w:space="0" w:color="D8E6EA"/>
+              <w:left w:val="single" w:sz="6" w:space="0" w:color="D8E6EA"/>
+              <w:bottom w:val="single" w:sz="6" w:space="0" w:color="D8E6EA"/>
+              <w:right w:val="single" w:sz="6" w:space="0" w:color="D8E6EA"/>
+            </w:tcBorders>
+            <w:tcMar>
+              <w:top w:w="110" w:type="dxa"/>
+              <w:start w:w="120" w:type="dxa"/>
+              <w:bottom w:w="110" w:type="dxa"/>
+              <w:end w:w="120" w:type="dxa"/>
+            </w:tcMar>
+            <w:vAlign w:val="center"/>
+          </w:tcPr>
+          <w:p>
+            <w:pPr>
+              <w:spacing w:after="0"/>
+              <w:jc w:val="right"/>
+              <w:bidi w:val="1"/>
+            </w:pPr>
+            <w:r>
+              <w:rPr>
+                <w:rFonts w:ascii="Arial" w:hAnsi="Arial" w:cs="Arial"/>
+                <w:b w:val="0"/>
+                <w:color w:val="0B2545"/>
+                <w:sz w:val="18"/>
+              </w:rPr>
+              <w:t>TC 10 / TB 20</w:t>
+            </w:r>
+          </w:p>
+        </w:tc>
+        <w:tc>
+          <w:tcPr>
+            <w:tcW w:type="dxa" w:w="1728"/>
+            <w:tcBorders>
+              <w:top w:val="single" w:sz="6" w:space="0" w:color="D8E6EA"/>
+              <w:left w:val="single" w:sz="6" w:space="0" w:color="D8E6EA"/>
+              <w:bottom w:val="single" w:sz="6" w:space="0" w:color="D8E6EA"/>
+              <w:right w:val="single" w:sz="6" w:space="0" w:color="D8E6EA"/>
+            </w:tcBorders>
+            <w:tcMar>
+              <w:top w:w="110" w:type="dxa"/>
+              <w:start w:w="120" w:type="dxa"/>
+              <w:bottom w:w="110" w:type="dxa"/>
+              <w:end w:w="120" w:type="dxa"/>
+            </w:tcMar>
+            <w:vAlign w:val="center"/>
+          </w:tcPr>
+          <w:p>
+            <w:pPr>
+              <w:spacing w:after="0"/>
+              <w:jc w:val="right"/>
+              <w:bidi w:val="1"/>
+            </w:pPr>
+            <w:r>
+              <w:rPr>
+                <w:rFonts w:ascii="Arial" w:hAnsi="Arial" w:cs="Arial"/>
+                <w:b w:val="0"/>
+                <w:color w:val="0B2545"/>
+                <w:sz w:val="18"/>
+              </w:rPr>
+              <w:t>גבוה</w:t>
+            </w:r>
+          </w:p>
+        </w:tc>
+        <w:tc>
+          <w:tcPr>
+            <w:tcW w:type="dxa" w:w="4032"/>
+            <w:tcBorders>
+              <w:top w:val="single" w:sz="6" w:space="0" w:color="D8E6EA"/>
+              <w:left w:val="single" w:sz="6" w:space="0" w:color="D8E6EA"/>
+              <w:bottom w:val="single" w:sz="6" w:space="0" w:color="D8E6EA"/>
+              <w:right w:val="single" w:sz="6" w:space="0" w:color="D8E6EA"/>
+            </w:tcBorders>
+            <w:tcMar>
+              <w:top w:w="110" w:type="dxa"/>
+              <w:start w:w="120" w:type="dxa"/>
+              <w:bottom w:w="110" w:type="dxa"/>
+              <w:end w:w="120" w:type="dxa"/>
+            </w:tcMar>
+            <w:vAlign w:val="center"/>
+          </w:tcPr>
+          <w:p>
+            <w:pPr>
+              <w:spacing w:after="0"/>
+              <w:jc w:val="right"/>
+              <w:bidi w:val="1"/>
+            </w:pPr>
+            <w:r>
+              <w:rPr>
+                <w:rFonts w:ascii="Arial" w:hAnsi="Arial" w:cs="Arial"/>
+                <w:b w:val="0"/>
+                <w:color w:val="0B2545"/>
+                <w:sz w:val="18"/>
+              </w:rPr>
+              <w:t>להפסיק הוספה, להפעיל סירקולציה ולהמתין.</w:t>
+            </w:r>
+          </w:p>
+        </w:tc>
+      </w:tr>
+    </w:tbl>
+    <w:p/>
     <w:p>
       <w:pPr>
         <w:spacing w:after="100" w:line="276" w:lineRule="auto" w:before="160"/>
@@ -1515,6 +2505,996 @@
         <w:t>לבריכה: 0-0.5 נמוך; 1-3 הוא אזור העבודה; 5 ומעלה גבוה. שימו לב: כלור חופשי גבוה נראה סגול, לא אדום.</w:t>
       </w:r>
     </w:p>
+    <w:tbl>
+      <w:tblPr>
+        <w:tblW w:type="auto" w:w="0"/>
+        <w:tblLayout w:type="fixed"/>
+        <w:tblLook w:firstColumn="1" w:firstRow="1" w:lastColumn="0" w:lastRow="0" w:noHBand="0" w:noVBand="1" w:val="04A0"/>
+      </w:tblPr>
+      <w:tblGrid>
+        <w:gridCol w:w="2088"/>
+        <w:gridCol w:w="1152"/>
+        <w:gridCol w:w="1728"/>
+        <w:gridCol w:w="4032"/>
+      </w:tblGrid>
+      <w:tr>
+        <w:tc>
+          <w:tcPr>
+            <w:tcW w:type="dxa" w:w="2592"/>
+            <w:shd w:fill="E6F9FC"/>
+            <w:tcBorders>
+              <w:top w:val="single" w:sz="6" w:space="0" w:color="D8E6EA"/>
+              <w:left w:val="single" w:sz="6" w:space="0" w:color="D8E6EA"/>
+              <w:bottom w:val="single" w:sz="6" w:space="0" w:color="D8E6EA"/>
+              <w:right w:val="single" w:sz="6" w:space="0" w:color="D8E6EA"/>
+            </w:tcBorders>
+            <w:tcMar>
+              <w:top w:w="110" w:type="dxa"/>
+              <w:start w:w="120" w:type="dxa"/>
+              <w:bottom w:w="110" w:type="dxa"/>
+              <w:end w:w="120" w:type="dxa"/>
+            </w:tcMar>
+            <w:vAlign w:val="center"/>
+          </w:tcPr>
+          <w:p>
+            <w:pPr>
+              <w:spacing w:after="0"/>
+              <w:jc w:val="right"/>
+              <w:bidi w:val="1"/>
+            </w:pPr>
+            <w:r>
+              <w:rPr>
+                <w:rFonts w:ascii="Arial" w:hAnsi="Arial" w:cs="Arial"/>
+                <w:b/>
+                <w:color w:val="0B2545"/>
+                <w:sz w:val="19"/>
+              </w:rPr>
+              <w:t>הצבע שרואים על הפד</w:t>
+            </w:r>
+          </w:p>
+        </w:tc>
+        <w:tc>
+          <w:tcPr>
+            <w:tcW w:type="dxa" w:w="2592"/>
+            <w:shd w:fill="E6F9FC"/>
+            <w:tcBorders>
+              <w:top w:val="single" w:sz="6" w:space="0" w:color="D8E6EA"/>
+              <w:left w:val="single" w:sz="6" w:space="0" w:color="D8E6EA"/>
+              <w:bottom w:val="single" w:sz="6" w:space="0" w:color="D8E6EA"/>
+              <w:right w:val="single" w:sz="6" w:space="0" w:color="D8E6EA"/>
+            </w:tcBorders>
+            <w:tcMar>
+              <w:top w:w="110" w:type="dxa"/>
+              <w:start w:w="120" w:type="dxa"/>
+              <w:bottom w:w="110" w:type="dxa"/>
+              <w:end w:w="120" w:type="dxa"/>
+            </w:tcMar>
+            <w:vAlign w:val="center"/>
+          </w:tcPr>
+          <w:p>
+            <w:pPr>
+              <w:spacing w:after="0"/>
+              <w:jc w:val="right"/>
+              <w:bidi w:val="1"/>
+            </w:pPr>
+            <w:r>
+              <w:rPr>
+                <w:rFonts w:ascii="Arial" w:hAnsi="Arial" w:cs="Arial"/>
+                <w:b/>
+                <w:color w:val="0B2545"/>
+                <w:sz w:val="19"/>
+              </w:rPr>
+              <w:t>ערך</w:t>
+            </w:r>
+          </w:p>
+        </w:tc>
+        <w:tc>
+          <w:tcPr>
+            <w:tcW w:type="dxa" w:w="2592"/>
+            <w:shd w:fill="E6F9FC"/>
+            <w:tcBorders>
+              <w:top w:val="single" w:sz="6" w:space="0" w:color="D8E6EA"/>
+              <w:left w:val="single" w:sz="6" w:space="0" w:color="D8E6EA"/>
+              <w:bottom w:val="single" w:sz="6" w:space="0" w:color="D8E6EA"/>
+              <w:right w:val="single" w:sz="6" w:space="0" w:color="D8E6EA"/>
+            </w:tcBorders>
+            <w:tcMar>
+              <w:top w:w="110" w:type="dxa"/>
+              <w:start w:w="120" w:type="dxa"/>
+              <w:bottom w:w="110" w:type="dxa"/>
+              <w:end w:w="120" w:type="dxa"/>
+            </w:tcMar>
+            <w:vAlign w:val="center"/>
+          </w:tcPr>
+          <w:p>
+            <w:pPr>
+              <w:spacing w:after="0"/>
+              <w:jc w:val="right"/>
+              <w:bidi w:val="1"/>
+            </w:pPr>
+            <w:r>
+              <w:rPr>
+                <w:rFonts w:ascii="Arial" w:hAnsi="Arial" w:cs="Arial"/>
+                <w:b/>
+                <w:color w:val="0B2545"/>
+                <w:sz w:val="19"/>
+              </w:rPr>
+              <w:t>משמעות</w:t>
+            </w:r>
+          </w:p>
+        </w:tc>
+        <w:tc>
+          <w:tcPr>
+            <w:tcW w:type="dxa" w:w="2592"/>
+            <w:shd w:fill="E6F9FC"/>
+            <w:tcBorders>
+              <w:top w:val="single" w:sz="6" w:space="0" w:color="D8E6EA"/>
+              <w:left w:val="single" w:sz="6" w:space="0" w:color="D8E6EA"/>
+              <w:bottom w:val="single" w:sz="6" w:space="0" w:color="D8E6EA"/>
+              <w:right w:val="single" w:sz="6" w:space="0" w:color="D8E6EA"/>
+            </w:tcBorders>
+            <w:tcMar>
+              <w:top w:w="110" w:type="dxa"/>
+              <w:start w:w="120" w:type="dxa"/>
+              <w:bottom w:w="110" w:type="dxa"/>
+              <w:end w:w="120" w:type="dxa"/>
+            </w:tcMar>
+            <w:vAlign w:val="center"/>
+          </w:tcPr>
+          <w:p>
+            <w:pPr>
+              <w:spacing w:after="0"/>
+              <w:jc w:val="right"/>
+              <w:bidi w:val="1"/>
+            </w:pPr>
+            <w:r>
+              <w:rPr>
+                <w:rFonts w:ascii="Arial" w:hAnsi="Arial" w:cs="Arial"/>
+                <w:b/>
+                <w:color w:val="0B2545"/>
+                <w:sz w:val="19"/>
+              </w:rPr>
+              <w:t>מה מציעים למשתמש</w:t>
+            </w:r>
+          </w:p>
+        </w:tc>
+      </w:tr>
+      <w:tr>
+        <w:tc>
+          <w:tcPr>
+            <w:tcW w:type="dxa" w:w="2088"/>
+            <w:shd w:fill="FEFECC"/>
+            <w:tcBorders>
+              <w:top w:val="single" w:sz="6" w:space="0" w:color="D8E6EA"/>
+              <w:left w:val="single" w:sz="6" w:space="0" w:color="D8E6EA"/>
+              <w:bottom w:val="single" w:sz="6" w:space="0" w:color="D8E6EA"/>
+              <w:right w:val="single" w:sz="6" w:space="0" w:color="D8E6EA"/>
+            </w:tcBorders>
+            <w:tcMar>
+              <w:top w:w="110" w:type="dxa"/>
+              <w:start w:w="120" w:type="dxa"/>
+              <w:bottom w:w="110" w:type="dxa"/>
+              <w:end w:w="120" w:type="dxa"/>
+            </w:tcMar>
+            <w:vAlign w:val="center"/>
+          </w:tcPr>
+          <w:p>
+            <w:pPr>
+              <w:spacing w:after="0"/>
+              <w:jc w:val="right"/>
+              <w:bidi w:val="1"/>
+            </w:pPr>
+            <w:r>
+              <w:rPr>
+                <w:rFonts w:ascii="Arial" w:hAnsi="Arial" w:cs="Arial"/>
+                <w:b/>
+                <w:color w:val="0B2545"/>
+                <w:sz w:val="18"/>
+              </w:rPr>
+              <w:t>צהוב בהיר</w:t>
+            </w:r>
+          </w:p>
+        </w:tc>
+        <w:tc>
+          <w:tcPr>
+            <w:tcW w:type="dxa" w:w="1152"/>
+            <w:tcBorders>
+              <w:top w:val="single" w:sz="6" w:space="0" w:color="D8E6EA"/>
+              <w:left w:val="single" w:sz="6" w:space="0" w:color="D8E6EA"/>
+              <w:bottom w:val="single" w:sz="6" w:space="0" w:color="D8E6EA"/>
+              <w:right w:val="single" w:sz="6" w:space="0" w:color="D8E6EA"/>
+            </w:tcBorders>
+            <w:tcMar>
+              <w:top w:w="110" w:type="dxa"/>
+              <w:start w:w="120" w:type="dxa"/>
+              <w:bottom w:w="110" w:type="dxa"/>
+              <w:end w:w="120" w:type="dxa"/>
+            </w:tcMar>
+            <w:vAlign w:val="center"/>
+          </w:tcPr>
+          <w:p>
+            <w:pPr>
+              <w:spacing w:after="0"/>
+              <w:jc w:val="right"/>
+              <w:bidi w:val="1"/>
+            </w:pPr>
+            <w:r>
+              <w:rPr>
+                <w:rFonts w:ascii="Arial" w:hAnsi="Arial" w:cs="Arial"/>
+                <w:b w:val="0"/>
+                <w:color w:val="0B2545"/>
+                <w:sz w:val="18"/>
+              </w:rPr>
+              <w:t>0</w:t>
+            </w:r>
+          </w:p>
+        </w:tc>
+        <w:tc>
+          <w:tcPr>
+            <w:tcW w:type="dxa" w:w="1728"/>
+            <w:tcBorders>
+              <w:top w:val="single" w:sz="6" w:space="0" w:color="D8E6EA"/>
+              <w:left w:val="single" w:sz="6" w:space="0" w:color="D8E6EA"/>
+              <w:bottom w:val="single" w:sz="6" w:space="0" w:color="D8E6EA"/>
+              <w:right w:val="single" w:sz="6" w:space="0" w:color="D8E6EA"/>
+            </w:tcBorders>
+            <w:tcMar>
+              <w:top w:w="110" w:type="dxa"/>
+              <w:start w:w="120" w:type="dxa"/>
+              <w:bottom w:w="110" w:type="dxa"/>
+              <w:end w:w="120" w:type="dxa"/>
+            </w:tcMar>
+            <w:vAlign w:val="center"/>
+          </w:tcPr>
+          <w:p>
+            <w:pPr>
+              <w:spacing w:after="0"/>
+              <w:jc w:val="right"/>
+              <w:bidi w:val="1"/>
+            </w:pPr>
+            <w:r>
+              <w:rPr>
+                <w:rFonts w:ascii="Arial" w:hAnsi="Arial" w:cs="Arial"/>
+                <w:b w:val="0"/>
+                <w:color w:val="0B2545"/>
+                <w:sz w:val="18"/>
+              </w:rPr>
+              <w:t>נמוך מאוד</w:t>
+            </w:r>
+          </w:p>
+        </w:tc>
+        <w:tc>
+          <w:tcPr>
+            <w:tcW w:type="dxa" w:w="4032"/>
+            <w:tcBorders>
+              <w:top w:val="single" w:sz="6" w:space="0" w:color="D8E6EA"/>
+              <w:left w:val="single" w:sz="6" w:space="0" w:color="D8E6EA"/>
+              <w:bottom w:val="single" w:sz="6" w:space="0" w:color="D8E6EA"/>
+              <w:right w:val="single" w:sz="6" w:space="0" w:color="D8E6EA"/>
+            </w:tcBorders>
+            <w:tcMar>
+              <w:top w:w="110" w:type="dxa"/>
+              <w:start w:w="120" w:type="dxa"/>
+              <w:bottom w:w="110" w:type="dxa"/>
+              <w:end w:w="120" w:type="dxa"/>
+            </w:tcMar>
+            <w:vAlign w:val="center"/>
+          </w:tcPr>
+          <w:p>
+            <w:pPr>
+              <w:spacing w:after="0"/>
+              <w:jc w:val="right"/>
+              <w:bidi w:val="1"/>
+            </w:pPr>
+            <w:r>
+              <w:rPr>
+                <w:rFonts w:ascii="Arial" w:hAnsi="Arial" w:cs="Arial"/>
+                <w:b w:val="0"/>
+                <w:color w:val="0B2545"/>
+                <w:sz w:val="18"/>
+              </w:rPr>
+              <w:t>להוסיף כלור לפי נפח הבריכה והוראות החומר, ואז לבדוק שוב.</w:t>
+            </w:r>
+          </w:p>
+        </w:tc>
+      </w:tr>
+      <w:tr>
+        <w:tc>
+          <w:tcPr>
+            <w:tcW w:type="dxa" w:w="2088"/>
+            <w:shd w:fill="F7EBE4"/>
+            <w:tcBorders>
+              <w:top w:val="single" w:sz="6" w:space="0" w:color="D8E6EA"/>
+              <w:left w:val="single" w:sz="6" w:space="0" w:color="D8E6EA"/>
+              <w:bottom w:val="single" w:sz="6" w:space="0" w:color="D8E6EA"/>
+              <w:right w:val="single" w:sz="6" w:space="0" w:color="D8E6EA"/>
+            </w:tcBorders>
+            <w:tcMar>
+              <w:top w:w="110" w:type="dxa"/>
+              <w:start w:w="120" w:type="dxa"/>
+              <w:bottom w:w="110" w:type="dxa"/>
+              <w:end w:w="120" w:type="dxa"/>
+            </w:tcMar>
+            <w:vAlign w:val="center"/>
+          </w:tcPr>
+          <w:p>
+            <w:pPr>
+              <w:spacing w:after="0"/>
+              <w:jc w:val="right"/>
+              <w:bidi w:val="1"/>
+            </w:pPr>
+            <w:r>
+              <w:rPr>
+                <w:rFonts w:ascii="Arial" w:hAnsi="Arial" w:cs="Arial"/>
+                <w:b/>
+                <w:color w:val="0B2545"/>
+                <w:sz w:val="18"/>
+              </w:rPr>
+              <w:t>לבן-קרם</w:t>
+            </w:r>
+          </w:p>
+        </w:tc>
+        <w:tc>
+          <w:tcPr>
+            <w:tcW w:type="dxa" w:w="1152"/>
+            <w:tcBorders>
+              <w:top w:val="single" w:sz="6" w:space="0" w:color="D8E6EA"/>
+              <w:left w:val="single" w:sz="6" w:space="0" w:color="D8E6EA"/>
+              <w:bottom w:val="single" w:sz="6" w:space="0" w:color="D8E6EA"/>
+              <w:right w:val="single" w:sz="6" w:space="0" w:color="D8E6EA"/>
+            </w:tcBorders>
+            <w:tcMar>
+              <w:top w:w="110" w:type="dxa"/>
+              <w:start w:w="120" w:type="dxa"/>
+              <w:bottom w:w="110" w:type="dxa"/>
+              <w:end w:w="120" w:type="dxa"/>
+            </w:tcMar>
+            <w:vAlign w:val="center"/>
+          </w:tcPr>
+          <w:p>
+            <w:pPr>
+              <w:spacing w:after="0"/>
+              <w:jc w:val="right"/>
+              <w:bidi w:val="1"/>
+            </w:pPr>
+            <w:r>
+              <w:rPr>
+                <w:rFonts w:ascii="Arial" w:hAnsi="Arial" w:cs="Arial"/>
+                <w:b w:val="0"/>
+                <w:color w:val="0B2545"/>
+                <w:sz w:val="18"/>
+              </w:rPr>
+              <w:t>0.5</w:t>
+            </w:r>
+          </w:p>
+        </w:tc>
+        <w:tc>
+          <w:tcPr>
+            <w:tcW w:type="dxa" w:w="1728"/>
+            <w:tcBorders>
+              <w:top w:val="single" w:sz="6" w:space="0" w:color="D8E6EA"/>
+              <w:left w:val="single" w:sz="6" w:space="0" w:color="D8E6EA"/>
+              <w:bottom w:val="single" w:sz="6" w:space="0" w:color="D8E6EA"/>
+              <w:right w:val="single" w:sz="6" w:space="0" w:color="D8E6EA"/>
+            </w:tcBorders>
+            <w:tcMar>
+              <w:top w:w="110" w:type="dxa"/>
+              <w:start w:w="120" w:type="dxa"/>
+              <w:bottom w:w="110" w:type="dxa"/>
+              <w:end w:w="120" w:type="dxa"/>
+            </w:tcMar>
+            <w:vAlign w:val="center"/>
+          </w:tcPr>
+          <w:p>
+            <w:pPr>
+              <w:spacing w:after="0"/>
+              <w:jc w:val="right"/>
+              <w:bidi w:val="1"/>
+            </w:pPr>
+            <w:r>
+              <w:rPr>
+                <w:rFonts w:ascii="Arial" w:hAnsi="Arial" w:cs="Arial"/>
+                <w:b w:val="0"/>
+                <w:color w:val="0B2545"/>
+                <w:sz w:val="18"/>
+              </w:rPr>
+              <w:t>נמוך</w:t>
+            </w:r>
+          </w:p>
+        </w:tc>
+        <w:tc>
+          <w:tcPr>
+            <w:tcW w:type="dxa" w:w="4032"/>
+            <w:tcBorders>
+              <w:top w:val="single" w:sz="6" w:space="0" w:color="D8E6EA"/>
+              <w:left w:val="single" w:sz="6" w:space="0" w:color="D8E6EA"/>
+              <w:bottom w:val="single" w:sz="6" w:space="0" w:color="D8E6EA"/>
+              <w:right w:val="single" w:sz="6" w:space="0" w:color="D8E6EA"/>
+            </w:tcBorders>
+            <w:tcMar>
+              <w:top w:w="110" w:type="dxa"/>
+              <w:start w:w="120" w:type="dxa"/>
+              <w:bottom w:w="110" w:type="dxa"/>
+              <w:end w:w="120" w:type="dxa"/>
+            </w:tcMar>
+            <w:vAlign w:val="center"/>
+          </w:tcPr>
+          <w:p>
+            <w:pPr>
+              <w:spacing w:after="0"/>
+              <w:jc w:val="right"/>
+              <w:bidi w:val="1"/>
+            </w:pPr>
+            <w:r>
+              <w:rPr>
+                <w:rFonts w:ascii="Arial" w:hAnsi="Arial" w:cs="Arial"/>
+                <w:b w:val="0"/>
+                <w:color w:val="0B2545"/>
+                <w:sz w:val="18"/>
+              </w:rPr>
+              <w:t>להעלות כלור בהדרגה.</w:t>
+            </w:r>
+          </w:p>
+        </w:tc>
+      </w:tr>
+      <w:tr>
+        <w:tc>
+          <w:tcPr>
+            <w:tcW w:type="dxa" w:w="2088"/>
+            <w:shd w:fill="EBE4E2"/>
+            <w:tcBorders>
+              <w:top w:val="single" w:sz="6" w:space="0" w:color="D8E6EA"/>
+              <w:left w:val="single" w:sz="6" w:space="0" w:color="D8E6EA"/>
+              <w:bottom w:val="single" w:sz="6" w:space="0" w:color="D8E6EA"/>
+              <w:right w:val="single" w:sz="6" w:space="0" w:color="D8E6EA"/>
+            </w:tcBorders>
+            <w:tcMar>
+              <w:top w:w="110" w:type="dxa"/>
+              <w:start w:w="120" w:type="dxa"/>
+              <w:bottom w:w="110" w:type="dxa"/>
+              <w:end w:w="120" w:type="dxa"/>
+            </w:tcMar>
+            <w:vAlign w:val="center"/>
+          </w:tcPr>
+          <w:p>
+            <w:pPr>
+              <w:spacing w:after="0"/>
+              <w:jc w:val="right"/>
+              <w:bidi w:val="1"/>
+            </w:pPr>
+            <w:r>
+              <w:rPr>
+                <w:rFonts w:ascii="Arial" w:hAnsi="Arial" w:cs="Arial"/>
+                <w:b/>
+                <w:color w:val="0B2545"/>
+                <w:sz w:val="18"/>
+              </w:rPr>
+              <w:t>אפור-לילך בהיר</w:t>
+            </w:r>
+          </w:p>
+        </w:tc>
+        <w:tc>
+          <w:tcPr>
+            <w:tcW w:type="dxa" w:w="1152"/>
+            <w:tcBorders>
+              <w:top w:val="single" w:sz="6" w:space="0" w:color="D8E6EA"/>
+              <w:left w:val="single" w:sz="6" w:space="0" w:color="D8E6EA"/>
+              <w:bottom w:val="single" w:sz="6" w:space="0" w:color="D8E6EA"/>
+              <w:right w:val="single" w:sz="6" w:space="0" w:color="D8E6EA"/>
+            </w:tcBorders>
+            <w:tcMar>
+              <w:top w:w="110" w:type="dxa"/>
+              <w:start w:w="120" w:type="dxa"/>
+              <w:bottom w:w="110" w:type="dxa"/>
+              <w:end w:w="120" w:type="dxa"/>
+            </w:tcMar>
+            <w:vAlign w:val="center"/>
+          </w:tcPr>
+          <w:p>
+            <w:pPr>
+              <w:spacing w:after="0"/>
+              <w:jc w:val="right"/>
+              <w:bidi w:val="1"/>
+            </w:pPr>
+            <w:r>
+              <w:rPr>
+                <w:rFonts w:ascii="Arial" w:hAnsi="Arial" w:cs="Arial"/>
+                <w:b w:val="0"/>
+                <w:color w:val="0B2545"/>
+                <w:sz w:val="18"/>
+              </w:rPr>
+              <w:t>1</w:t>
+            </w:r>
+          </w:p>
+        </w:tc>
+        <w:tc>
+          <w:tcPr>
+            <w:tcW w:type="dxa" w:w="1728"/>
+            <w:tcBorders>
+              <w:top w:val="single" w:sz="6" w:space="0" w:color="D8E6EA"/>
+              <w:left w:val="single" w:sz="6" w:space="0" w:color="D8E6EA"/>
+              <w:bottom w:val="single" w:sz="6" w:space="0" w:color="D8E6EA"/>
+              <w:right w:val="single" w:sz="6" w:space="0" w:color="D8E6EA"/>
+            </w:tcBorders>
+            <w:tcMar>
+              <w:top w:w="110" w:type="dxa"/>
+              <w:start w:w="120" w:type="dxa"/>
+              <w:bottom w:w="110" w:type="dxa"/>
+              <w:end w:w="120" w:type="dxa"/>
+            </w:tcMar>
+            <w:vAlign w:val="center"/>
+          </w:tcPr>
+          <w:p>
+            <w:pPr>
+              <w:spacing w:after="0"/>
+              <w:jc w:val="right"/>
+              <w:bidi w:val="1"/>
+            </w:pPr>
+            <w:r>
+              <w:rPr>
+                <w:rFonts w:ascii="Arial" w:hAnsi="Arial" w:cs="Arial"/>
+                <w:b w:val="0"/>
+                <w:color w:val="0B2545"/>
+                <w:sz w:val="18"/>
+              </w:rPr>
+              <w:t>קצה תחתון תקין</w:t>
+            </w:r>
+          </w:p>
+        </w:tc>
+        <w:tc>
+          <w:tcPr>
+            <w:tcW w:type="dxa" w:w="4032"/>
+            <w:tcBorders>
+              <w:top w:val="single" w:sz="6" w:space="0" w:color="D8E6EA"/>
+              <w:left w:val="single" w:sz="6" w:space="0" w:color="D8E6EA"/>
+              <w:bottom w:val="single" w:sz="6" w:space="0" w:color="D8E6EA"/>
+              <w:right w:val="single" w:sz="6" w:space="0" w:color="D8E6EA"/>
+            </w:tcBorders>
+            <w:tcMar>
+              <w:top w:w="110" w:type="dxa"/>
+              <w:start w:w="120" w:type="dxa"/>
+              <w:bottom w:w="110" w:type="dxa"/>
+              <w:end w:w="120" w:type="dxa"/>
+            </w:tcMar>
+            <w:vAlign w:val="center"/>
+          </w:tcPr>
+          <w:p>
+            <w:pPr>
+              <w:spacing w:after="0"/>
+              <w:jc w:val="right"/>
+              <w:bidi w:val="1"/>
+            </w:pPr>
+            <w:r>
+              <w:rPr>
+                <w:rFonts w:ascii="Arial" w:hAnsi="Arial" w:cs="Arial"/>
+                <w:b w:val="0"/>
+                <w:color w:val="0B2545"/>
+                <w:sz w:val="18"/>
+              </w:rPr>
+              <w:t>אין פעולה מיידית; לעקוב.</w:t>
+            </w:r>
+          </w:p>
+        </w:tc>
+      </w:tr>
+      <w:tr>
+        <w:tc>
+          <w:tcPr>
+            <w:tcW w:type="dxa" w:w="2088"/>
+            <w:shd w:fill="A78BC7"/>
+            <w:tcBorders>
+              <w:top w:val="single" w:sz="6" w:space="0" w:color="D8E6EA"/>
+              <w:left w:val="single" w:sz="6" w:space="0" w:color="D8E6EA"/>
+              <w:bottom w:val="single" w:sz="6" w:space="0" w:color="D8E6EA"/>
+              <w:right w:val="single" w:sz="6" w:space="0" w:color="D8E6EA"/>
+            </w:tcBorders>
+            <w:tcMar>
+              <w:top w:w="110" w:type="dxa"/>
+              <w:start w:w="120" w:type="dxa"/>
+              <w:bottom w:w="110" w:type="dxa"/>
+              <w:end w:w="120" w:type="dxa"/>
+            </w:tcMar>
+            <w:vAlign w:val="center"/>
+          </w:tcPr>
+          <w:p>
+            <w:pPr>
+              <w:spacing w:after="0"/>
+              <w:jc w:val="right"/>
+              <w:bidi w:val="1"/>
+            </w:pPr>
+            <w:r>
+              <w:rPr>
+                <w:rFonts w:ascii="Arial" w:hAnsi="Arial" w:cs="Arial"/>
+                <w:b/>
+                <w:color w:val="FFFFFF"/>
+                <w:sz w:val="18"/>
+              </w:rPr>
+              <w:t>סגול בהיר</w:t>
+            </w:r>
+          </w:p>
+        </w:tc>
+        <w:tc>
+          <w:tcPr>
+            <w:tcW w:type="dxa" w:w="1152"/>
+            <w:tcBorders>
+              <w:top w:val="single" w:sz="6" w:space="0" w:color="D8E6EA"/>
+              <w:left w:val="single" w:sz="6" w:space="0" w:color="D8E6EA"/>
+              <w:bottom w:val="single" w:sz="6" w:space="0" w:color="D8E6EA"/>
+              <w:right w:val="single" w:sz="6" w:space="0" w:color="D8E6EA"/>
+            </w:tcBorders>
+            <w:tcMar>
+              <w:top w:w="110" w:type="dxa"/>
+              <w:start w:w="120" w:type="dxa"/>
+              <w:bottom w:w="110" w:type="dxa"/>
+              <w:end w:w="120" w:type="dxa"/>
+            </w:tcMar>
+            <w:vAlign w:val="center"/>
+          </w:tcPr>
+          <w:p>
+            <w:pPr>
+              <w:spacing w:after="0"/>
+              <w:jc w:val="right"/>
+              <w:bidi w:val="1"/>
+            </w:pPr>
+            <w:r>
+              <w:rPr>
+                <w:rFonts w:ascii="Arial" w:hAnsi="Arial" w:cs="Arial"/>
+                <w:b w:val="0"/>
+                <w:color w:val="0B2545"/>
+                <w:sz w:val="18"/>
+              </w:rPr>
+              <w:t>3</w:t>
+            </w:r>
+          </w:p>
+        </w:tc>
+        <w:tc>
+          <w:tcPr>
+            <w:tcW w:type="dxa" w:w="1728"/>
+            <w:tcBorders>
+              <w:top w:val="single" w:sz="6" w:space="0" w:color="D8E6EA"/>
+              <w:left w:val="single" w:sz="6" w:space="0" w:color="D8E6EA"/>
+              <w:bottom w:val="single" w:sz="6" w:space="0" w:color="D8E6EA"/>
+              <w:right w:val="single" w:sz="6" w:space="0" w:color="D8E6EA"/>
+            </w:tcBorders>
+            <w:tcMar>
+              <w:top w:w="110" w:type="dxa"/>
+              <w:start w:w="120" w:type="dxa"/>
+              <w:bottom w:w="110" w:type="dxa"/>
+              <w:end w:w="120" w:type="dxa"/>
+            </w:tcMar>
+            <w:vAlign w:val="center"/>
+          </w:tcPr>
+          <w:p>
+            <w:pPr>
+              <w:spacing w:after="0"/>
+              <w:jc w:val="right"/>
+              <w:bidi w:val="1"/>
+            </w:pPr>
+            <w:r>
+              <w:rPr>
+                <w:rFonts w:ascii="Arial" w:hAnsi="Arial" w:cs="Arial"/>
+                <w:b w:val="0"/>
+                <w:color w:val="0B2545"/>
+                <w:sz w:val="18"/>
+              </w:rPr>
+              <w:t>קצה עליון תקין</w:t>
+            </w:r>
+          </w:p>
+        </w:tc>
+        <w:tc>
+          <w:tcPr>
+            <w:tcW w:type="dxa" w:w="4032"/>
+            <w:tcBorders>
+              <w:top w:val="single" w:sz="6" w:space="0" w:color="D8E6EA"/>
+              <w:left w:val="single" w:sz="6" w:space="0" w:color="D8E6EA"/>
+              <w:bottom w:val="single" w:sz="6" w:space="0" w:color="D8E6EA"/>
+              <w:right w:val="single" w:sz="6" w:space="0" w:color="D8E6EA"/>
+            </w:tcBorders>
+            <w:tcMar>
+              <w:top w:w="110" w:type="dxa"/>
+              <w:start w:w="120" w:type="dxa"/>
+              <w:bottom w:w="110" w:type="dxa"/>
+              <w:end w:w="120" w:type="dxa"/>
+            </w:tcMar>
+            <w:vAlign w:val="center"/>
+          </w:tcPr>
+          <w:p>
+            <w:pPr>
+              <w:spacing w:after="0"/>
+              <w:jc w:val="right"/>
+              <w:bidi w:val="1"/>
+            </w:pPr>
+            <w:r>
+              <w:rPr>
+                <w:rFonts w:ascii="Arial" w:hAnsi="Arial" w:cs="Arial"/>
+                <w:b w:val="0"/>
+                <w:color w:val="0B2545"/>
+                <w:sz w:val="18"/>
+              </w:rPr>
+              <w:t>אין פעולה.</w:t>
+            </w:r>
+          </w:p>
+        </w:tc>
+      </w:tr>
+      <w:tr>
+        <w:tc>
+          <w:tcPr>
+            <w:tcW w:type="dxa" w:w="2088"/>
+            <w:shd w:fill="9C63B4"/>
+            <w:tcBorders>
+              <w:top w:val="single" w:sz="6" w:space="0" w:color="D8E6EA"/>
+              <w:left w:val="single" w:sz="6" w:space="0" w:color="D8E6EA"/>
+              <w:bottom w:val="single" w:sz="6" w:space="0" w:color="D8E6EA"/>
+              <w:right w:val="single" w:sz="6" w:space="0" w:color="D8E6EA"/>
+            </w:tcBorders>
+            <w:tcMar>
+              <w:top w:w="110" w:type="dxa"/>
+              <w:start w:w="120" w:type="dxa"/>
+              <w:bottom w:w="110" w:type="dxa"/>
+              <w:end w:w="120" w:type="dxa"/>
+            </w:tcMar>
+            <w:vAlign w:val="center"/>
+          </w:tcPr>
+          <w:p>
+            <w:pPr>
+              <w:spacing w:after="0"/>
+              <w:jc w:val="right"/>
+              <w:bidi w:val="1"/>
+            </w:pPr>
+            <w:r>
+              <w:rPr>
+                <w:rFonts w:ascii="Arial" w:hAnsi="Arial" w:cs="Arial"/>
+                <w:b/>
+                <w:color w:val="FFFFFF"/>
+                <w:sz w:val="18"/>
+              </w:rPr>
+              <w:t>סגול</w:t>
+            </w:r>
+          </w:p>
+        </w:tc>
+        <w:tc>
+          <w:tcPr>
+            <w:tcW w:type="dxa" w:w="1152"/>
+            <w:tcBorders>
+              <w:top w:val="single" w:sz="6" w:space="0" w:color="D8E6EA"/>
+              <w:left w:val="single" w:sz="6" w:space="0" w:color="D8E6EA"/>
+              <w:bottom w:val="single" w:sz="6" w:space="0" w:color="D8E6EA"/>
+              <w:right w:val="single" w:sz="6" w:space="0" w:color="D8E6EA"/>
+            </w:tcBorders>
+            <w:tcMar>
+              <w:top w:w="110" w:type="dxa"/>
+              <w:start w:w="120" w:type="dxa"/>
+              <w:bottom w:w="110" w:type="dxa"/>
+              <w:end w:w="120" w:type="dxa"/>
+            </w:tcMar>
+            <w:vAlign w:val="center"/>
+          </w:tcPr>
+          <w:p>
+            <w:pPr>
+              <w:spacing w:after="0"/>
+              <w:jc w:val="right"/>
+              <w:bidi w:val="1"/>
+            </w:pPr>
+            <w:r>
+              <w:rPr>
+                <w:rFonts w:ascii="Arial" w:hAnsi="Arial" w:cs="Arial"/>
+                <w:b w:val="0"/>
+                <w:color w:val="0B2545"/>
+                <w:sz w:val="18"/>
+              </w:rPr>
+              <w:t>5</w:t>
+            </w:r>
+          </w:p>
+        </w:tc>
+        <w:tc>
+          <w:tcPr>
+            <w:tcW w:type="dxa" w:w="1728"/>
+            <w:tcBorders>
+              <w:top w:val="single" w:sz="6" w:space="0" w:color="D8E6EA"/>
+              <w:left w:val="single" w:sz="6" w:space="0" w:color="D8E6EA"/>
+              <w:bottom w:val="single" w:sz="6" w:space="0" w:color="D8E6EA"/>
+              <w:right w:val="single" w:sz="6" w:space="0" w:color="D8E6EA"/>
+            </w:tcBorders>
+            <w:tcMar>
+              <w:top w:w="110" w:type="dxa"/>
+              <w:start w:w="120" w:type="dxa"/>
+              <w:bottom w:w="110" w:type="dxa"/>
+              <w:end w:w="120" w:type="dxa"/>
+            </w:tcMar>
+            <w:vAlign w:val="center"/>
+          </w:tcPr>
+          <w:p>
+            <w:pPr>
+              <w:spacing w:after="0"/>
+              <w:jc w:val="right"/>
+              <w:bidi w:val="1"/>
+            </w:pPr>
+            <w:r>
+              <w:rPr>
+                <w:rFonts w:ascii="Arial" w:hAnsi="Arial" w:cs="Arial"/>
+                <w:b w:val="0"/>
+                <w:color w:val="0B2545"/>
+                <w:sz w:val="18"/>
+              </w:rPr>
+              <w:t>גבוה לבריכה</w:t>
+            </w:r>
+          </w:p>
+        </w:tc>
+        <w:tc>
+          <w:tcPr>
+            <w:tcW w:type="dxa" w:w="4032"/>
+            <w:tcBorders>
+              <w:top w:val="single" w:sz="6" w:space="0" w:color="D8E6EA"/>
+              <w:left w:val="single" w:sz="6" w:space="0" w:color="D8E6EA"/>
+              <w:bottom w:val="single" w:sz="6" w:space="0" w:color="D8E6EA"/>
+              <w:right w:val="single" w:sz="6" w:space="0" w:color="D8E6EA"/>
+            </w:tcBorders>
+            <w:tcMar>
+              <w:top w:w="110" w:type="dxa"/>
+              <w:start w:w="120" w:type="dxa"/>
+              <w:bottom w:w="110" w:type="dxa"/>
+              <w:end w:w="120" w:type="dxa"/>
+            </w:tcMar>
+            <w:vAlign w:val="center"/>
+          </w:tcPr>
+          <w:p>
+            <w:pPr>
+              <w:spacing w:after="0"/>
+              <w:jc w:val="right"/>
+              <w:bidi w:val="1"/>
+            </w:pPr>
+            <w:r>
+              <w:rPr>
+                <w:rFonts w:ascii="Arial" w:hAnsi="Arial" w:cs="Arial"/>
+                <w:b w:val="0"/>
+                <w:color w:val="0B2545"/>
+                <w:sz w:val="18"/>
+              </w:rPr>
+              <w:t>לא להוסיף כלור; להפעיל סירקולציה ולהמתין.</w:t>
+            </w:r>
+          </w:p>
+        </w:tc>
+      </w:tr>
+      <w:tr>
+        <w:tc>
+          <w:tcPr>
+            <w:tcW w:type="dxa" w:w="2088"/>
+            <w:shd w:fill="812E9C"/>
+            <w:tcBorders>
+              <w:top w:val="single" w:sz="6" w:space="0" w:color="D8E6EA"/>
+              <w:left w:val="single" w:sz="6" w:space="0" w:color="D8E6EA"/>
+              <w:bottom w:val="single" w:sz="6" w:space="0" w:color="D8E6EA"/>
+              <w:right w:val="single" w:sz="6" w:space="0" w:color="D8E6EA"/>
+            </w:tcBorders>
+            <w:tcMar>
+              <w:top w:w="110" w:type="dxa"/>
+              <w:start w:w="120" w:type="dxa"/>
+              <w:bottom w:w="110" w:type="dxa"/>
+              <w:end w:w="120" w:type="dxa"/>
+            </w:tcMar>
+            <w:vAlign w:val="center"/>
+          </w:tcPr>
+          <w:p>
+            <w:pPr>
+              <w:spacing w:after="0"/>
+              <w:jc w:val="right"/>
+              <w:bidi w:val="1"/>
+            </w:pPr>
+            <w:r>
+              <w:rPr>
+                <w:rFonts w:ascii="Arial" w:hAnsi="Arial" w:cs="Arial"/>
+                <w:b/>
+                <w:color w:val="FFFFFF"/>
+                <w:sz w:val="18"/>
+              </w:rPr>
+              <w:t>סגול כהה</w:t>
+            </w:r>
+          </w:p>
+        </w:tc>
+        <w:tc>
+          <w:tcPr>
+            <w:tcW w:type="dxa" w:w="1152"/>
+            <w:tcBorders>
+              <w:top w:val="single" w:sz="6" w:space="0" w:color="D8E6EA"/>
+              <w:left w:val="single" w:sz="6" w:space="0" w:color="D8E6EA"/>
+              <w:bottom w:val="single" w:sz="6" w:space="0" w:color="D8E6EA"/>
+              <w:right w:val="single" w:sz="6" w:space="0" w:color="D8E6EA"/>
+            </w:tcBorders>
+            <w:tcMar>
+              <w:top w:w="110" w:type="dxa"/>
+              <w:start w:w="120" w:type="dxa"/>
+              <w:bottom w:w="110" w:type="dxa"/>
+              <w:end w:w="120" w:type="dxa"/>
+            </w:tcMar>
+            <w:vAlign w:val="center"/>
+          </w:tcPr>
+          <w:p>
+            <w:pPr>
+              <w:spacing w:after="0"/>
+              <w:jc w:val="right"/>
+              <w:bidi w:val="1"/>
+            </w:pPr>
+            <w:r>
+              <w:rPr>
+                <w:rFonts w:ascii="Arial" w:hAnsi="Arial" w:cs="Arial"/>
+                <w:b w:val="0"/>
+                <w:color w:val="0B2545"/>
+                <w:sz w:val="18"/>
+              </w:rPr>
+              <w:t>10</w:t>
+            </w:r>
+          </w:p>
+        </w:tc>
+        <w:tc>
+          <w:tcPr>
+            <w:tcW w:type="dxa" w:w="1728"/>
+            <w:tcBorders>
+              <w:top w:val="single" w:sz="6" w:space="0" w:color="D8E6EA"/>
+              <w:left w:val="single" w:sz="6" w:space="0" w:color="D8E6EA"/>
+              <w:bottom w:val="single" w:sz="6" w:space="0" w:color="D8E6EA"/>
+              <w:right w:val="single" w:sz="6" w:space="0" w:color="D8E6EA"/>
+            </w:tcBorders>
+            <w:tcMar>
+              <w:top w:w="110" w:type="dxa"/>
+              <w:start w:w="120" w:type="dxa"/>
+              <w:bottom w:w="110" w:type="dxa"/>
+              <w:end w:w="120" w:type="dxa"/>
+            </w:tcMar>
+            <w:vAlign w:val="center"/>
+          </w:tcPr>
+          <w:p>
+            <w:pPr>
+              <w:spacing w:after="0"/>
+              <w:jc w:val="right"/>
+              <w:bidi w:val="1"/>
+            </w:pPr>
+            <w:r>
+              <w:rPr>
+                <w:rFonts w:ascii="Arial" w:hAnsi="Arial" w:cs="Arial"/>
+                <w:b w:val="0"/>
+                <w:color w:val="0B2545"/>
+                <w:sz w:val="18"/>
+              </w:rPr>
+              <w:t>גבוה מאוד</w:t>
+            </w:r>
+          </w:p>
+        </w:tc>
+        <w:tc>
+          <w:tcPr>
+            <w:tcW w:type="dxa" w:w="4032"/>
+            <w:tcBorders>
+              <w:top w:val="single" w:sz="6" w:space="0" w:color="D8E6EA"/>
+              <w:left w:val="single" w:sz="6" w:space="0" w:color="D8E6EA"/>
+              <w:bottom w:val="single" w:sz="6" w:space="0" w:color="D8E6EA"/>
+              <w:right w:val="single" w:sz="6" w:space="0" w:color="D8E6EA"/>
+            </w:tcBorders>
+            <w:tcMar>
+              <w:top w:w="110" w:type="dxa"/>
+              <w:start w:w="120" w:type="dxa"/>
+              <w:bottom w:w="110" w:type="dxa"/>
+              <w:end w:w="120" w:type="dxa"/>
+            </w:tcMar>
+            <w:vAlign w:val="center"/>
+          </w:tcPr>
+          <w:p>
+            <w:pPr>
+              <w:spacing w:after="0"/>
+              <w:jc w:val="right"/>
+              <w:bidi w:val="1"/>
+            </w:pPr>
+            <w:r>
+              <w:rPr>
+                <w:rFonts w:ascii="Arial" w:hAnsi="Arial" w:cs="Arial"/>
+                <w:b w:val="0"/>
+                <w:color w:val="0B2545"/>
+                <w:sz w:val="18"/>
+              </w:rPr>
+              <w:t>להימנע מרחצה, לעצור הוספה ולפנות לאיש בריכות אם הערך אינו יורד.</w:t>
+            </w:r>
+          </w:p>
+        </w:tc>
+      </w:tr>
+    </w:tbl>
+    <w:p/>
     <w:p>
       <w:pPr>
         <w:spacing w:after="100" w:line="276" w:lineRule="auto" w:before="160"/>
@@ -1774,6 +3754,857 @@
         <w:t>לפי מקרא היצרן: 6.2-6.8 נמוך, 7.2-7.8 מסומן OK, ו-8.4 גבוה. האפליקציה משתמשת כרגע ב-7.2-7.6 כטווח תקין - נדרש אישור מקצועי לפער.</w:t>
       </w:r>
     </w:p>
+    <w:tbl>
+      <w:tblPr>
+        <w:tblW w:type="auto" w:w="0"/>
+        <w:tblLayout w:type="fixed"/>
+        <w:tblLook w:firstColumn="1" w:firstRow="1" w:lastColumn="0" w:lastRow="0" w:noHBand="0" w:noVBand="1" w:val="04A0"/>
+      </w:tblPr>
+      <w:tblGrid>
+        <w:gridCol w:w="2088"/>
+        <w:gridCol w:w="1152"/>
+        <w:gridCol w:w="1728"/>
+        <w:gridCol w:w="4032"/>
+      </w:tblGrid>
+      <w:tr>
+        <w:tc>
+          <w:tcPr>
+            <w:tcW w:type="dxa" w:w="2592"/>
+            <w:shd w:fill="E6F9FC"/>
+            <w:tcBorders>
+              <w:top w:val="single" w:sz="6" w:space="0" w:color="D8E6EA"/>
+              <w:left w:val="single" w:sz="6" w:space="0" w:color="D8E6EA"/>
+              <w:bottom w:val="single" w:sz="6" w:space="0" w:color="D8E6EA"/>
+              <w:right w:val="single" w:sz="6" w:space="0" w:color="D8E6EA"/>
+            </w:tcBorders>
+            <w:tcMar>
+              <w:top w:w="110" w:type="dxa"/>
+              <w:start w:w="120" w:type="dxa"/>
+              <w:bottom w:w="110" w:type="dxa"/>
+              <w:end w:w="120" w:type="dxa"/>
+            </w:tcMar>
+            <w:vAlign w:val="center"/>
+          </w:tcPr>
+          <w:p>
+            <w:pPr>
+              <w:spacing w:after="0"/>
+              <w:jc w:val="right"/>
+              <w:bidi w:val="1"/>
+            </w:pPr>
+            <w:r>
+              <w:rPr>
+                <w:rFonts w:ascii="Arial" w:hAnsi="Arial" w:cs="Arial"/>
+                <w:b/>
+                <w:color w:val="0B2545"/>
+                <w:sz w:val="19"/>
+              </w:rPr>
+              <w:t>הצבע שרואים על הפד</w:t>
+            </w:r>
+          </w:p>
+        </w:tc>
+        <w:tc>
+          <w:tcPr>
+            <w:tcW w:type="dxa" w:w="2592"/>
+            <w:shd w:fill="E6F9FC"/>
+            <w:tcBorders>
+              <w:top w:val="single" w:sz="6" w:space="0" w:color="D8E6EA"/>
+              <w:left w:val="single" w:sz="6" w:space="0" w:color="D8E6EA"/>
+              <w:bottom w:val="single" w:sz="6" w:space="0" w:color="D8E6EA"/>
+              <w:right w:val="single" w:sz="6" w:space="0" w:color="D8E6EA"/>
+            </w:tcBorders>
+            <w:tcMar>
+              <w:top w:w="110" w:type="dxa"/>
+              <w:start w:w="120" w:type="dxa"/>
+              <w:bottom w:w="110" w:type="dxa"/>
+              <w:end w:w="120" w:type="dxa"/>
+            </w:tcMar>
+            <w:vAlign w:val="center"/>
+          </w:tcPr>
+          <w:p>
+            <w:pPr>
+              <w:spacing w:after="0"/>
+              <w:jc w:val="right"/>
+              <w:bidi w:val="1"/>
+            </w:pPr>
+            <w:r>
+              <w:rPr>
+                <w:rFonts w:ascii="Arial" w:hAnsi="Arial" w:cs="Arial"/>
+                <w:b/>
+                <w:color w:val="0B2545"/>
+                <w:sz w:val="19"/>
+              </w:rPr>
+              <w:t>ערך</w:t>
+            </w:r>
+          </w:p>
+        </w:tc>
+        <w:tc>
+          <w:tcPr>
+            <w:tcW w:type="dxa" w:w="2592"/>
+            <w:shd w:fill="E6F9FC"/>
+            <w:tcBorders>
+              <w:top w:val="single" w:sz="6" w:space="0" w:color="D8E6EA"/>
+              <w:left w:val="single" w:sz="6" w:space="0" w:color="D8E6EA"/>
+              <w:bottom w:val="single" w:sz="6" w:space="0" w:color="D8E6EA"/>
+              <w:right w:val="single" w:sz="6" w:space="0" w:color="D8E6EA"/>
+            </w:tcBorders>
+            <w:tcMar>
+              <w:top w:w="110" w:type="dxa"/>
+              <w:start w:w="120" w:type="dxa"/>
+              <w:bottom w:w="110" w:type="dxa"/>
+              <w:end w:w="120" w:type="dxa"/>
+            </w:tcMar>
+            <w:vAlign w:val="center"/>
+          </w:tcPr>
+          <w:p>
+            <w:pPr>
+              <w:spacing w:after="0"/>
+              <w:jc w:val="right"/>
+              <w:bidi w:val="1"/>
+            </w:pPr>
+            <w:r>
+              <w:rPr>
+                <w:rFonts w:ascii="Arial" w:hAnsi="Arial" w:cs="Arial"/>
+                <w:b/>
+                <w:color w:val="0B2545"/>
+                <w:sz w:val="19"/>
+              </w:rPr>
+              <w:t>משמעות</w:t>
+            </w:r>
+          </w:p>
+        </w:tc>
+        <w:tc>
+          <w:tcPr>
+            <w:tcW w:type="dxa" w:w="2592"/>
+            <w:shd w:fill="E6F9FC"/>
+            <w:tcBorders>
+              <w:top w:val="single" w:sz="6" w:space="0" w:color="D8E6EA"/>
+              <w:left w:val="single" w:sz="6" w:space="0" w:color="D8E6EA"/>
+              <w:bottom w:val="single" w:sz="6" w:space="0" w:color="D8E6EA"/>
+              <w:right w:val="single" w:sz="6" w:space="0" w:color="D8E6EA"/>
+            </w:tcBorders>
+            <w:tcMar>
+              <w:top w:w="110" w:type="dxa"/>
+              <w:start w:w="120" w:type="dxa"/>
+              <w:bottom w:w="110" w:type="dxa"/>
+              <w:end w:w="120" w:type="dxa"/>
+            </w:tcMar>
+            <w:vAlign w:val="center"/>
+          </w:tcPr>
+          <w:p>
+            <w:pPr>
+              <w:spacing w:after="0"/>
+              <w:jc w:val="right"/>
+              <w:bidi w:val="1"/>
+            </w:pPr>
+            <w:r>
+              <w:rPr>
+                <w:rFonts w:ascii="Arial" w:hAnsi="Arial" w:cs="Arial"/>
+                <w:b/>
+                <w:color w:val="0B2545"/>
+                <w:sz w:val="19"/>
+              </w:rPr>
+              <w:t>מה מציעים למשתמש</w:t>
+            </w:r>
+          </w:p>
+        </w:tc>
+      </w:tr>
+      <w:tr>
+        <w:tc>
+          <w:tcPr>
+            <w:tcW w:type="dxa" w:w="2088"/>
+            <w:shd w:fill="EFB52F"/>
+            <w:tcBorders>
+              <w:top w:val="single" w:sz="6" w:space="0" w:color="D8E6EA"/>
+              <w:left w:val="single" w:sz="6" w:space="0" w:color="D8E6EA"/>
+              <w:bottom w:val="single" w:sz="6" w:space="0" w:color="D8E6EA"/>
+              <w:right w:val="single" w:sz="6" w:space="0" w:color="D8E6EA"/>
+            </w:tcBorders>
+            <w:tcMar>
+              <w:top w:w="110" w:type="dxa"/>
+              <w:start w:w="120" w:type="dxa"/>
+              <w:bottom w:w="110" w:type="dxa"/>
+              <w:end w:w="120" w:type="dxa"/>
+            </w:tcMar>
+            <w:vAlign w:val="center"/>
+          </w:tcPr>
+          <w:p>
+            <w:pPr>
+              <w:spacing w:after="0"/>
+              <w:jc w:val="right"/>
+              <w:bidi w:val="1"/>
+            </w:pPr>
+            <w:r>
+              <w:rPr>
+                <w:rFonts w:ascii="Arial" w:hAnsi="Arial" w:cs="Arial"/>
+                <w:b/>
+                <w:color w:val="0B2545"/>
+                <w:sz w:val="18"/>
+              </w:rPr>
+              <w:t>צהוב-כתום</w:t>
+            </w:r>
+          </w:p>
+        </w:tc>
+        <w:tc>
+          <w:tcPr>
+            <w:tcW w:type="dxa" w:w="1152"/>
+            <w:tcBorders>
+              <w:top w:val="single" w:sz="6" w:space="0" w:color="D8E6EA"/>
+              <w:left w:val="single" w:sz="6" w:space="0" w:color="D8E6EA"/>
+              <w:bottom w:val="single" w:sz="6" w:space="0" w:color="D8E6EA"/>
+              <w:right w:val="single" w:sz="6" w:space="0" w:color="D8E6EA"/>
+            </w:tcBorders>
+            <w:tcMar>
+              <w:top w:w="110" w:type="dxa"/>
+              <w:start w:w="120" w:type="dxa"/>
+              <w:bottom w:w="110" w:type="dxa"/>
+              <w:end w:w="120" w:type="dxa"/>
+            </w:tcMar>
+            <w:vAlign w:val="center"/>
+          </w:tcPr>
+          <w:p>
+            <w:pPr>
+              <w:spacing w:after="0"/>
+              <w:jc w:val="right"/>
+              <w:bidi w:val="1"/>
+            </w:pPr>
+            <w:r>
+              <w:rPr>
+                <w:rFonts w:ascii="Arial" w:hAnsi="Arial" w:cs="Arial"/>
+                <w:b w:val="0"/>
+                <w:color w:val="0B2545"/>
+                <w:sz w:val="18"/>
+              </w:rPr>
+              <w:t>6.2</w:t>
+            </w:r>
+          </w:p>
+        </w:tc>
+        <w:tc>
+          <w:tcPr>
+            <w:tcW w:type="dxa" w:w="1728"/>
+            <w:tcBorders>
+              <w:top w:val="single" w:sz="6" w:space="0" w:color="D8E6EA"/>
+              <w:left w:val="single" w:sz="6" w:space="0" w:color="D8E6EA"/>
+              <w:bottom w:val="single" w:sz="6" w:space="0" w:color="D8E6EA"/>
+              <w:right w:val="single" w:sz="6" w:space="0" w:color="D8E6EA"/>
+            </w:tcBorders>
+            <w:tcMar>
+              <w:top w:w="110" w:type="dxa"/>
+              <w:start w:w="120" w:type="dxa"/>
+              <w:bottom w:w="110" w:type="dxa"/>
+              <w:end w:w="120" w:type="dxa"/>
+            </w:tcMar>
+            <w:vAlign w:val="center"/>
+          </w:tcPr>
+          <w:p>
+            <w:pPr>
+              <w:spacing w:after="0"/>
+              <w:jc w:val="right"/>
+              <w:bidi w:val="1"/>
+            </w:pPr>
+            <w:r>
+              <w:rPr>
+                <w:rFonts w:ascii="Arial" w:hAnsi="Arial" w:cs="Arial"/>
+                <w:b w:val="0"/>
+                <w:color w:val="0B2545"/>
+                <w:sz w:val="18"/>
+              </w:rPr>
+              <w:t>נמוך מאוד</w:t>
+            </w:r>
+          </w:p>
+        </w:tc>
+        <w:tc>
+          <w:tcPr>
+            <w:tcW w:type="dxa" w:w="4032"/>
+            <w:tcBorders>
+              <w:top w:val="single" w:sz="6" w:space="0" w:color="D8E6EA"/>
+              <w:left w:val="single" w:sz="6" w:space="0" w:color="D8E6EA"/>
+              <w:bottom w:val="single" w:sz="6" w:space="0" w:color="D8E6EA"/>
+              <w:right w:val="single" w:sz="6" w:space="0" w:color="D8E6EA"/>
+            </w:tcBorders>
+            <w:tcMar>
+              <w:top w:w="110" w:type="dxa"/>
+              <w:start w:w="120" w:type="dxa"/>
+              <w:bottom w:w="110" w:type="dxa"/>
+              <w:end w:w="120" w:type="dxa"/>
+            </w:tcMar>
+            <w:vAlign w:val="center"/>
+          </w:tcPr>
+          <w:p>
+            <w:pPr>
+              <w:spacing w:after="0"/>
+              <w:jc w:val="right"/>
+              <w:bidi w:val="1"/>
+            </w:pPr>
+            <w:r>
+              <w:rPr>
+                <w:rFonts w:ascii="Arial" w:hAnsi="Arial" w:cs="Arial"/>
+                <w:b w:val="0"/>
+                <w:color w:val="0B2545"/>
+                <w:sz w:val="18"/>
+              </w:rPr>
+              <w:t>לבדוק קודם אלקליניות; לאחר מכן להעלות pH בהדרגה.</w:t>
+            </w:r>
+          </w:p>
+        </w:tc>
+      </w:tr>
+      <w:tr>
+        <w:tc>
+          <w:tcPr>
+            <w:tcW w:type="dxa" w:w="2088"/>
+            <w:shd w:fill="E87522"/>
+            <w:tcBorders>
+              <w:top w:val="single" w:sz="6" w:space="0" w:color="D8E6EA"/>
+              <w:left w:val="single" w:sz="6" w:space="0" w:color="D8E6EA"/>
+              <w:bottom w:val="single" w:sz="6" w:space="0" w:color="D8E6EA"/>
+              <w:right w:val="single" w:sz="6" w:space="0" w:color="D8E6EA"/>
+            </w:tcBorders>
+            <w:tcMar>
+              <w:top w:w="110" w:type="dxa"/>
+              <w:start w:w="120" w:type="dxa"/>
+              <w:bottom w:w="110" w:type="dxa"/>
+              <w:end w:w="120" w:type="dxa"/>
+            </w:tcMar>
+            <w:vAlign w:val="center"/>
+          </w:tcPr>
+          <w:p>
+            <w:pPr>
+              <w:spacing w:after="0"/>
+              <w:jc w:val="right"/>
+              <w:bidi w:val="1"/>
+            </w:pPr>
+            <w:r>
+              <w:rPr>
+                <w:rFonts w:ascii="Arial" w:hAnsi="Arial" w:cs="Arial"/>
+                <w:b/>
+                <w:color w:val="FFFFFF"/>
+                <w:sz w:val="18"/>
+              </w:rPr>
+              <w:t>כתום</w:t>
+            </w:r>
+          </w:p>
+        </w:tc>
+        <w:tc>
+          <w:tcPr>
+            <w:tcW w:type="dxa" w:w="1152"/>
+            <w:tcBorders>
+              <w:top w:val="single" w:sz="6" w:space="0" w:color="D8E6EA"/>
+              <w:left w:val="single" w:sz="6" w:space="0" w:color="D8E6EA"/>
+              <w:bottom w:val="single" w:sz="6" w:space="0" w:color="D8E6EA"/>
+              <w:right w:val="single" w:sz="6" w:space="0" w:color="D8E6EA"/>
+            </w:tcBorders>
+            <w:tcMar>
+              <w:top w:w="110" w:type="dxa"/>
+              <w:start w:w="120" w:type="dxa"/>
+              <w:bottom w:w="110" w:type="dxa"/>
+              <w:end w:w="120" w:type="dxa"/>
+            </w:tcMar>
+            <w:vAlign w:val="center"/>
+          </w:tcPr>
+          <w:p>
+            <w:pPr>
+              <w:spacing w:after="0"/>
+              <w:jc w:val="right"/>
+              <w:bidi w:val="1"/>
+            </w:pPr>
+            <w:r>
+              <w:rPr>
+                <w:rFonts w:ascii="Arial" w:hAnsi="Arial" w:cs="Arial"/>
+                <w:b w:val="0"/>
+                <w:color w:val="0B2545"/>
+                <w:sz w:val="18"/>
+              </w:rPr>
+              <w:t>6.8</w:t>
+            </w:r>
+          </w:p>
+        </w:tc>
+        <w:tc>
+          <w:tcPr>
+            <w:tcW w:type="dxa" w:w="1728"/>
+            <w:tcBorders>
+              <w:top w:val="single" w:sz="6" w:space="0" w:color="D8E6EA"/>
+              <w:left w:val="single" w:sz="6" w:space="0" w:color="D8E6EA"/>
+              <w:bottom w:val="single" w:sz="6" w:space="0" w:color="D8E6EA"/>
+              <w:right w:val="single" w:sz="6" w:space="0" w:color="D8E6EA"/>
+            </w:tcBorders>
+            <w:tcMar>
+              <w:top w:w="110" w:type="dxa"/>
+              <w:start w:w="120" w:type="dxa"/>
+              <w:bottom w:w="110" w:type="dxa"/>
+              <w:end w:w="120" w:type="dxa"/>
+            </w:tcMar>
+            <w:vAlign w:val="center"/>
+          </w:tcPr>
+          <w:p>
+            <w:pPr>
+              <w:spacing w:after="0"/>
+              <w:jc w:val="right"/>
+              <w:bidi w:val="1"/>
+            </w:pPr>
+            <w:r>
+              <w:rPr>
+                <w:rFonts w:ascii="Arial" w:hAnsi="Arial" w:cs="Arial"/>
+                <w:b w:val="0"/>
+                <w:color w:val="0B2545"/>
+                <w:sz w:val="18"/>
+              </w:rPr>
+              <w:t>נמוך</w:t>
+            </w:r>
+          </w:p>
+        </w:tc>
+        <w:tc>
+          <w:tcPr>
+            <w:tcW w:type="dxa" w:w="4032"/>
+            <w:tcBorders>
+              <w:top w:val="single" w:sz="6" w:space="0" w:color="D8E6EA"/>
+              <w:left w:val="single" w:sz="6" w:space="0" w:color="D8E6EA"/>
+              <w:bottom w:val="single" w:sz="6" w:space="0" w:color="D8E6EA"/>
+              <w:right w:val="single" w:sz="6" w:space="0" w:color="D8E6EA"/>
+            </w:tcBorders>
+            <w:tcMar>
+              <w:top w:w="110" w:type="dxa"/>
+              <w:start w:w="120" w:type="dxa"/>
+              <w:bottom w:w="110" w:type="dxa"/>
+              <w:end w:w="120" w:type="dxa"/>
+            </w:tcMar>
+            <w:vAlign w:val="center"/>
+          </w:tcPr>
+          <w:p>
+            <w:pPr>
+              <w:spacing w:after="0"/>
+              <w:jc w:val="right"/>
+              <w:bidi w:val="1"/>
+            </w:pPr>
+            <w:r>
+              <w:rPr>
+                <w:rFonts w:ascii="Arial" w:hAnsi="Arial" w:cs="Arial"/>
+                <w:b w:val="0"/>
+                <w:color w:val="0B2545"/>
+                <w:sz w:val="18"/>
+              </w:rPr>
+              <w:t>להעלות pH בהדרגה ולבדוק שוב.</w:t>
+            </w:r>
+          </w:p>
+        </w:tc>
+      </w:tr>
+      <w:tr>
+        <w:tc>
+          <w:tcPr>
+            <w:tcW w:type="dxa" w:w="2088"/>
+            <w:shd w:fill="DC4A23"/>
+            <w:tcBorders>
+              <w:top w:val="single" w:sz="6" w:space="0" w:color="D8E6EA"/>
+              <w:left w:val="single" w:sz="6" w:space="0" w:color="D8E6EA"/>
+              <w:bottom w:val="single" w:sz="6" w:space="0" w:color="D8E6EA"/>
+              <w:right w:val="single" w:sz="6" w:space="0" w:color="D8E6EA"/>
+            </w:tcBorders>
+            <w:tcMar>
+              <w:top w:w="110" w:type="dxa"/>
+              <w:start w:w="120" w:type="dxa"/>
+              <w:bottom w:w="110" w:type="dxa"/>
+              <w:end w:w="120" w:type="dxa"/>
+            </w:tcMar>
+            <w:vAlign w:val="center"/>
+          </w:tcPr>
+          <w:p>
+            <w:pPr>
+              <w:spacing w:after="0"/>
+              <w:jc w:val="right"/>
+              <w:bidi w:val="1"/>
+            </w:pPr>
+            <w:r>
+              <w:rPr>
+                <w:rFonts w:ascii="Arial" w:hAnsi="Arial" w:cs="Arial"/>
+                <w:b/>
+                <w:color w:val="FFFFFF"/>
+                <w:sz w:val="18"/>
+              </w:rPr>
+              <w:t>כתום-אדום</w:t>
+            </w:r>
+          </w:p>
+        </w:tc>
+        <w:tc>
+          <w:tcPr>
+            <w:tcW w:type="dxa" w:w="1152"/>
+            <w:tcBorders>
+              <w:top w:val="single" w:sz="6" w:space="0" w:color="D8E6EA"/>
+              <w:left w:val="single" w:sz="6" w:space="0" w:color="D8E6EA"/>
+              <w:bottom w:val="single" w:sz="6" w:space="0" w:color="D8E6EA"/>
+              <w:right w:val="single" w:sz="6" w:space="0" w:color="D8E6EA"/>
+            </w:tcBorders>
+            <w:tcMar>
+              <w:top w:w="110" w:type="dxa"/>
+              <w:start w:w="120" w:type="dxa"/>
+              <w:bottom w:w="110" w:type="dxa"/>
+              <w:end w:w="120" w:type="dxa"/>
+            </w:tcMar>
+            <w:vAlign w:val="center"/>
+          </w:tcPr>
+          <w:p>
+            <w:pPr>
+              <w:spacing w:after="0"/>
+              <w:jc w:val="right"/>
+              <w:bidi w:val="1"/>
+            </w:pPr>
+            <w:r>
+              <w:rPr>
+                <w:rFonts w:ascii="Arial" w:hAnsi="Arial" w:cs="Arial"/>
+                <w:b w:val="0"/>
+                <w:color w:val="0B2545"/>
+                <w:sz w:val="18"/>
+              </w:rPr>
+              <w:t>7.2</w:t>
+            </w:r>
+          </w:p>
+        </w:tc>
+        <w:tc>
+          <w:tcPr>
+            <w:tcW w:type="dxa" w:w="1728"/>
+            <w:tcBorders>
+              <w:top w:val="single" w:sz="6" w:space="0" w:color="D8E6EA"/>
+              <w:left w:val="single" w:sz="6" w:space="0" w:color="D8E6EA"/>
+              <w:bottom w:val="single" w:sz="6" w:space="0" w:color="D8E6EA"/>
+              <w:right w:val="single" w:sz="6" w:space="0" w:color="D8E6EA"/>
+            </w:tcBorders>
+            <w:tcMar>
+              <w:top w:w="110" w:type="dxa"/>
+              <w:start w:w="120" w:type="dxa"/>
+              <w:bottom w:w="110" w:type="dxa"/>
+              <w:end w:w="120" w:type="dxa"/>
+            </w:tcMar>
+            <w:vAlign w:val="center"/>
+          </w:tcPr>
+          <w:p>
+            <w:pPr>
+              <w:spacing w:after="0"/>
+              <w:jc w:val="right"/>
+              <w:bidi w:val="1"/>
+            </w:pPr>
+            <w:r>
+              <w:rPr>
+                <w:rFonts w:ascii="Arial" w:hAnsi="Arial" w:cs="Arial"/>
+                <w:b w:val="0"/>
+                <w:color w:val="0B2545"/>
+                <w:sz w:val="18"/>
+              </w:rPr>
+              <w:t>תקין</w:t>
+            </w:r>
+          </w:p>
+        </w:tc>
+        <w:tc>
+          <w:tcPr>
+            <w:tcW w:type="dxa" w:w="4032"/>
+            <w:tcBorders>
+              <w:top w:val="single" w:sz="6" w:space="0" w:color="D8E6EA"/>
+              <w:left w:val="single" w:sz="6" w:space="0" w:color="D8E6EA"/>
+              <w:bottom w:val="single" w:sz="6" w:space="0" w:color="D8E6EA"/>
+              <w:right w:val="single" w:sz="6" w:space="0" w:color="D8E6EA"/>
+            </w:tcBorders>
+            <w:tcMar>
+              <w:top w:w="110" w:type="dxa"/>
+              <w:start w:w="120" w:type="dxa"/>
+              <w:bottom w:w="110" w:type="dxa"/>
+              <w:end w:w="120" w:type="dxa"/>
+            </w:tcMar>
+            <w:vAlign w:val="center"/>
+          </w:tcPr>
+          <w:p>
+            <w:pPr>
+              <w:spacing w:after="0"/>
+              <w:jc w:val="right"/>
+              <w:bidi w:val="1"/>
+            </w:pPr>
+            <w:r>
+              <w:rPr>
+                <w:rFonts w:ascii="Arial" w:hAnsi="Arial" w:cs="Arial"/>
+                <w:b w:val="0"/>
+                <w:color w:val="0B2545"/>
+                <w:sz w:val="18"/>
+              </w:rPr>
+              <w:t>אין פעולה.</w:t>
+            </w:r>
+          </w:p>
+        </w:tc>
+      </w:tr>
+      <w:tr>
+        <w:tc>
+          <w:tcPr>
+            <w:tcW w:type="dxa" w:w="2088"/>
+            <w:shd w:fill="D52F25"/>
+            <w:tcBorders>
+              <w:top w:val="single" w:sz="6" w:space="0" w:color="D8E6EA"/>
+              <w:left w:val="single" w:sz="6" w:space="0" w:color="D8E6EA"/>
+              <w:bottom w:val="single" w:sz="6" w:space="0" w:color="D8E6EA"/>
+              <w:right w:val="single" w:sz="6" w:space="0" w:color="D8E6EA"/>
+            </w:tcBorders>
+            <w:tcMar>
+              <w:top w:w="110" w:type="dxa"/>
+              <w:start w:w="120" w:type="dxa"/>
+              <w:bottom w:w="110" w:type="dxa"/>
+              <w:end w:w="120" w:type="dxa"/>
+            </w:tcMar>
+            <w:vAlign w:val="center"/>
+          </w:tcPr>
+          <w:p>
+            <w:pPr>
+              <w:spacing w:after="0"/>
+              <w:jc w:val="right"/>
+              <w:bidi w:val="1"/>
+            </w:pPr>
+            <w:r>
+              <w:rPr>
+                <w:rFonts w:ascii="Arial" w:hAnsi="Arial" w:cs="Arial"/>
+                <w:b/>
+                <w:color w:val="FFFFFF"/>
+                <w:sz w:val="18"/>
+              </w:rPr>
+              <w:t>אדום</w:t>
+            </w:r>
+          </w:p>
+        </w:tc>
+        <w:tc>
+          <w:tcPr>
+            <w:tcW w:type="dxa" w:w="1152"/>
+            <w:tcBorders>
+              <w:top w:val="single" w:sz="6" w:space="0" w:color="D8E6EA"/>
+              <w:left w:val="single" w:sz="6" w:space="0" w:color="D8E6EA"/>
+              <w:bottom w:val="single" w:sz="6" w:space="0" w:color="D8E6EA"/>
+              <w:right w:val="single" w:sz="6" w:space="0" w:color="D8E6EA"/>
+            </w:tcBorders>
+            <w:tcMar>
+              <w:top w:w="110" w:type="dxa"/>
+              <w:start w:w="120" w:type="dxa"/>
+              <w:bottom w:w="110" w:type="dxa"/>
+              <w:end w:w="120" w:type="dxa"/>
+            </w:tcMar>
+            <w:vAlign w:val="center"/>
+          </w:tcPr>
+          <w:p>
+            <w:pPr>
+              <w:spacing w:after="0"/>
+              <w:jc w:val="right"/>
+              <w:bidi w:val="1"/>
+            </w:pPr>
+            <w:r>
+              <w:rPr>
+                <w:rFonts w:ascii="Arial" w:hAnsi="Arial" w:cs="Arial"/>
+                <w:b w:val="0"/>
+                <w:color w:val="0B2545"/>
+                <w:sz w:val="18"/>
+              </w:rPr>
+              <w:t>7.8</w:t>
+            </w:r>
+          </w:p>
+        </w:tc>
+        <w:tc>
+          <w:tcPr>
+            <w:tcW w:type="dxa" w:w="1728"/>
+            <w:tcBorders>
+              <w:top w:val="single" w:sz="6" w:space="0" w:color="D8E6EA"/>
+              <w:left w:val="single" w:sz="6" w:space="0" w:color="D8E6EA"/>
+              <w:bottom w:val="single" w:sz="6" w:space="0" w:color="D8E6EA"/>
+              <w:right w:val="single" w:sz="6" w:space="0" w:color="D8E6EA"/>
+            </w:tcBorders>
+            <w:tcMar>
+              <w:top w:w="110" w:type="dxa"/>
+              <w:start w:w="120" w:type="dxa"/>
+              <w:bottom w:w="110" w:type="dxa"/>
+              <w:end w:w="120" w:type="dxa"/>
+            </w:tcMar>
+            <w:vAlign w:val="center"/>
+          </w:tcPr>
+          <w:p>
+            <w:pPr>
+              <w:spacing w:after="0"/>
+              <w:jc w:val="right"/>
+              <w:bidi w:val="1"/>
+            </w:pPr>
+            <w:r>
+              <w:rPr>
+                <w:rFonts w:ascii="Arial" w:hAnsi="Arial" w:cs="Arial"/>
+                <w:b w:val="0"/>
+                <w:color w:val="0B2545"/>
+                <w:sz w:val="18"/>
+              </w:rPr>
+              <w:t>גבולי</w:t>
+            </w:r>
+          </w:p>
+        </w:tc>
+        <w:tc>
+          <w:tcPr>
+            <w:tcW w:type="dxa" w:w="4032"/>
+            <w:tcBorders>
+              <w:top w:val="single" w:sz="6" w:space="0" w:color="D8E6EA"/>
+              <w:left w:val="single" w:sz="6" w:space="0" w:color="D8E6EA"/>
+              <w:bottom w:val="single" w:sz="6" w:space="0" w:color="D8E6EA"/>
+              <w:right w:val="single" w:sz="6" w:space="0" w:color="D8E6EA"/>
+            </w:tcBorders>
+            <w:tcMar>
+              <w:top w:w="110" w:type="dxa"/>
+              <w:start w:w="120" w:type="dxa"/>
+              <w:bottom w:w="110" w:type="dxa"/>
+              <w:end w:w="120" w:type="dxa"/>
+            </w:tcMar>
+            <w:vAlign w:val="center"/>
+          </w:tcPr>
+          <w:p>
+            <w:pPr>
+              <w:spacing w:after="0"/>
+              <w:jc w:val="right"/>
+              <w:bidi w:val="1"/>
+            </w:pPr>
+            <w:r>
+              <w:rPr>
+                <w:rFonts w:ascii="Arial" w:hAnsi="Arial" w:cs="Arial"/>
+                <w:b w:val="0"/>
+                <w:color w:val="0B2545"/>
+                <w:sz w:val="18"/>
+              </w:rPr>
+              <w:t>היצרן מסמן OK אך האפליקציה מחשיבה מעל 7.6 כגבוה; נדרש אישור הבודק.</w:t>
+            </w:r>
+          </w:p>
+        </w:tc>
+      </w:tr>
+      <w:tr>
+        <w:tc>
+          <w:tcPr>
+            <w:tcW w:type="dxa" w:w="2088"/>
+            <w:shd w:fill="BE292D"/>
+            <w:tcBorders>
+              <w:top w:val="single" w:sz="6" w:space="0" w:color="D8E6EA"/>
+              <w:left w:val="single" w:sz="6" w:space="0" w:color="D8E6EA"/>
+              <w:bottom w:val="single" w:sz="6" w:space="0" w:color="D8E6EA"/>
+              <w:right w:val="single" w:sz="6" w:space="0" w:color="D8E6EA"/>
+            </w:tcBorders>
+            <w:tcMar>
+              <w:top w:w="110" w:type="dxa"/>
+              <w:start w:w="120" w:type="dxa"/>
+              <w:bottom w:w="110" w:type="dxa"/>
+              <w:end w:w="120" w:type="dxa"/>
+            </w:tcMar>
+            <w:vAlign w:val="center"/>
+          </w:tcPr>
+          <w:p>
+            <w:pPr>
+              <w:spacing w:after="0"/>
+              <w:jc w:val="right"/>
+              <w:bidi w:val="1"/>
+            </w:pPr>
+            <w:r>
+              <w:rPr>
+                <w:rFonts w:ascii="Arial" w:hAnsi="Arial" w:cs="Arial"/>
+                <w:b/>
+                <w:color w:val="FFFFFF"/>
+                <w:sz w:val="18"/>
+              </w:rPr>
+              <w:t>אדום כהה</w:t>
+            </w:r>
+          </w:p>
+        </w:tc>
+        <w:tc>
+          <w:tcPr>
+            <w:tcW w:type="dxa" w:w="1152"/>
+            <w:tcBorders>
+              <w:top w:val="single" w:sz="6" w:space="0" w:color="D8E6EA"/>
+              <w:left w:val="single" w:sz="6" w:space="0" w:color="D8E6EA"/>
+              <w:bottom w:val="single" w:sz="6" w:space="0" w:color="D8E6EA"/>
+              <w:right w:val="single" w:sz="6" w:space="0" w:color="D8E6EA"/>
+            </w:tcBorders>
+            <w:tcMar>
+              <w:top w:w="110" w:type="dxa"/>
+              <w:start w:w="120" w:type="dxa"/>
+              <w:bottom w:w="110" w:type="dxa"/>
+              <w:end w:w="120" w:type="dxa"/>
+            </w:tcMar>
+            <w:vAlign w:val="center"/>
+          </w:tcPr>
+          <w:p>
+            <w:pPr>
+              <w:spacing w:after="0"/>
+              <w:jc w:val="right"/>
+              <w:bidi w:val="1"/>
+            </w:pPr>
+            <w:r>
+              <w:rPr>
+                <w:rFonts w:ascii="Arial" w:hAnsi="Arial" w:cs="Arial"/>
+                <w:b w:val="0"/>
+                <w:color w:val="0B2545"/>
+                <w:sz w:val="18"/>
+              </w:rPr>
+              <w:t>8.4</w:t>
+            </w:r>
+          </w:p>
+        </w:tc>
+        <w:tc>
+          <w:tcPr>
+            <w:tcW w:type="dxa" w:w="1728"/>
+            <w:tcBorders>
+              <w:top w:val="single" w:sz="6" w:space="0" w:color="D8E6EA"/>
+              <w:left w:val="single" w:sz="6" w:space="0" w:color="D8E6EA"/>
+              <w:bottom w:val="single" w:sz="6" w:space="0" w:color="D8E6EA"/>
+              <w:right w:val="single" w:sz="6" w:space="0" w:color="D8E6EA"/>
+            </w:tcBorders>
+            <w:tcMar>
+              <w:top w:w="110" w:type="dxa"/>
+              <w:start w:w="120" w:type="dxa"/>
+              <w:bottom w:w="110" w:type="dxa"/>
+              <w:end w:w="120" w:type="dxa"/>
+            </w:tcMar>
+            <w:vAlign w:val="center"/>
+          </w:tcPr>
+          <w:p>
+            <w:pPr>
+              <w:spacing w:after="0"/>
+              <w:jc w:val="right"/>
+              <w:bidi w:val="1"/>
+            </w:pPr>
+            <w:r>
+              <w:rPr>
+                <w:rFonts w:ascii="Arial" w:hAnsi="Arial" w:cs="Arial"/>
+                <w:b w:val="0"/>
+                <w:color w:val="0B2545"/>
+                <w:sz w:val="18"/>
+              </w:rPr>
+              <w:t>גבוה</w:t>
+            </w:r>
+          </w:p>
+        </w:tc>
+        <w:tc>
+          <w:tcPr>
+            <w:tcW w:type="dxa" w:w="4032"/>
+            <w:tcBorders>
+              <w:top w:val="single" w:sz="6" w:space="0" w:color="D8E6EA"/>
+              <w:left w:val="single" w:sz="6" w:space="0" w:color="D8E6EA"/>
+              <w:bottom w:val="single" w:sz="6" w:space="0" w:color="D8E6EA"/>
+              <w:right w:val="single" w:sz="6" w:space="0" w:color="D8E6EA"/>
+            </w:tcBorders>
+            <w:tcMar>
+              <w:top w:w="110" w:type="dxa"/>
+              <w:start w:w="120" w:type="dxa"/>
+              <w:bottom w:w="110" w:type="dxa"/>
+              <w:end w:w="120" w:type="dxa"/>
+            </w:tcMar>
+            <w:vAlign w:val="center"/>
+          </w:tcPr>
+          <w:p>
+            <w:pPr>
+              <w:spacing w:after="0"/>
+              <w:jc w:val="right"/>
+              <w:bidi w:val="1"/>
+            </w:pPr>
+            <w:r>
+              <w:rPr>
+                <w:rFonts w:ascii="Arial" w:hAnsi="Arial" w:cs="Arial"/>
+                <w:b w:val="0"/>
+                <w:color w:val="0B2545"/>
+                <w:sz w:val="18"/>
+              </w:rPr>
+              <w:t>להוריד pH בהדרגה בהתאם לחומר ולנפח; מומלץ איש בריכות.</w:t>
+            </w:r>
+          </w:p>
+        </w:tc>
+      </w:tr>
+    </w:tbl>
+    <w:p/>
     <w:p>
       <w:pPr>
         <w:spacing w:after="100" w:line="276" w:lineRule="auto" w:before="160"/>
@@ -2069,6 +4900,1042 @@
         <w:t>0-40 נמוך, 80-120 תקין, 180-240 גבוה. בקצה הגבוה הפד כחול-ירקרק; כחול כאן אינו סימן לתוצאה טובה.</w:t>
       </w:r>
     </w:p>
+    <w:tbl>
+      <w:tblPr>
+        <w:tblW w:type="auto" w:w="0"/>
+        <w:tblLayout w:type="fixed"/>
+        <w:tblLook w:firstColumn="1" w:firstRow="1" w:lastColumn="0" w:lastRow="0" w:noHBand="0" w:noVBand="1" w:val="04A0"/>
+      </w:tblPr>
+      <w:tblGrid>
+        <w:gridCol w:w="2088"/>
+        <w:gridCol w:w="1152"/>
+        <w:gridCol w:w="1728"/>
+        <w:gridCol w:w="4032"/>
+      </w:tblGrid>
+      <w:tr>
+        <w:tc>
+          <w:tcPr>
+            <w:tcW w:type="dxa" w:w="2592"/>
+            <w:shd w:fill="E6F9FC"/>
+            <w:tcBorders>
+              <w:top w:val="single" w:sz="6" w:space="0" w:color="D8E6EA"/>
+              <w:left w:val="single" w:sz="6" w:space="0" w:color="D8E6EA"/>
+              <w:bottom w:val="single" w:sz="6" w:space="0" w:color="D8E6EA"/>
+              <w:right w:val="single" w:sz="6" w:space="0" w:color="D8E6EA"/>
+            </w:tcBorders>
+            <w:tcMar>
+              <w:top w:w="110" w:type="dxa"/>
+              <w:start w:w="120" w:type="dxa"/>
+              <w:bottom w:w="110" w:type="dxa"/>
+              <w:end w:w="120" w:type="dxa"/>
+            </w:tcMar>
+            <w:vAlign w:val="center"/>
+          </w:tcPr>
+          <w:p>
+            <w:pPr>
+              <w:spacing w:after="0"/>
+              <w:jc w:val="right"/>
+              <w:bidi w:val="1"/>
+            </w:pPr>
+            <w:r>
+              <w:rPr>
+                <w:rFonts w:ascii="Arial" w:hAnsi="Arial" w:cs="Arial"/>
+                <w:b/>
+                <w:color w:val="0B2545"/>
+                <w:sz w:val="19"/>
+              </w:rPr>
+              <w:t>הצבע שרואים על הפד</w:t>
+            </w:r>
+          </w:p>
+        </w:tc>
+        <w:tc>
+          <w:tcPr>
+            <w:tcW w:type="dxa" w:w="2592"/>
+            <w:shd w:fill="E6F9FC"/>
+            <w:tcBorders>
+              <w:top w:val="single" w:sz="6" w:space="0" w:color="D8E6EA"/>
+              <w:left w:val="single" w:sz="6" w:space="0" w:color="D8E6EA"/>
+              <w:bottom w:val="single" w:sz="6" w:space="0" w:color="D8E6EA"/>
+              <w:right w:val="single" w:sz="6" w:space="0" w:color="D8E6EA"/>
+            </w:tcBorders>
+            <w:tcMar>
+              <w:top w:w="110" w:type="dxa"/>
+              <w:start w:w="120" w:type="dxa"/>
+              <w:bottom w:w="110" w:type="dxa"/>
+              <w:end w:w="120" w:type="dxa"/>
+            </w:tcMar>
+            <w:vAlign w:val="center"/>
+          </w:tcPr>
+          <w:p>
+            <w:pPr>
+              <w:spacing w:after="0"/>
+              <w:jc w:val="right"/>
+              <w:bidi w:val="1"/>
+            </w:pPr>
+            <w:r>
+              <w:rPr>
+                <w:rFonts w:ascii="Arial" w:hAnsi="Arial" w:cs="Arial"/>
+                <w:b/>
+                <w:color w:val="0B2545"/>
+                <w:sz w:val="19"/>
+              </w:rPr>
+              <w:t>ערך</w:t>
+            </w:r>
+          </w:p>
+        </w:tc>
+        <w:tc>
+          <w:tcPr>
+            <w:tcW w:type="dxa" w:w="2592"/>
+            <w:shd w:fill="E6F9FC"/>
+            <w:tcBorders>
+              <w:top w:val="single" w:sz="6" w:space="0" w:color="D8E6EA"/>
+              <w:left w:val="single" w:sz="6" w:space="0" w:color="D8E6EA"/>
+              <w:bottom w:val="single" w:sz="6" w:space="0" w:color="D8E6EA"/>
+              <w:right w:val="single" w:sz="6" w:space="0" w:color="D8E6EA"/>
+            </w:tcBorders>
+            <w:tcMar>
+              <w:top w:w="110" w:type="dxa"/>
+              <w:start w:w="120" w:type="dxa"/>
+              <w:bottom w:w="110" w:type="dxa"/>
+              <w:end w:w="120" w:type="dxa"/>
+            </w:tcMar>
+            <w:vAlign w:val="center"/>
+          </w:tcPr>
+          <w:p>
+            <w:pPr>
+              <w:spacing w:after="0"/>
+              <w:jc w:val="right"/>
+              <w:bidi w:val="1"/>
+            </w:pPr>
+            <w:r>
+              <w:rPr>
+                <w:rFonts w:ascii="Arial" w:hAnsi="Arial" w:cs="Arial"/>
+                <w:b/>
+                <w:color w:val="0B2545"/>
+                <w:sz w:val="19"/>
+              </w:rPr>
+              <w:t>משמעות</w:t>
+            </w:r>
+          </w:p>
+        </w:tc>
+        <w:tc>
+          <w:tcPr>
+            <w:tcW w:type="dxa" w:w="2592"/>
+            <w:shd w:fill="E6F9FC"/>
+            <w:tcBorders>
+              <w:top w:val="single" w:sz="6" w:space="0" w:color="D8E6EA"/>
+              <w:left w:val="single" w:sz="6" w:space="0" w:color="D8E6EA"/>
+              <w:bottom w:val="single" w:sz="6" w:space="0" w:color="D8E6EA"/>
+              <w:right w:val="single" w:sz="6" w:space="0" w:color="D8E6EA"/>
+            </w:tcBorders>
+            <w:tcMar>
+              <w:top w:w="110" w:type="dxa"/>
+              <w:start w:w="120" w:type="dxa"/>
+              <w:bottom w:w="110" w:type="dxa"/>
+              <w:end w:w="120" w:type="dxa"/>
+            </w:tcMar>
+            <w:vAlign w:val="center"/>
+          </w:tcPr>
+          <w:p>
+            <w:pPr>
+              <w:spacing w:after="0"/>
+              <w:jc w:val="right"/>
+              <w:bidi w:val="1"/>
+            </w:pPr>
+            <w:r>
+              <w:rPr>
+                <w:rFonts w:ascii="Arial" w:hAnsi="Arial" w:cs="Arial"/>
+                <w:b/>
+                <w:color w:val="0B2545"/>
+                <w:sz w:val="19"/>
+              </w:rPr>
+              <w:t>מה מציעים למשתמש</w:t>
+            </w:r>
+          </w:p>
+        </w:tc>
+      </w:tr>
+      <w:tr>
+        <w:tc>
+          <w:tcPr>
+            <w:tcW w:type="dxa" w:w="2088"/>
+            <w:shd w:fill="E3C040"/>
+            <w:tcBorders>
+              <w:top w:val="single" w:sz="6" w:space="0" w:color="D8E6EA"/>
+              <w:left w:val="single" w:sz="6" w:space="0" w:color="D8E6EA"/>
+              <w:bottom w:val="single" w:sz="6" w:space="0" w:color="D8E6EA"/>
+              <w:right w:val="single" w:sz="6" w:space="0" w:color="D8E6EA"/>
+            </w:tcBorders>
+            <w:tcMar>
+              <w:top w:w="110" w:type="dxa"/>
+              <w:start w:w="120" w:type="dxa"/>
+              <w:bottom w:w="110" w:type="dxa"/>
+              <w:end w:w="120" w:type="dxa"/>
+            </w:tcMar>
+            <w:vAlign w:val="center"/>
+          </w:tcPr>
+          <w:p>
+            <w:pPr>
+              <w:spacing w:after="0"/>
+              <w:jc w:val="right"/>
+              <w:bidi w:val="1"/>
+            </w:pPr>
+            <w:r>
+              <w:rPr>
+                <w:rFonts w:ascii="Arial" w:hAnsi="Arial" w:cs="Arial"/>
+                <w:b/>
+                <w:color w:val="0B2545"/>
+                <w:sz w:val="18"/>
+              </w:rPr>
+              <w:t>צהוב</w:t>
+            </w:r>
+          </w:p>
+        </w:tc>
+        <w:tc>
+          <w:tcPr>
+            <w:tcW w:type="dxa" w:w="1152"/>
+            <w:tcBorders>
+              <w:top w:val="single" w:sz="6" w:space="0" w:color="D8E6EA"/>
+              <w:left w:val="single" w:sz="6" w:space="0" w:color="D8E6EA"/>
+              <w:bottom w:val="single" w:sz="6" w:space="0" w:color="D8E6EA"/>
+              <w:right w:val="single" w:sz="6" w:space="0" w:color="D8E6EA"/>
+            </w:tcBorders>
+            <w:tcMar>
+              <w:top w:w="110" w:type="dxa"/>
+              <w:start w:w="120" w:type="dxa"/>
+              <w:bottom w:w="110" w:type="dxa"/>
+              <w:end w:w="120" w:type="dxa"/>
+            </w:tcMar>
+            <w:vAlign w:val="center"/>
+          </w:tcPr>
+          <w:p>
+            <w:pPr>
+              <w:spacing w:after="0"/>
+              <w:jc w:val="right"/>
+              <w:bidi w:val="1"/>
+            </w:pPr>
+            <w:r>
+              <w:rPr>
+                <w:rFonts w:ascii="Arial" w:hAnsi="Arial" w:cs="Arial"/>
+                <w:b w:val="0"/>
+                <w:color w:val="0B2545"/>
+                <w:sz w:val="18"/>
+              </w:rPr>
+              <w:t>0</w:t>
+            </w:r>
+          </w:p>
+        </w:tc>
+        <w:tc>
+          <w:tcPr>
+            <w:tcW w:type="dxa" w:w="1728"/>
+            <w:tcBorders>
+              <w:top w:val="single" w:sz="6" w:space="0" w:color="D8E6EA"/>
+              <w:left w:val="single" w:sz="6" w:space="0" w:color="D8E6EA"/>
+              <w:bottom w:val="single" w:sz="6" w:space="0" w:color="D8E6EA"/>
+              <w:right w:val="single" w:sz="6" w:space="0" w:color="D8E6EA"/>
+            </w:tcBorders>
+            <w:tcMar>
+              <w:top w:w="110" w:type="dxa"/>
+              <w:start w:w="120" w:type="dxa"/>
+              <w:bottom w:w="110" w:type="dxa"/>
+              <w:end w:w="120" w:type="dxa"/>
+            </w:tcMar>
+            <w:vAlign w:val="center"/>
+          </w:tcPr>
+          <w:p>
+            <w:pPr>
+              <w:spacing w:after="0"/>
+              <w:jc w:val="right"/>
+              <w:bidi w:val="1"/>
+            </w:pPr>
+            <w:r>
+              <w:rPr>
+                <w:rFonts w:ascii="Arial" w:hAnsi="Arial" w:cs="Arial"/>
+                <w:b w:val="0"/>
+                <w:color w:val="0B2545"/>
+                <w:sz w:val="18"/>
+              </w:rPr>
+              <w:t>נמוך מאוד</w:t>
+            </w:r>
+          </w:p>
+        </w:tc>
+        <w:tc>
+          <w:tcPr>
+            <w:tcW w:type="dxa" w:w="4032"/>
+            <w:tcBorders>
+              <w:top w:val="single" w:sz="6" w:space="0" w:color="D8E6EA"/>
+              <w:left w:val="single" w:sz="6" w:space="0" w:color="D8E6EA"/>
+              <w:bottom w:val="single" w:sz="6" w:space="0" w:color="D8E6EA"/>
+              <w:right w:val="single" w:sz="6" w:space="0" w:color="D8E6EA"/>
+            </w:tcBorders>
+            <w:tcMar>
+              <w:top w:w="110" w:type="dxa"/>
+              <w:start w:w="120" w:type="dxa"/>
+              <w:bottom w:w="110" w:type="dxa"/>
+              <w:end w:w="120" w:type="dxa"/>
+            </w:tcMar>
+            <w:vAlign w:val="center"/>
+          </w:tcPr>
+          <w:p>
+            <w:pPr>
+              <w:spacing w:after="0"/>
+              <w:jc w:val="right"/>
+              <w:bidi w:val="1"/>
+            </w:pPr>
+            <w:r>
+              <w:rPr>
+                <w:rFonts w:ascii="Arial" w:hAnsi="Arial" w:cs="Arial"/>
+                <w:b w:val="0"/>
+                <w:color w:val="0B2545"/>
+                <w:sz w:val="18"/>
+              </w:rPr>
+              <w:t>להוסיף מעלה אלקליניות לפי נפח הבריכה ובהדרגה.</w:t>
+            </w:r>
+          </w:p>
+        </w:tc>
+      </w:tr>
+      <w:tr>
+        <w:tc>
+          <w:tcPr>
+            <w:tcW w:type="dxa" w:w="2088"/>
+            <w:shd w:fill="A4A933"/>
+            <w:tcBorders>
+              <w:top w:val="single" w:sz="6" w:space="0" w:color="D8E6EA"/>
+              <w:left w:val="single" w:sz="6" w:space="0" w:color="D8E6EA"/>
+              <w:bottom w:val="single" w:sz="6" w:space="0" w:color="D8E6EA"/>
+              <w:right w:val="single" w:sz="6" w:space="0" w:color="D8E6EA"/>
+            </w:tcBorders>
+            <w:tcMar>
+              <w:top w:w="110" w:type="dxa"/>
+              <w:start w:w="120" w:type="dxa"/>
+              <w:bottom w:w="110" w:type="dxa"/>
+              <w:end w:w="120" w:type="dxa"/>
+            </w:tcMar>
+            <w:vAlign w:val="center"/>
+          </w:tcPr>
+          <w:p>
+            <w:pPr>
+              <w:spacing w:after="0"/>
+              <w:jc w:val="right"/>
+              <w:bidi w:val="1"/>
+            </w:pPr>
+            <w:r>
+              <w:rPr>
+                <w:rFonts w:ascii="Arial" w:hAnsi="Arial" w:cs="Arial"/>
+                <w:b/>
+                <w:color w:val="FFFFFF"/>
+                <w:sz w:val="18"/>
+              </w:rPr>
+              <w:t>צהוב-זית</w:t>
+            </w:r>
+          </w:p>
+        </w:tc>
+        <w:tc>
+          <w:tcPr>
+            <w:tcW w:type="dxa" w:w="1152"/>
+            <w:tcBorders>
+              <w:top w:val="single" w:sz="6" w:space="0" w:color="D8E6EA"/>
+              <w:left w:val="single" w:sz="6" w:space="0" w:color="D8E6EA"/>
+              <w:bottom w:val="single" w:sz="6" w:space="0" w:color="D8E6EA"/>
+              <w:right w:val="single" w:sz="6" w:space="0" w:color="D8E6EA"/>
+            </w:tcBorders>
+            <w:tcMar>
+              <w:top w:w="110" w:type="dxa"/>
+              <w:start w:w="120" w:type="dxa"/>
+              <w:bottom w:w="110" w:type="dxa"/>
+              <w:end w:w="120" w:type="dxa"/>
+            </w:tcMar>
+            <w:vAlign w:val="center"/>
+          </w:tcPr>
+          <w:p>
+            <w:pPr>
+              <w:spacing w:after="0"/>
+              <w:jc w:val="right"/>
+              <w:bidi w:val="1"/>
+            </w:pPr>
+            <w:r>
+              <w:rPr>
+                <w:rFonts w:ascii="Arial" w:hAnsi="Arial" w:cs="Arial"/>
+                <w:b w:val="0"/>
+                <w:color w:val="0B2545"/>
+                <w:sz w:val="18"/>
+              </w:rPr>
+              <w:t>40</w:t>
+            </w:r>
+          </w:p>
+        </w:tc>
+        <w:tc>
+          <w:tcPr>
+            <w:tcW w:type="dxa" w:w="1728"/>
+            <w:tcBorders>
+              <w:top w:val="single" w:sz="6" w:space="0" w:color="D8E6EA"/>
+              <w:left w:val="single" w:sz="6" w:space="0" w:color="D8E6EA"/>
+              <w:bottom w:val="single" w:sz="6" w:space="0" w:color="D8E6EA"/>
+              <w:right w:val="single" w:sz="6" w:space="0" w:color="D8E6EA"/>
+            </w:tcBorders>
+            <w:tcMar>
+              <w:top w:w="110" w:type="dxa"/>
+              <w:start w:w="120" w:type="dxa"/>
+              <w:bottom w:w="110" w:type="dxa"/>
+              <w:end w:w="120" w:type="dxa"/>
+            </w:tcMar>
+            <w:vAlign w:val="center"/>
+          </w:tcPr>
+          <w:p>
+            <w:pPr>
+              <w:spacing w:after="0"/>
+              <w:jc w:val="right"/>
+              <w:bidi w:val="1"/>
+            </w:pPr>
+            <w:r>
+              <w:rPr>
+                <w:rFonts w:ascii="Arial" w:hAnsi="Arial" w:cs="Arial"/>
+                <w:b w:val="0"/>
+                <w:color w:val="0B2545"/>
+                <w:sz w:val="18"/>
+              </w:rPr>
+              <w:t>נמוך</w:t>
+            </w:r>
+          </w:p>
+        </w:tc>
+        <w:tc>
+          <w:tcPr>
+            <w:tcW w:type="dxa" w:w="4032"/>
+            <w:tcBorders>
+              <w:top w:val="single" w:sz="6" w:space="0" w:color="D8E6EA"/>
+              <w:left w:val="single" w:sz="6" w:space="0" w:color="D8E6EA"/>
+              <w:bottom w:val="single" w:sz="6" w:space="0" w:color="D8E6EA"/>
+              <w:right w:val="single" w:sz="6" w:space="0" w:color="D8E6EA"/>
+            </w:tcBorders>
+            <w:tcMar>
+              <w:top w:w="110" w:type="dxa"/>
+              <w:start w:w="120" w:type="dxa"/>
+              <w:bottom w:w="110" w:type="dxa"/>
+              <w:end w:w="120" w:type="dxa"/>
+            </w:tcMar>
+            <w:vAlign w:val="center"/>
+          </w:tcPr>
+          <w:p>
+            <w:pPr>
+              <w:spacing w:after="0"/>
+              <w:jc w:val="right"/>
+              <w:bidi w:val="1"/>
+            </w:pPr>
+            <w:r>
+              <w:rPr>
+                <w:rFonts w:ascii="Arial" w:hAnsi="Arial" w:cs="Arial"/>
+                <w:b w:val="0"/>
+                <w:color w:val="0B2545"/>
+                <w:sz w:val="18"/>
+              </w:rPr>
+              <w:t>להעלות אלקליניות ולבדוק שוב לפני תיקון pH.</w:t>
+            </w:r>
+          </w:p>
+        </w:tc>
+      </w:tr>
+      <w:tr>
+        <w:tc>
+          <w:tcPr>
+            <w:tcW w:type="dxa" w:w="2088"/>
+            <w:shd w:fill="899F3A"/>
+            <w:tcBorders>
+              <w:top w:val="single" w:sz="6" w:space="0" w:color="D8E6EA"/>
+              <w:left w:val="single" w:sz="6" w:space="0" w:color="D8E6EA"/>
+              <w:bottom w:val="single" w:sz="6" w:space="0" w:color="D8E6EA"/>
+              <w:right w:val="single" w:sz="6" w:space="0" w:color="D8E6EA"/>
+            </w:tcBorders>
+            <w:tcMar>
+              <w:top w:w="110" w:type="dxa"/>
+              <w:start w:w="120" w:type="dxa"/>
+              <w:bottom w:w="110" w:type="dxa"/>
+              <w:end w:w="120" w:type="dxa"/>
+            </w:tcMar>
+            <w:vAlign w:val="center"/>
+          </w:tcPr>
+          <w:p>
+            <w:pPr>
+              <w:spacing w:after="0"/>
+              <w:jc w:val="right"/>
+              <w:bidi w:val="1"/>
+            </w:pPr>
+            <w:r>
+              <w:rPr>
+                <w:rFonts w:ascii="Arial" w:hAnsi="Arial" w:cs="Arial"/>
+                <w:b/>
+                <w:color w:val="FFFFFF"/>
+                <w:sz w:val="18"/>
+              </w:rPr>
+              <w:t>ירוק-זית</w:t>
+            </w:r>
+          </w:p>
+        </w:tc>
+        <w:tc>
+          <w:tcPr>
+            <w:tcW w:type="dxa" w:w="1152"/>
+            <w:tcBorders>
+              <w:top w:val="single" w:sz="6" w:space="0" w:color="D8E6EA"/>
+              <w:left w:val="single" w:sz="6" w:space="0" w:color="D8E6EA"/>
+              <w:bottom w:val="single" w:sz="6" w:space="0" w:color="D8E6EA"/>
+              <w:right w:val="single" w:sz="6" w:space="0" w:color="D8E6EA"/>
+            </w:tcBorders>
+            <w:tcMar>
+              <w:top w:w="110" w:type="dxa"/>
+              <w:start w:w="120" w:type="dxa"/>
+              <w:bottom w:w="110" w:type="dxa"/>
+              <w:end w:w="120" w:type="dxa"/>
+            </w:tcMar>
+            <w:vAlign w:val="center"/>
+          </w:tcPr>
+          <w:p>
+            <w:pPr>
+              <w:spacing w:after="0"/>
+              <w:jc w:val="right"/>
+              <w:bidi w:val="1"/>
+            </w:pPr>
+            <w:r>
+              <w:rPr>
+                <w:rFonts w:ascii="Arial" w:hAnsi="Arial" w:cs="Arial"/>
+                <w:b w:val="0"/>
+                <w:color w:val="0B2545"/>
+                <w:sz w:val="18"/>
+              </w:rPr>
+              <w:t>80</w:t>
+            </w:r>
+          </w:p>
+        </w:tc>
+        <w:tc>
+          <w:tcPr>
+            <w:tcW w:type="dxa" w:w="1728"/>
+            <w:tcBorders>
+              <w:top w:val="single" w:sz="6" w:space="0" w:color="D8E6EA"/>
+              <w:left w:val="single" w:sz="6" w:space="0" w:color="D8E6EA"/>
+              <w:bottom w:val="single" w:sz="6" w:space="0" w:color="D8E6EA"/>
+              <w:right w:val="single" w:sz="6" w:space="0" w:color="D8E6EA"/>
+            </w:tcBorders>
+            <w:tcMar>
+              <w:top w:w="110" w:type="dxa"/>
+              <w:start w:w="120" w:type="dxa"/>
+              <w:bottom w:w="110" w:type="dxa"/>
+              <w:end w:w="120" w:type="dxa"/>
+            </w:tcMar>
+            <w:vAlign w:val="center"/>
+          </w:tcPr>
+          <w:p>
+            <w:pPr>
+              <w:spacing w:after="0"/>
+              <w:jc w:val="right"/>
+              <w:bidi w:val="1"/>
+            </w:pPr>
+            <w:r>
+              <w:rPr>
+                <w:rFonts w:ascii="Arial" w:hAnsi="Arial" w:cs="Arial"/>
+                <w:b w:val="0"/>
+                <w:color w:val="0B2545"/>
+                <w:sz w:val="18"/>
+              </w:rPr>
+              <w:t>קצה תחתון תקין</w:t>
+            </w:r>
+          </w:p>
+        </w:tc>
+        <w:tc>
+          <w:tcPr>
+            <w:tcW w:type="dxa" w:w="4032"/>
+            <w:tcBorders>
+              <w:top w:val="single" w:sz="6" w:space="0" w:color="D8E6EA"/>
+              <w:left w:val="single" w:sz="6" w:space="0" w:color="D8E6EA"/>
+              <w:bottom w:val="single" w:sz="6" w:space="0" w:color="D8E6EA"/>
+              <w:right w:val="single" w:sz="6" w:space="0" w:color="D8E6EA"/>
+            </w:tcBorders>
+            <w:tcMar>
+              <w:top w:w="110" w:type="dxa"/>
+              <w:start w:w="120" w:type="dxa"/>
+              <w:bottom w:w="110" w:type="dxa"/>
+              <w:end w:w="120" w:type="dxa"/>
+            </w:tcMar>
+            <w:vAlign w:val="center"/>
+          </w:tcPr>
+          <w:p>
+            <w:pPr>
+              <w:spacing w:after="0"/>
+              <w:jc w:val="right"/>
+              <w:bidi w:val="1"/>
+            </w:pPr>
+            <w:r>
+              <w:rPr>
+                <w:rFonts w:ascii="Arial" w:hAnsi="Arial" w:cs="Arial"/>
+                <w:b w:val="0"/>
+                <w:color w:val="0B2545"/>
+                <w:sz w:val="18"/>
+              </w:rPr>
+              <w:t>אין פעולה.</w:t>
+            </w:r>
+          </w:p>
+        </w:tc>
+      </w:tr>
+      <w:tr>
+        <w:tc>
+          <w:tcPr>
+            <w:tcW w:type="dxa" w:w="2088"/>
+            <w:shd w:fill="557F55"/>
+            <w:tcBorders>
+              <w:top w:val="single" w:sz="6" w:space="0" w:color="D8E6EA"/>
+              <w:left w:val="single" w:sz="6" w:space="0" w:color="D8E6EA"/>
+              <w:bottom w:val="single" w:sz="6" w:space="0" w:color="D8E6EA"/>
+              <w:right w:val="single" w:sz="6" w:space="0" w:color="D8E6EA"/>
+            </w:tcBorders>
+            <w:tcMar>
+              <w:top w:w="110" w:type="dxa"/>
+              <w:start w:w="120" w:type="dxa"/>
+              <w:bottom w:w="110" w:type="dxa"/>
+              <w:end w:w="120" w:type="dxa"/>
+            </w:tcMar>
+            <w:vAlign w:val="center"/>
+          </w:tcPr>
+          <w:p>
+            <w:pPr>
+              <w:spacing w:after="0"/>
+              <w:jc w:val="right"/>
+              <w:bidi w:val="1"/>
+            </w:pPr>
+            <w:r>
+              <w:rPr>
+                <w:rFonts w:ascii="Arial" w:hAnsi="Arial" w:cs="Arial"/>
+                <w:b/>
+                <w:color w:val="FFFFFF"/>
+                <w:sz w:val="18"/>
+              </w:rPr>
+              <w:t>ירוק</w:t>
+            </w:r>
+          </w:p>
+        </w:tc>
+        <w:tc>
+          <w:tcPr>
+            <w:tcW w:type="dxa" w:w="1152"/>
+            <w:tcBorders>
+              <w:top w:val="single" w:sz="6" w:space="0" w:color="D8E6EA"/>
+              <w:left w:val="single" w:sz="6" w:space="0" w:color="D8E6EA"/>
+              <w:bottom w:val="single" w:sz="6" w:space="0" w:color="D8E6EA"/>
+              <w:right w:val="single" w:sz="6" w:space="0" w:color="D8E6EA"/>
+            </w:tcBorders>
+            <w:tcMar>
+              <w:top w:w="110" w:type="dxa"/>
+              <w:start w:w="120" w:type="dxa"/>
+              <w:bottom w:w="110" w:type="dxa"/>
+              <w:end w:w="120" w:type="dxa"/>
+            </w:tcMar>
+            <w:vAlign w:val="center"/>
+          </w:tcPr>
+          <w:p>
+            <w:pPr>
+              <w:spacing w:after="0"/>
+              <w:jc w:val="right"/>
+              <w:bidi w:val="1"/>
+            </w:pPr>
+            <w:r>
+              <w:rPr>
+                <w:rFonts w:ascii="Arial" w:hAnsi="Arial" w:cs="Arial"/>
+                <w:b w:val="0"/>
+                <w:color w:val="0B2545"/>
+                <w:sz w:val="18"/>
+              </w:rPr>
+              <w:t>120</w:t>
+            </w:r>
+          </w:p>
+        </w:tc>
+        <w:tc>
+          <w:tcPr>
+            <w:tcW w:type="dxa" w:w="1728"/>
+            <w:tcBorders>
+              <w:top w:val="single" w:sz="6" w:space="0" w:color="D8E6EA"/>
+              <w:left w:val="single" w:sz="6" w:space="0" w:color="D8E6EA"/>
+              <w:bottom w:val="single" w:sz="6" w:space="0" w:color="D8E6EA"/>
+              <w:right w:val="single" w:sz="6" w:space="0" w:color="D8E6EA"/>
+            </w:tcBorders>
+            <w:tcMar>
+              <w:top w:w="110" w:type="dxa"/>
+              <w:start w:w="120" w:type="dxa"/>
+              <w:bottom w:w="110" w:type="dxa"/>
+              <w:end w:w="120" w:type="dxa"/>
+            </w:tcMar>
+            <w:vAlign w:val="center"/>
+          </w:tcPr>
+          <w:p>
+            <w:pPr>
+              <w:spacing w:after="0"/>
+              <w:jc w:val="right"/>
+              <w:bidi w:val="1"/>
+            </w:pPr>
+            <w:r>
+              <w:rPr>
+                <w:rFonts w:ascii="Arial" w:hAnsi="Arial" w:cs="Arial"/>
+                <w:b w:val="0"/>
+                <w:color w:val="0B2545"/>
+                <w:sz w:val="18"/>
+              </w:rPr>
+              <w:t>קצה עליון תקין</w:t>
+            </w:r>
+          </w:p>
+        </w:tc>
+        <w:tc>
+          <w:tcPr>
+            <w:tcW w:type="dxa" w:w="4032"/>
+            <w:tcBorders>
+              <w:top w:val="single" w:sz="6" w:space="0" w:color="D8E6EA"/>
+              <w:left w:val="single" w:sz="6" w:space="0" w:color="D8E6EA"/>
+              <w:bottom w:val="single" w:sz="6" w:space="0" w:color="D8E6EA"/>
+              <w:right w:val="single" w:sz="6" w:space="0" w:color="D8E6EA"/>
+            </w:tcBorders>
+            <w:tcMar>
+              <w:top w:w="110" w:type="dxa"/>
+              <w:start w:w="120" w:type="dxa"/>
+              <w:bottom w:w="110" w:type="dxa"/>
+              <w:end w:w="120" w:type="dxa"/>
+            </w:tcMar>
+            <w:vAlign w:val="center"/>
+          </w:tcPr>
+          <w:p>
+            <w:pPr>
+              <w:spacing w:after="0"/>
+              <w:jc w:val="right"/>
+              <w:bidi w:val="1"/>
+            </w:pPr>
+            <w:r>
+              <w:rPr>
+                <w:rFonts w:ascii="Arial" w:hAnsi="Arial" w:cs="Arial"/>
+                <w:b w:val="0"/>
+                <w:color w:val="0B2545"/>
+                <w:sz w:val="18"/>
+              </w:rPr>
+              <w:t>אין פעולה; לעקוב.</w:t>
+            </w:r>
+          </w:p>
+        </w:tc>
+      </w:tr>
+      <w:tr>
+        <w:tc>
+          <w:tcPr>
+            <w:tcW w:type="dxa" w:w="2088"/>
+            <w:shd w:fill="376964"/>
+            <w:tcBorders>
+              <w:top w:val="single" w:sz="6" w:space="0" w:color="D8E6EA"/>
+              <w:left w:val="single" w:sz="6" w:space="0" w:color="D8E6EA"/>
+              <w:bottom w:val="single" w:sz="6" w:space="0" w:color="D8E6EA"/>
+              <w:right w:val="single" w:sz="6" w:space="0" w:color="D8E6EA"/>
+            </w:tcBorders>
+            <w:tcMar>
+              <w:top w:w="110" w:type="dxa"/>
+              <w:start w:w="120" w:type="dxa"/>
+              <w:bottom w:w="110" w:type="dxa"/>
+              <w:end w:w="120" w:type="dxa"/>
+            </w:tcMar>
+            <w:vAlign w:val="center"/>
+          </w:tcPr>
+          <w:p>
+            <w:pPr>
+              <w:spacing w:after="0"/>
+              <w:jc w:val="right"/>
+              <w:bidi w:val="1"/>
+            </w:pPr>
+            <w:r>
+              <w:rPr>
+                <w:rFonts w:ascii="Arial" w:hAnsi="Arial" w:cs="Arial"/>
+                <w:b/>
+                <w:color w:val="FFFFFF"/>
+                <w:sz w:val="18"/>
+              </w:rPr>
+              <w:t>ירוק-כחול</w:t>
+            </w:r>
+          </w:p>
+        </w:tc>
+        <w:tc>
+          <w:tcPr>
+            <w:tcW w:type="dxa" w:w="1152"/>
+            <w:tcBorders>
+              <w:top w:val="single" w:sz="6" w:space="0" w:color="D8E6EA"/>
+              <w:left w:val="single" w:sz="6" w:space="0" w:color="D8E6EA"/>
+              <w:bottom w:val="single" w:sz="6" w:space="0" w:color="D8E6EA"/>
+              <w:right w:val="single" w:sz="6" w:space="0" w:color="D8E6EA"/>
+            </w:tcBorders>
+            <w:tcMar>
+              <w:top w:w="110" w:type="dxa"/>
+              <w:start w:w="120" w:type="dxa"/>
+              <w:bottom w:w="110" w:type="dxa"/>
+              <w:end w:w="120" w:type="dxa"/>
+            </w:tcMar>
+            <w:vAlign w:val="center"/>
+          </w:tcPr>
+          <w:p>
+            <w:pPr>
+              <w:spacing w:after="0"/>
+              <w:jc w:val="right"/>
+              <w:bidi w:val="1"/>
+            </w:pPr>
+            <w:r>
+              <w:rPr>
+                <w:rFonts w:ascii="Arial" w:hAnsi="Arial" w:cs="Arial"/>
+                <w:b w:val="0"/>
+                <w:color w:val="0B2545"/>
+                <w:sz w:val="18"/>
+              </w:rPr>
+              <w:t>180</w:t>
+            </w:r>
+          </w:p>
+        </w:tc>
+        <w:tc>
+          <w:tcPr>
+            <w:tcW w:type="dxa" w:w="1728"/>
+            <w:tcBorders>
+              <w:top w:val="single" w:sz="6" w:space="0" w:color="D8E6EA"/>
+              <w:left w:val="single" w:sz="6" w:space="0" w:color="D8E6EA"/>
+              <w:bottom w:val="single" w:sz="6" w:space="0" w:color="D8E6EA"/>
+              <w:right w:val="single" w:sz="6" w:space="0" w:color="D8E6EA"/>
+            </w:tcBorders>
+            <w:tcMar>
+              <w:top w:w="110" w:type="dxa"/>
+              <w:start w:w="120" w:type="dxa"/>
+              <w:bottom w:w="110" w:type="dxa"/>
+              <w:end w:w="120" w:type="dxa"/>
+            </w:tcMar>
+            <w:vAlign w:val="center"/>
+          </w:tcPr>
+          <w:p>
+            <w:pPr>
+              <w:spacing w:after="0"/>
+              <w:jc w:val="right"/>
+              <w:bidi w:val="1"/>
+            </w:pPr>
+            <w:r>
+              <w:rPr>
+                <w:rFonts w:ascii="Arial" w:hAnsi="Arial" w:cs="Arial"/>
+                <w:b w:val="0"/>
+                <w:color w:val="0B2545"/>
+                <w:sz w:val="18"/>
+              </w:rPr>
+              <w:t>גבוה</w:t>
+            </w:r>
+          </w:p>
+        </w:tc>
+        <w:tc>
+          <w:tcPr>
+            <w:tcW w:type="dxa" w:w="4032"/>
+            <w:tcBorders>
+              <w:top w:val="single" w:sz="6" w:space="0" w:color="D8E6EA"/>
+              <w:left w:val="single" w:sz="6" w:space="0" w:color="D8E6EA"/>
+              <w:bottom w:val="single" w:sz="6" w:space="0" w:color="D8E6EA"/>
+              <w:right w:val="single" w:sz="6" w:space="0" w:color="D8E6EA"/>
+            </w:tcBorders>
+            <w:tcMar>
+              <w:top w:w="110" w:type="dxa"/>
+              <w:start w:w="120" w:type="dxa"/>
+              <w:bottom w:w="110" w:type="dxa"/>
+              <w:end w:w="120" w:type="dxa"/>
+            </w:tcMar>
+            <w:vAlign w:val="center"/>
+          </w:tcPr>
+          <w:p>
+            <w:pPr>
+              <w:spacing w:after="0"/>
+              <w:jc w:val="right"/>
+              <w:bidi w:val="1"/>
+            </w:pPr>
+            <w:r>
+              <w:rPr>
+                <w:rFonts w:ascii="Arial" w:hAnsi="Arial" w:cs="Arial"/>
+                <w:b w:val="0"/>
+                <w:color w:val="0B2545"/>
+                <w:sz w:val="18"/>
+              </w:rPr>
+              <w:t>להוריד בהדרגה לפי הנחיית איש בריכות; לא לבצע שינוי חד.</w:t>
+            </w:r>
+          </w:p>
+        </w:tc>
+      </w:tr>
+      <w:tr>
+        <w:tc>
+          <w:tcPr>
+            <w:tcW w:type="dxa" w:w="2088"/>
+            <w:shd w:fill="285A78"/>
+            <w:tcBorders>
+              <w:top w:val="single" w:sz="6" w:space="0" w:color="D8E6EA"/>
+              <w:left w:val="single" w:sz="6" w:space="0" w:color="D8E6EA"/>
+              <w:bottom w:val="single" w:sz="6" w:space="0" w:color="D8E6EA"/>
+              <w:right w:val="single" w:sz="6" w:space="0" w:color="D8E6EA"/>
+            </w:tcBorders>
+            <w:tcMar>
+              <w:top w:w="110" w:type="dxa"/>
+              <w:start w:w="120" w:type="dxa"/>
+              <w:bottom w:w="110" w:type="dxa"/>
+              <w:end w:w="120" w:type="dxa"/>
+            </w:tcMar>
+            <w:vAlign w:val="center"/>
+          </w:tcPr>
+          <w:p>
+            <w:pPr>
+              <w:spacing w:after="0"/>
+              <w:jc w:val="right"/>
+              <w:bidi w:val="1"/>
+            </w:pPr>
+            <w:r>
+              <w:rPr>
+                <w:rFonts w:ascii="Arial" w:hAnsi="Arial" w:cs="Arial"/>
+                <w:b/>
+                <w:color w:val="FFFFFF"/>
+                <w:sz w:val="18"/>
+              </w:rPr>
+              <w:t>כחול כהה</w:t>
+            </w:r>
+          </w:p>
+        </w:tc>
+        <w:tc>
+          <w:tcPr>
+            <w:tcW w:type="dxa" w:w="1152"/>
+            <w:tcBorders>
+              <w:top w:val="single" w:sz="6" w:space="0" w:color="D8E6EA"/>
+              <w:left w:val="single" w:sz="6" w:space="0" w:color="D8E6EA"/>
+              <w:bottom w:val="single" w:sz="6" w:space="0" w:color="D8E6EA"/>
+              <w:right w:val="single" w:sz="6" w:space="0" w:color="D8E6EA"/>
+            </w:tcBorders>
+            <w:tcMar>
+              <w:top w:w="110" w:type="dxa"/>
+              <w:start w:w="120" w:type="dxa"/>
+              <w:bottom w:w="110" w:type="dxa"/>
+              <w:end w:w="120" w:type="dxa"/>
+            </w:tcMar>
+            <w:vAlign w:val="center"/>
+          </w:tcPr>
+          <w:p>
+            <w:pPr>
+              <w:spacing w:after="0"/>
+              <w:jc w:val="right"/>
+              <w:bidi w:val="1"/>
+            </w:pPr>
+            <w:r>
+              <w:rPr>
+                <w:rFonts w:ascii="Arial" w:hAnsi="Arial" w:cs="Arial"/>
+                <w:b w:val="0"/>
+                <w:color w:val="0B2545"/>
+                <w:sz w:val="18"/>
+              </w:rPr>
+              <w:t>240</w:t>
+            </w:r>
+          </w:p>
+        </w:tc>
+        <w:tc>
+          <w:tcPr>
+            <w:tcW w:type="dxa" w:w="1728"/>
+            <w:tcBorders>
+              <w:top w:val="single" w:sz="6" w:space="0" w:color="D8E6EA"/>
+              <w:left w:val="single" w:sz="6" w:space="0" w:color="D8E6EA"/>
+              <w:bottom w:val="single" w:sz="6" w:space="0" w:color="D8E6EA"/>
+              <w:right w:val="single" w:sz="6" w:space="0" w:color="D8E6EA"/>
+            </w:tcBorders>
+            <w:tcMar>
+              <w:top w:w="110" w:type="dxa"/>
+              <w:start w:w="120" w:type="dxa"/>
+              <w:bottom w:w="110" w:type="dxa"/>
+              <w:end w:w="120" w:type="dxa"/>
+            </w:tcMar>
+            <w:vAlign w:val="center"/>
+          </w:tcPr>
+          <w:p>
+            <w:pPr>
+              <w:spacing w:after="0"/>
+              <w:jc w:val="right"/>
+              <w:bidi w:val="1"/>
+            </w:pPr>
+            <w:r>
+              <w:rPr>
+                <w:rFonts w:ascii="Arial" w:hAnsi="Arial" w:cs="Arial"/>
+                <w:b w:val="0"/>
+                <w:color w:val="0B2545"/>
+                <w:sz w:val="18"/>
+              </w:rPr>
+              <w:t>גבוה מאוד</w:t>
+            </w:r>
+          </w:p>
+        </w:tc>
+        <w:tc>
+          <w:tcPr>
+            <w:tcW w:type="dxa" w:w="4032"/>
+            <w:tcBorders>
+              <w:top w:val="single" w:sz="6" w:space="0" w:color="D8E6EA"/>
+              <w:left w:val="single" w:sz="6" w:space="0" w:color="D8E6EA"/>
+              <w:bottom w:val="single" w:sz="6" w:space="0" w:color="D8E6EA"/>
+              <w:right w:val="single" w:sz="6" w:space="0" w:color="D8E6EA"/>
+            </w:tcBorders>
+            <w:tcMar>
+              <w:top w:w="110" w:type="dxa"/>
+              <w:start w:w="120" w:type="dxa"/>
+              <w:bottom w:w="110" w:type="dxa"/>
+              <w:end w:w="120" w:type="dxa"/>
+            </w:tcMar>
+            <w:vAlign w:val="center"/>
+          </w:tcPr>
+          <w:p>
+            <w:pPr>
+              <w:spacing w:after="0"/>
+              <w:jc w:val="right"/>
+              <w:bidi w:val="1"/>
+            </w:pPr>
+            <w:r>
+              <w:rPr>
+                <w:rFonts w:ascii="Arial" w:hAnsi="Arial" w:cs="Arial"/>
+                <w:b w:val="0"/>
+                <w:color w:val="0B2545"/>
+                <w:sz w:val="18"/>
+              </w:rPr>
+              <w:t>נדרש טיפול מקצועי והורדה מדורגת.</w:t>
+            </w:r>
+          </w:p>
+        </w:tc>
+      </w:tr>
+    </w:tbl>
+    <w:p/>
+    <w:tbl>
+      <w:tblPr>
+        <w:tblW w:type="auto" w:w="0"/>
+        <w:tblLook w:firstColumn="1" w:firstRow="1" w:lastColumn="0" w:lastRow="0" w:noHBand="0" w:noVBand="1" w:val="04A0"/>
+      </w:tblPr>
+      <w:tblGrid>
+        <w:gridCol w:w="10368"/>
+      </w:tblGrid>
+      <w:tr>
+        <w:tc>
+          <w:tcPr>
+            <w:tcW w:type="dxa" w:w="10368"/>
+            <w:shd w:fill="FFE6EA"/>
+            <w:tcBorders>
+              <w:top w:val="single" w:sz="8" w:space="0" w:color="E9576A"/>
+              <w:left w:val="single" w:sz="8" w:space="0" w:color="E9576A"/>
+              <w:bottom w:val="single" w:sz="8" w:space="0" w:color="E9576A"/>
+              <w:right w:val="single" w:sz="8" w:space="0" w:color="E9576A"/>
+            </w:tcBorders>
+            <w:tcMar>
+              <w:top w:w="140" w:type="dxa"/>
+              <w:start w:w="180" w:type="dxa"/>
+              <w:bottom w:w="140" w:type="dxa"/>
+              <w:end w:w="180" w:type="dxa"/>
+            </w:tcMar>
+            <w:vAlign w:val="center"/>
+          </w:tcPr>
+          <w:p>
+            <w:pPr>
+              <w:jc w:val="right"/>
+              <w:bidi w:val="1"/>
+            </w:pPr>
+            <w:r>
+              <w:rPr>
+                <w:rFonts w:ascii="Arial" w:hAnsi="Arial" w:cs="Arial"/>
+                <w:b/>
+                <w:color w:val="0B2545"/>
+                <w:sz w:val="21"/>
+              </w:rPr>
+              <w:t>ל-AquaChek Pro שבתמונות אין פד נפרד של CYA / מייצב כלור. אין להסיק CYA מארבעת הפדים האלה. CYA יוצג רק אם מותג הסטיק שנבחר כולל מדידה כזו או אם המשתמש הזין בדיקה מתאימה.</w:t>
+            </w:r>
+          </w:p>
+        </w:tc>
+      </w:tr>
+    </w:tbl>
+    <w:p/>
     <w:p>
       <w:pPr>
         <w:spacing w:after="100" w:line="276" w:lineRule="auto" w:before="240"/>
@@ -2082,7 +5949,7 @@
           <w:color w:val="11B5C8"/>
           <w:sz w:val="34"/>
         </w:rPr>
-        <w:t>2. מקרא צבעי הסטטוס באפליקציה</w:t>
+        <w:t>2. צבעי הממשק בלבד - לא צבעי הסטיק</w:t>
       </w:r>
     </w:p>
     <w:tbl>
@@ -3723,7 +7590,7 @@
                 <w:color w:val="0B2545"/>
                 <w:sz w:val="18"/>
               </w:rPr>
-              <w:t>פחות מ-30 ppm</w:t>
+              <w:t>לא נמדד</w:t>
             </w:r>
           </w:p>
         </w:tc>
@@ -3757,7 +7624,7 @@
                 <w:color w:val="0B2545"/>
                 <w:sz w:val="18"/>
               </w:rPr>
-              <w:t>30-50 ppm</w:t>
+              <w:t>לא נמדד</w:t>
             </w:r>
           </w:p>
         </w:tc>
@@ -3791,7 +7658,7 @@
                 <w:color w:val="0B2545"/>
                 <w:sz w:val="18"/>
               </w:rPr>
-              <w:t>מעל 50 ppm</w:t>
+              <w:t>לא נמדד</w:t>
             </w:r>
           </w:p>
         </w:tc>
@@ -3825,7 +7692,7 @@
                 <w:color w:val="0B2545"/>
                 <w:sz w:val="18"/>
               </w:rPr>
-              <w:t>40 ppm</w:t>
+              <w:t>לא קיים בסטיק</w:t>
             </w:r>
           </w:p>
         </w:tc>
@@ -3845,903 +7712,7 @@
           <w:color w:val="11B5C8"/>
           <w:sz w:val="34"/>
         </w:rPr>
-        <w:t>4. מה להוסיף או לעשות לפי כל קובייה</w:t>
-      </w:r>
-    </w:p>
-    <w:tbl>
-      <w:tblPr>
-        <w:tblW w:type="auto" w:w="0"/>
-        <w:tblLayout w:type="fixed"/>
-        <w:tblLook w:firstColumn="1" w:firstRow="1" w:lastColumn="0" w:lastRow="0" w:noHBand="0" w:noVBand="1" w:val="04A0"/>
-      </w:tblPr>
-      <w:tblGrid>
-        <w:gridCol w:w="1512"/>
-        <w:gridCol w:w="2376"/>
-        <w:gridCol w:w="1368"/>
-        <w:gridCol w:w="2376"/>
-        <w:gridCol w:w="2592"/>
-      </w:tblGrid>
-      <w:tr>
-        <w:tc>
-          <w:tcPr>
-            <w:tcW w:type="dxa" w:w="2074"/>
-            <w:shd w:fill="E6F9FC"/>
-            <w:tcBorders>
-              <w:top w:val="single" w:sz="6" w:space="0" w:color="D8E6EA"/>
-              <w:left w:val="single" w:sz="6" w:space="0" w:color="D8E6EA"/>
-              <w:bottom w:val="single" w:sz="6" w:space="0" w:color="D8E6EA"/>
-              <w:right w:val="single" w:sz="6" w:space="0" w:color="D8E6EA"/>
-            </w:tcBorders>
-            <w:tcMar>
-              <w:top w:w="110" w:type="dxa"/>
-              <w:start w:w="120" w:type="dxa"/>
-              <w:bottom w:w="110" w:type="dxa"/>
-              <w:end w:w="120" w:type="dxa"/>
-            </w:tcMar>
-            <w:vAlign w:val="center"/>
-          </w:tcPr>
-          <w:p>
-            <w:pPr>
-              <w:spacing w:after="0"/>
-              <w:jc w:val="right"/>
-              <w:bidi w:val="1"/>
-            </w:pPr>
-            <w:r>
-              <w:rPr>
-                <w:rFonts w:ascii="Arial" w:hAnsi="Arial" w:cs="Arial"/>
-                <w:b/>
-                <w:color w:val="0B2545"/>
-                <w:sz w:val="19"/>
-              </w:rPr>
-              <w:t>קובייה</w:t>
-            </w:r>
-          </w:p>
-        </w:tc>
-        <w:tc>
-          <w:tcPr>
-            <w:tcW w:type="dxa" w:w="2074"/>
-            <w:shd w:fill="FFF7D6"/>
-            <w:tcBorders>
-              <w:top w:val="single" w:sz="6" w:space="0" w:color="D8E6EA"/>
-              <w:left w:val="single" w:sz="6" w:space="0" w:color="D8E6EA"/>
-              <w:bottom w:val="single" w:sz="6" w:space="0" w:color="D8E6EA"/>
-              <w:right w:val="single" w:sz="6" w:space="0" w:color="D8E6EA"/>
-            </w:tcBorders>
-            <w:tcMar>
-              <w:top w:w="110" w:type="dxa"/>
-              <w:start w:w="120" w:type="dxa"/>
-              <w:bottom w:w="110" w:type="dxa"/>
-              <w:end w:w="120" w:type="dxa"/>
-            </w:tcMar>
-            <w:vAlign w:val="center"/>
-          </w:tcPr>
-          <w:p>
-            <w:pPr>
-              <w:spacing w:after="0"/>
-              <w:jc w:val="right"/>
-              <w:bidi w:val="1"/>
-            </w:pPr>
-            <w:r>
-              <w:rPr>
-                <w:rFonts w:ascii="Arial" w:hAnsi="Arial" w:cs="Arial"/>
-                <w:b/>
-                <w:color w:val="0B2545"/>
-                <w:sz w:val="19"/>
-              </w:rPr>
-              <w:t>צהוב - נמוך</w:t>
-            </w:r>
-          </w:p>
-        </w:tc>
-        <w:tc>
-          <w:tcPr>
-            <w:tcW w:type="dxa" w:w="2074"/>
-            <w:shd w:fill="E8F8EF"/>
-            <w:tcBorders>
-              <w:top w:val="single" w:sz="6" w:space="0" w:color="D8E6EA"/>
-              <w:left w:val="single" w:sz="6" w:space="0" w:color="D8E6EA"/>
-              <w:bottom w:val="single" w:sz="6" w:space="0" w:color="D8E6EA"/>
-              <w:right w:val="single" w:sz="6" w:space="0" w:color="D8E6EA"/>
-            </w:tcBorders>
-            <w:tcMar>
-              <w:top w:w="110" w:type="dxa"/>
-              <w:start w:w="120" w:type="dxa"/>
-              <w:bottom w:w="110" w:type="dxa"/>
-              <w:end w:w="120" w:type="dxa"/>
-            </w:tcMar>
-            <w:vAlign w:val="center"/>
-          </w:tcPr>
-          <w:p>
-            <w:pPr>
-              <w:spacing w:after="0"/>
-              <w:jc w:val="right"/>
-              <w:bidi w:val="1"/>
-            </w:pPr>
-            <w:r>
-              <w:rPr>
-                <w:rFonts w:ascii="Arial" w:hAnsi="Arial" w:cs="Arial"/>
-                <w:b/>
-                <w:color w:val="0B2545"/>
-                <w:sz w:val="19"/>
-              </w:rPr>
-              <w:t>ירוק - תקין</w:t>
-            </w:r>
-          </w:p>
-        </w:tc>
-        <w:tc>
-          <w:tcPr>
-            <w:tcW w:type="dxa" w:w="2074"/>
-            <w:shd w:fill="FFE6EA"/>
-            <w:tcBorders>
-              <w:top w:val="single" w:sz="6" w:space="0" w:color="D8E6EA"/>
-              <w:left w:val="single" w:sz="6" w:space="0" w:color="D8E6EA"/>
-              <w:bottom w:val="single" w:sz="6" w:space="0" w:color="D8E6EA"/>
-              <w:right w:val="single" w:sz="6" w:space="0" w:color="D8E6EA"/>
-            </w:tcBorders>
-            <w:tcMar>
-              <w:top w:w="110" w:type="dxa"/>
-              <w:start w:w="120" w:type="dxa"/>
-              <w:bottom w:w="110" w:type="dxa"/>
-              <w:end w:w="120" w:type="dxa"/>
-            </w:tcMar>
-            <w:vAlign w:val="center"/>
-          </w:tcPr>
-          <w:p>
-            <w:pPr>
-              <w:spacing w:after="0"/>
-              <w:jc w:val="right"/>
-              <w:bidi w:val="1"/>
-            </w:pPr>
-            <w:r>
-              <w:rPr>
-                <w:rFonts w:ascii="Arial" w:hAnsi="Arial" w:cs="Arial"/>
-                <w:b/>
-                <w:color w:val="0B2545"/>
-                <w:sz w:val="19"/>
-              </w:rPr>
-              <w:t>אדום - גבוה</w:t>
-            </w:r>
-          </w:p>
-        </w:tc>
-        <w:tc>
-          <w:tcPr>
-            <w:tcW w:type="dxa" w:w="2074"/>
-            <w:shd w:fill="E6F9FC"/>
-            <w:tcBorders>
-              <w:top w:val="single" w:sz="6" w:space="0" w:color="D8E6EA"/>
-              <w:left w:val="single" w:sz="6" w:space="0" w:color="D8E6EA"/>
-              <w:bottom w:val="single" w:sz="6" w:space="0" w:color="D8E6EA"/>
-              <w:right w:val="single" w:sz="6" w:space="0" w:color="D8E6EA"/>
-            </w:tcBorders>
-            <w:tcMar>
-              <w:top w:w="110" w:type="dxa"/>
-              <w:start w:w="120" w:type="dxa"/>
-              <w:bottom w:w="110" w:type="dxa"/>
-              <w:end w:w="120" w:type="dxa"/>
-            </w:tcMar>
-            <w:vAlign w:val="center"/>
-          </w:tcPr>
-          <w:p>
-            <w:pPr>
-              <w:spacing w:after="0"/>
-              <w:jc w:val="right"/>
-              <w:bidi w:val="1"/>
-            </w:pPr>
-            <w:r>
-              <w:rPr>
-                <w:rFonts w:ascii="Arial" w:hAnsi="Arial" w:cs="Arial"/>
-                <w:b/>
-                <w:color w:val="0B2545"/>
-                <w:sz w:val="19"/>
-              </w:rPr>
-              <w:t>הסיבה המקצועית</w:t>
-            </w:r>
-          </w:p>
-        </w:tc>
-      </w:tr>
-      <w:tr>
-        <w:tc>
-          <w:tcPr>
-            <w:tcW w:type="dxa" w:w="1512"/>
-            <w:tcBorders>
-              <w:top w:val="single" w:sz="6" w:space="0" w:color="D8E6EA"/>
-              <w:left w:val="single" w:sz="6" w:space="0" w:color="D8E6EA"/>
-              <w:bottom w:val="single" w:sz="6" w:space="0" w:color="D8E6EA"/>
-              <w:right w:val="single" w:sz="6" w:space="0" w:color="D8E6EA"/>
-            </w:tcBorders>
-            <w:tcMar>
-              <w:top w:w="110" w:type="dxa"/>
-              <w:start w:w="120" w:type="dxa"/>
-              <w:bottom w:w="110" w:type="dxa"/>
-              <w:end w:w="120" w:type="dxa"/>
-            </w:tcMar>
-            <w:vAlign w:val="center"/>
-          </w:tcPr>
-          <w:p>
-            <w:pPr>
-              <w:spacing w:after="0"/>
-              <w:jc w:val="right"/>
-              <w:bidi w:val="1"/>
-            </w:pPr>
-            <w:r>
-              <w:rPr>
-                <w:rFonts w:ascii="Arial" w:hAnsi="Arial" w:cs="Arial"/>
-                <w:b w:val="0"/>
-                <w:color w:val="0B2545"/>
-                <w:sz w:val="18"/>
-              </w:rPr>
-              <w:t>אלקליניות</w:t>
-            </w:r>
-          </w:p>
-        </w:tc>
-        <w:tc>
-          <w:tcPr>
-            <w:tcW w:type="dxa" w:w="2376"/>
-            <w:tcBorders>
-              <w:top w:val="single" w:sz="6" w:space="0" w:color="D8E6EA"/>
-              <w:left w:val="single" w:sz="6" w:space="0" w:color="D8E6EA"/>
-              <w:bottom w:val="single" w:sz="6" w:space="0" w:color="D8E6EA"/>
-              <w:right w:val="single" w:sz="6" w:space="0" w:color="D8E6EA"/>
-            </w:tcBorders>
-            <w:tcMar>
-              <w:top w:w="110" w:type="dxa"/>
-              <w:start w:w="120" w:type="dxa"/>
-              <w:bottom w:w="110" w:type="dxa"/>
-              <w:end w:w="120" w:type="dxa"/>
-            </w:tcMar>
-            <w:vAlign w:val="center"/>
-          </w:tcPr>
-          <w:p>
-            <w:pPr>
-              <w:spacing w:after="0"/>
-              <w:jc w:val="right"/>
-              <w:bidi w:val="1"/>
-            </w:pPr>
-            <w:r>
-              <w:rPr>
-                <w:rFonts w:ascii="Arial" w:hAnsi="Arial" w:cs="Arial"/>
-                <w:b w:val="0"/>
-                <w:color w:val="0B2545"/>
-                <w:sz w:val="18"/>
-              </w:rPr>
-              <w:t>להוסיף מעלה אלקליניות / סודה לשתייה</w:t>
-            </w:r>
-          </w:p>
-        </w:tc>
-        <w:tc>
-          <w:tcPr>
-            <w:tcW w:type="dxa" w:w="1368"/>
-            <w:tcBorders>
-              <w:top w:val="single" w:sz="6" w:space="0" w:color="D8E6EA"/>
-              <w:left w:val="single" w:sz="6" w:space="0" w:color="D8E6EA"/>
-              <w:bottom w:val="single" w:sz="6" w:space="0" w:color="D8E6EA"/>
-              <w:right w:val="single" w:sz="6" w:space="0" w:color="D8E6EA"/>
-            </w:tcBorders>
-            <w:tcMar>
-              <w:top w:w="110" w:type="dxa"/>
-              <w:start w:w="120" w:type="dxa"/>
-              <w:bottom w:w="110" w:type="dxa"/>
-              <w:end w:w="120" w:type="dxa"/>
-            </w:tcMar>
-            <w:vAlign w:val="center"/>
-          </w:tcPr>
-          <w:p>
-            <w:pPr>
-              <w:spacing w:after="0"/>
-              <w:jc w:val="right"/>
-              <w:bidi w:val="1"/>
-            </w:pPr>
-            <w:r>
-              <w:rPr>
-                <w:rFonts w:ascii="Arial" w:hAnsi="Arial" w:cs="Arial"/>
-                <w:b w:val="0"/>
-                <w:color w:val="0B2545"/>
-                <w:sz w:val="18"/>
-              </w:rPr>
-              <w:t>אין פעולה</w:t>
-            </w:r>
-          </w:p>
-        </w:tc>
-        <w:tc>
-          <w:tcPr>
-            <w:tcW w:type="dxa" w:w="2376"/>
-            <w:tcBorders>
-              <w:top w:val="single" w:sz="6" w:space="0" w:color="D8E6EA"/>
-              <w:left w:val="single" w:sz="6" w:space="0" w:color="D8E6EA"/>
-              <w:bottom w:val="single" w:sz="6" w:space="0" w:color="D8E6EA"/>
-              <w:right w:val="single" w:sz="6" w:space="0" w:color="D8E6EA"/>
-            </w:tcBorders>
-            <w:tcMar>
-              <w:top w:w="110" w:type="dxa"/>
-              <w:start w:w="120" w:type="dxa"/>
-              <w:bottom w:w="110" w:type="dxa"/>
-              <w:end w:w="120" w:type="dxa"/>
-            </w:tcMar>
-            <w:vAlign w:val="center"/>
-          </w:tcPr>
-          <w:p>
-            <w:pPr>
-              <w:spacing w:after="0"/>
-              <w:jc w:val="right"/>
-              <w:bidi w:val="1"/>
-            </w:pPr>
-            <w:r>
-              <w:rPr>
-                <w:rFonts w:ascii="Arial" w:hAnsi="Arial" w:cs="Arial"/>
-                <w:b w:val="0"/>
-                <w:color w:val="0B2545"/>
-                <w:sz w:val="18"/>
-              </w:rPr>
-              <w:t>להוריד בהדרגה עם חומצה במנות קטנות</w:t>
-            </w:r>
-          </w:p>
-        </w:tc>
-        <w:tc>
-          <w:tcPr>
-            <w:tcW w:type="dxa" w:w="2592"/>
-            <w:tcBorders>
-              <w:top w:val="single" w:sz="6" w:space="0" w:color="D8E6EA"/>
-              <w:left w:val="single" w:sz="6" w:space="0" w:color="D8E6EA"/>
-              <w:bottom w:val="single" w:sz="6" w:space="0" w:color="D8E6EA"/>
-              <w:right w:val="single" w:sz="6" w:space="0" w:color="D8E6EA"/>
-            </w:tcBorders>
-            <w:tcMar>
-              <w:top w:w="110" w:type="dxa"/>
-              <w:start w:w="120" w:type="dxa"/>
-              <w:bottom w:w="110" w:type="dxa"/>
-              <w:end w:w="120" w:type="dxa"/>
-            </w:tcMar>
-            <w:vAlign w:val="center"/>
-          </w:tcPr>
-          <w:p>
-            <w:pPr>
-              <w:spacing w:after="0"/>
-              <w:jc w:val="right"/>
-              <w:bidi w:val="1"/>
-            </w:pPr>
-            <w:r>
-              <w:rPr>
-                <w:rFonts w:ascii="Arial" w:hAnsi="Arial" w:cs="Arial"/>
-                <w:b w:val="0"/>
-                <w:color w:val="0B2545"/>
-                <w:sz w:val="18"/>
-              </w:rPr>
-              <w:t>אלקליניות מאזנת את ה-pH. כשהיא לא תקינה ה-pH ממשיך לזוז.</w:t>
-            </w:r>
-          </w:p>
-        </w:tc>
-      </w:tr>
-      <w:tr>
-        <w:tc>
-          <w:tcPr>
-            <w:tcW w:type="dxa" w:w="1512"/>
-            <w:tcBorders>
-              <w:top w:val="single" w:sz="6" w:space="0" w:color="D8E6EA"/>
-              <w:left w:val="single" w:sz="6" w:space="0" w:color="D8E6EA"/>
-              <w:bottom w:val="single" w:sz="6" w:space="0" w:color="D8E6EA"/>
-              <w:right w:val="single" w:sz="6" w:space="0" w:color="D8E6EA"/>
-            </w:tcBorders>
-            <w:tcMar>
-              <w:top w:w="110" w:type="dxa"/>
-              <w:start w:w="120" w:type="dxa"/>
-              <w:bottom w:w="110" w:type="dxa"/>
-              <w:end w:w="120" w:type="dxa"/>
-            </w:tcMar>
-            <w:vAlign w:val="center"/>
-          </w:tcPr>
-          <w:p>
-            <w:pPr>
-              <w:spacing w:after="0"/>
-              <w:jc w:val="right"/>
-              <w:bidi w:val="1"/>
-            </w:pPr>
-            <w:r>
-              <w:rPr>
-                <w:rFonts w:ascii="Arial" w:hAnsi="Arial" w:cs="Arial"/>
-                <w:b w:val="0"/>
-                <w:color w:val="0B2545"/>
-                <w:sz w:val="18"/>
-              </w:rPr>
-              <w:t>pH</w:t>
-            </w:r>
-          </w:p>
-        </w:tc>
-        <w:tc>
-          <w:tcPr>
-            <w:tcW w:type="dxa" w:w="2376"/>
-            <w:tcBorders>
-              <w:top w:val="single" w:sz="6" w:space="0" w:color="D8E6EA"/>
-              <w:left w:val="single" w:sz="6" w:space="0" w:color="D8E6EA"/>
-              <w:bottom w:val="single" w:sz="6" w:space="0" w:color="D8E6EA"/>
-              <w:right w:val="single" w:sz="6" w:space="0" w:color="D8E6EA"/>
-            </w:tcBorders>
-            <w:tcMar>
-              <w:top w:w="110" w:type="dxa"/>
-              <w:start w:w="120" w:type="dxa"/>
-              <w:bottom w:w="110" w:type="dxa"/>
-              <w:end w:w="120" w:type="dxa"/>
-            </w:tcMar>
-            <w:vAlign w:val="center"/>
-          </w:tcPr>
-          <w:p>
-            <w:pPr>
-              <w:spacing w:after="0"/>
-              <w:jc w:val="right"/>
-              <w:bidi w:val="1"/>
-            </w:pPr>
-            <w:r>
-              <w:rPr>
-                <w:rFonts w:ascii="Arial" w:hAnsi="Arial" w:cs="Arial"/>
-                <w:b w:val="0"/>
-                <w:color w:val="0B2545"/>
-                <w:sz w:val="18"/>
-              </w:rPr>
-              <w:t>להוסיף pH Plus</w:t>
-            </w:r>
-          </w:p>
-        </w:tc>
-        <w:tc>
-          <w:tcPr>
-            <w:tcW w:type="dxa" w:w="1368"/>
-            <w:tcBorders>
-              <w:top w:val="single" w:sz="6" w:space="0" w:color="D8E6EA"/>
-              <w:left w:val="single" w:sz="6" w:space="0" w:color="D8E6EA"/>
-              <w:bottom w:val="single" w:sz="6" w:space="0" w:color="D8E6EA"/>
-              <w:right w:val="single" w:sz="6" w:space="0" w:color="D8E6EA"/>
-            </w:tcBorders>
-            <w:tcMar>
-              <w:top w:w="110" w:type="dxa"/>
-              <w:start w:w="120" w:type="dxa"/>
-              <w:bottom w:w="110" w:type="dxa"/>
-              <w:end w:w="120" w:type="dxa"/>
-            </w:tcMar>
-            <w:vAlign w:val="center"/>
-          </w:tcPr>
-          <w:p>
-            <w:pPr>
-              <w:spacing w:after="0"/>
-              <w:jc w:val="right"/>
-              <w:bidi w:val="1"/>
-            </w:pPr>
-            <w:r>
-              <w:rPr>
-                <w:rFonts w:ascii="Arial" w:hAnsi="Arial" w:cs="Arial"/>
-                <w:b w:val="0"/>
-                <w:color w:val="0B2545"/>
-                <w:sz w:val="18"/>
-              </w:rPr>
-              <w:t>אין פעולה</w:t>
-            </w:r>
-          </w:p>
-        </w:tc>
-        <w:tc>
-          <w:tcPr>
-            <w:tcW w:type="dxa" w:w="2376"/>
-            <w:tcBorders>
-              <w:top w:val="single" w:sz="6" w:space="0" w:color="D8E6EA"/>
-              <w:left w:val="single" w:sz="6" w:space="0" w:color="D8E6EA"/>
-              <w:bottom w:val="single" w:sz="6" w:space="0" w:color="D8E6EA"/>
-              <w:right w:val="single" w:sz="6" w:space="0" w:color="D8E6EA"/>
-            </w:tcBorders>
-            <w:tcMar>
-              <w:top w:w="110" w:type="dxa"/>
-              <w:start w:w="120" w:type="dxa"/>
-              <w:bottom w:w="110" w:type="dxa"/>
-              <w:end w:w="120" w:type="dxa"/>
-            </w:tcMar>
-            <w:vAlign w:val="center"/>
-          </w:tcPr>
-          <w:p>
-            <w:pPr>
-              <w:spacing w:after="0"/>
-              <w:jc w:val="right"/>
-              <w:bidi w:val="1"/>
-            </w:pPr>
-            <w:r>
-              <w:rPr>
-                <w:rFonts w:ascii="Arial" w:hAnsi="Arial" w:cs="Arial"/>
-                <w:b w:val="0"/>
-                <w:color w:val="0B2545"/>
-                <w:sz w:val="18"/>
-              </w:rPr>
-              <w:t>להוסיף חומצה להורדת pH</w:t>
-            </w:r>
-          </w:p>
-        </w:tc>
-        <w:tc>
-          <w:tcPr>
-            <w:tcW w:type="dxa" w:w="2592"/>
-            <w:tcBorders>
-              <w:top w:val="single" w:sz="6" w:space="0" w:color="D8E6EA"/>
-              <w:left w:val="single" w:sz="6" w:space="0" w:color="D8E6EA"/>
-              <w:bottom w:val="single" w:sz="6" w:space="0" w:color="D8E6EA"/>
-              <w:right w:val="single" w:sz="6" w:space="0" w:color="D8E6EA"/>
-            </w:tcBorders>
-            <w:tcMar>
-              <w:top w:w="110" w:type="dxa"/>
-              <w:start w:w="120" w:type="dxa"/>
-              <w:bottom w:w="110" w:type="dxa"/>
-              <w:end w:w="120" w:type="dxa"/>
-            </w:tcMar>
-            <w:vAlign w:val="center"/>
-          </w:tcPr>
-          <w:p>
-            <w:pPr>
-              <w:spacing w:after="0"/>
-              <w:jc w:val="right"/>
-              <w:bidi w:val="1"/>
-            </w:pPr>
-            <w:r>
-              <w:rPr>
-                <w:rFonts w:ascii="Arial" w:hAnsi="Arial" w:cs="Arial"/>
-                <w:b w:val="0"/>
-                <w:color w:val="0B2545"/>
-                <w:sz w:val="18"/>
-              </w:rPr>
-              <w:t>pH משפיע על נוחות רחצה, קורוזיה, אבנית ויעילות הכלור.</w:t>
-            </w:r>
-          </w:p>
-        </w:tc>
-      </w:tr>
-      <w:tr>
-        <w:tc>
-          <w:tcPr>
-            <w:tcW w:type="dxa" w:w="1512"/>
-            <w:tcBorders>
-              <w:top w:val="single" w:sz="6" w:space="0" w:color="D8E6EA"/>
-              <w:left w:val="single" w:sz="6" w:space="0" w:color="D8E6EA"/>
-              <w:bottom w:val="single" w:sz="6" w:space="0" w:color="D8E6EA"/>
-              <w:right w:val="single" w:sz="6" w:space="0" w:color="D8E6EA"/>
-            </w:tcBorders>
-            <w:tcMar>
-              <w:top w:w="110" w:type="dxa"/>
-              <w:start w:w="120" w:type="dxa"/>
-              <w:bottom w:w="110" w:type="dxa"/>
-              <w:end w:w="120" w:type="dxa"/>
-            </w:tcMar>
-            <w:vAlign w:val="center"/>
-          </w:tcPr>
-          <w:p>
-            <w:pPr>
-              <w:spacing w:after="0"/>
-              <w:jc w:val="right"/>
-              <w:bidi w:val="1"/>
-            </w:pPr>
-            <w:r>
-              <w:rPr>
-                <w:rFonts w:ascii="Arial" w:hAnsi="Arial" w:cs="Arial"/>
-                <w:b w:val="0"/>
-                <w:color w:val="0B2545"/>
-                <w:sz w:val="18"/>
-              </w:rPr>
-              <w:t>כלור חופשי</w:t>
-            </w:r>
-          </w:p>
-        </w:tc>
-        <w:tc>
-          <w:tcPr>
-            <w:tcW w:type="dxa" w:w="2376"/>
-            <w:tcBorders>
-              <w:top w:val="single" w:sz="6" w:space="0" w:color="D8E6EA"/>
-              <w:left w:val="single" w:sz="6" w:space="0" w:color="D8E6EA"/>
-              <w:bottom w:val="single" w:sz="6" w:space="0" w:color="D8E6EA"/>
-              <w:right w:val="single" w:sz="6" w:space="0" w:color="D8E6EA"/>
-            </w:tcBorders>
-            <w:tcMar>
-              <w:top w:w="110" w:type="dxa"/>
-              <w:start w:w="120" w:type="dxa"/>
-              <w:bottom w:w="110" w:type="dxa"/>
-              <w:end w:w="120" w:type="dxa"/>
-            </w:tcMar>
-            <w:vAlign w:val="center"/>
-          </w:tcPr>
-          <w:p>
-            <w:pPr>
-              <w:spacing w:after="0"/>
-              <w:jc w:val="right"/>
-              <w:bidi w:val="1"/>
-            </w:pPr>
-            <w:r>
-              <w:rPr>
-                <w:rFonts w:ascii="Arial" w:hAnsi="Arial" w:cs="Arial"/>
-                <w:b w:val="0"/>
-                <w:color w:val="0B2545"/>
-                <w:sz w:val="18"/>
-              </w:rPr>
-              <w:t>להוסיף כלור נוזלי. אם יש טבליות פעילות, להפחית מינון</w:t>
-            </w:r>
-          </w:p>
-        </w:tc>
-        <w:tc>
-          <w:tcPr>
-            <w:tcW w:type="dxa" w:w="1368"/>
-            <w:tcBorders>
-              <w:top w:val="single" w:sz="6" w:space="0" w:color="D8E6EA"/>
-              <w:left w:val="single" w:sz="6" w:space="0" w:color="D8E6EA"/>
-              <w:bottom w:val="single" w:sz="6" w:space="0" w:color="D8E6EA"/>
-              <w:right w:val="single" w:sz="6" w:space="0" w:color="D8E6EA"/>
-            </w:tcBorders>
-            <w:tcMar>
-              <w:top w:w="110" w:type="dxa"/>
-              <w:start w:w="120" w:type="dxa"/>
-              <w:bottom w:w="110" w:type="dxa"/>
-              <w:end w:w="120" w:type="dxa"/>
-            </w:tcMar>
-            <w:vAlign w:val="center"/>
-          </w:tcPr>
-          <w:p>
-            <w:pPr>
-              <w:spacing w:after="0"/>
-              <w:jc w:val="right"/>
-              <w:bidi w:val="1"/>
-            </w:pPr>
-            <w:r>
-              <w:rPr>
-                <w:rFonts w:ascii="Arial" w:hAnsi="Arial" w:cs="Arial"/>
-                <w:b w:val="0"/>
-                <w:color w:val="0B2545"/>
-                <w:sz w:val="18"/>
-              </w:rPr>
-              <w:t>אין פעולה</w:t>
-            </w:r>
-          </w:p>
-        </w:tc>
-        <w:tc>
-          <w:tcPr>
-            <w:tcW w:type="dxa" w:w="2376"/>
-            <w:tcBorders>
-              <w:top w:val="single" w:sz="6" w:space="0" w:color="D8E6EA"/>
-              <w:left w:val="single" w:sz="6" w:space="0" w:color="D8E6EA"/>
-              <w:bottom w:val="single" w:sz="6" w:space="0" w:color="D8E6EA"/>
-              <w:right w:val="single" w:sz="6" w:space="0" w:color="D8E6EA"/>
-            </w:tcBorders>
-            <w:tcMar>
-              <w:top w:w="110" w:type="dxa"/>
-              <w:start w:w="120" w:type="dxa"/>
-              <w:bottom w:w="110" w:type="dxa"/>
-              <w:end w:w="120" w:type="dxa"/>
-            </w:tcMar>
-            <w:vAlign w:val="center"/>
-          </w:tcPr>
-          <w:p>
-            <w:pPr>
-              <w:spacing w:after="0"/>
-              <w:jc w:val="right"/>
-              <w:bidi w:val="1"/>
-            </w:pPr>
-            <w:r>
-              <w:rPr>
-                <w:rFonts w:ascii="Arial" w:hAnsi="Arial" w:cs="Arial"/>
-                <w:b w:val="0"/>
-                <w:color w:val="0B2545"/>
-                <w:sz w:val="18"/>
-              </w:rPr>
-              <w:t>אם גבוה מעט: סירקולציה והמתנה. אם גבוה מאוד: מנטרל כלור</w:t>
-            </w:r>
-          </w:p>
-        </w:tc>
-        <w:tc>
-          <w:tcPr>
-            <w:tcW w:type="dxa" w:w="2592"/>
-            <w:tcBorders>
-              <w:top w:val="single" w:sz="6" w:space="0" w:color="D8E6EA"/>
-              <w:left w:val="single" w:sz="6" w:space="0" w:color="D8E6EA"/>
-              <w:bottom w:val="single" w:sz="6" w:space="0" w:color="D8E6EA"/>
-              <w:right w:val="single" w:sz="6" w:space="0" w:color="D8E6EA"/>
-            </w:tcBorders>
-            <w:tcMar>
-              <w:top w:w="110" w:type="dxa"/>
-              <w:start w:w="120" w:type="dxa"/>
-              <w:bottom w:w="110" w:type="dxa"/>
-              <w:end w:w="120" w:type="dxa"/>
-            </w:tcMar>
-            <w:vAlign w:val="center"/>
-          </w:tcPr>
-          <w:p>
-            <w:pPr>
-              <w:spacing w:after="0"/>
-              <w:jc w:val="right"/>
-              <w:bidi w:val="1"/>
-            </w:pPr>
-            <w:r>
-              <w:rPr>
-                <w:rFonts w:ascii="Arial" w:hAnsi="Arial" w:cs="Arial"/>
-                <w:b w:val="0"/>
-                <w:color w:val="0B2545"/>
-                <w:sz w:val="18"/>
-              </w:rPr>
-              <w:t>כלור נמוך פוגע בחיטוי. כלור גבוה גורם לצריבה וריח חזק.</w:t>
-            </w:r>
-          </w:p>
-        </w:tc>
-      </w:tr>
-      <w:tr>
-        <w:tc>
-          <w:tcPr>
-            <w:tcW w:type="dxa" w:w="1512"/>
-            <w:tcBorders>
-              <w:top w:val="single" w:sz="6" w:space="0" w:color="D8E6EA"/>
-              <w:left w:val="single" w:sz="6" w:space="0" w:color="D8E6EA"/>
-              <w:bottom w:val="single" w:sz="6" w:space="0" w:color="D8E6EA"/>
-              <w:right w:val="single" w:sz="6" w:space="0" w:color="D8E6EA"/>
-            </w:tcBorders>
-            <w:tcMar>
-              <w:top w:w="110" w:type="dxa"/>
-              <w:start w:w="120" w:type="dxa"/>
-              <w:bottom w:w="110" w:type="dxa"/>
-              <w:end w:w="120" w:type="dxa"/>
-            </w:tcMar>
-            <w:vAlign w:val="center"/>
-          </w:tcPr>
-          <w:p>
-            <w:pPr>
-              <w:spacing w:after="0"/>
-              <w:jc w:val="right"/>
-              <w:bidi w:val="1"/>
-            </w:pPr>
-            <w:r>
-              <w:rPr>
-                <w:rFonts w:ascii="Arial" w:hAnsi="Arial" w:cs="Arial"/>
-                <w:b w:val="0"/>
-                <w:color w:val="0B2545"/>
-                <w:sz w:val="18"/>
-              </w:rPr>
-              <w:t>מייצב כלור / CYA</w:t>
-            </w:r>
-          </w:p>
-        </w:tc>
-        <w:tc>
-          <w:tcPr>
-            <w:tcW w:type="dxa" w:w="2376"/>
-            <w:tcBorders>
-              <w:top w:val="single" w:sz="6" w:space="0" w:color="D8E6EA"/>
-              <w:left w:val="single" w:sz="6" w:space="0" w:color="D8E6EA"/>
-              <w:bottom w:val="single" w:sz="6" w:space="0" w:color="D8E6EA"/>
-              <w:right w:val="single" w:sz="6" w:space="0" w:color="D8E6EA"/>
-            </w:tcBorders>
-            <w:tcMar>
-              <w:top w:w="110" w:type="dxa"/>
-              <w:start w:w="120" w:type="dxa"/>
-              <w:bottom w:w="110" w:type="dxa"/>
-              <w:end w:w="120" w:type="dxa"/>
-            </w:tcMar>
-            <w:vAlign w:val="center"/>
-          </w:tcPr>
-          <w:p>
-            <w:pPr>
-              <w:spacing w:after="0"/>
-              <w:jc w:val="right"/>
-              <w:bidi w:val="1"/>
-            </w:pPr>
-            <w:r>
-              <w:rPr>
-                <w:rFonts w:ascii="Arial" w:hAnsi="Arial" w:cs="Arial"/>
-                <w:b w:val="0"/>
-                <w:color w:val="0B2545"/>
-                <w:sz w:val="18"/>
-              </w:rPr>
-              <w:t>להוסיף Stabilizer לפי הוראות יצרן</w:t>
-            </w:r>
-          </w:p>
-        </w:tc>
-        <w:tc>
-          <w:tcPr>
-            <w:tcW w:type="dxa" w:w="1368"/>
-            <w:tcBorders>
-              <w:top w:val="single" w:sz="6" w:space="0" w:color="D8E6EA"/>
-              <w:left w:val="single" w:sz="6" w:space="0" w:color="D8E6EA"/>
-              <w:bottom w:val="single" w:sz="6" w:space="0" w:color="D8E6EA"/>
-              <w:right w:val="single" w:sz="6" w:space="0" w:color="D8E6EA"/>
-            </w:tcBorders>
-            <w:tcMar>
-              <w:top w:w="110" w:type="dxa"/>
-              <w:start w:w="120" w:type="dxa"/>
-              <w:bottom w:w="110" w:type="dxa"/>
-              <w:end w:w="120" w:type="dxa"/>
-            </w:tcMar>
-            <w:vAlign w:val="center"/>
-          </w:tcPr>
-          <w:p>
-            <w:pPr>
-              <w:spacing w:after="0"/>
-              <w:jc w:val="right"/>
-              <w:bidi w:val="1"/>
-            </w:pPr>
-            <w:r>
-              <w:rPr>
-                <w:rFonts w:ascii="Arial" w:hAnsi="Arial" w:cs="Arial"/>
-                <w:b w:val="0"/>
-                <w:color w:val="0B2545"/>
-                <w:sz w:val="18"/>
-              </w:rPr>
-              <w:t>אין פעולה</w:t>
-            </w:r>
-          </w:p>
-        </w:tc>
-        <w:tc>
-          <w:tcPr>
-            <w:tcW w:type="dxa" w:w="2376"/>
-            <w:tcBorders>
-              <w:top w:val="single" w:sz="6" w:space="0" w:color="D8E6EA"/>
-              <w:left w:val="single" w:sz="6" w:space="0" w:color="D8E6EA"/>
-              <w:bottom w:val="single" w:sz="6" w:space="0" w:color="D8E6EA"/>
-              <w:right w:val="single" w:sz="6" w:space="0" w:color="D8E6EA"/>
-            </w:tcBorders>
-            <w:tcMar>
-              <w:top w:w="110" w:type="dxa"/>
-              <w:start w:w="120" w:type="dxa"/>
-              <w:bottom w:w="110" w:type="dxa"/>
-              <w:end w:w="120" w:type="dxa"/>
-            </w:tcMar>
-            <w:vAlign w:val="center"/>
-          </w:tcPr>
-          <w:p>
-            <w:pPr>
-              <w:spacing w:after="0"/>
-              <w:jc w:val="right"/>
-              <w:bidi w:val="1"/>
-            </w:pPr>
-            <w:r>
-              <w:rPr>
-                <w:rFonts w:ascii="Arial" w:hAnsi="Arial" w:cs="Arial"/>
-                <w:b w:val="0"/>
-                <w:color w:val="0B2545"/>
-                <w:sz w:val="18"/>
-              </w:rPr>
-              <w:t>להחליף חלק מהמים</w:t>
-            </w:r>
-          </w:p>
-        </w:tc>
-        <w:tc>
-          <w:tcPr>
-            <w:tcW w:type="dxa" w:w="2592"/>
-            <w:tcBorders>
-              <w:top w:val="single" w:sz="6" w:space="0" w:color="D8E6EA"/>
-              <w:left w:val="single" w:sz="6" w:space="0" w:color="D8E6EA"/>
-              <w:bottom w:val="single" w:sz="6" w:space="0" w:color="D8E6EA"/>
-              <w:right w:val="single" w:sz="6" w:space="0" w:color="D8E6EA"/>
-            </w:tcBorders>
-            <w:tcMar>
-              <w:top w:w="110" w:type="dxa"/>
-              <w:start w:w="120" w:type="dxa"/>
-              <w:bottom w:w="110" w:type="dxa"/>
-              <w:end w:w="120" w:type="dxa"/>
-            </w:tcMar>
-            <w:vAlign w:val="center"/>
-          </w:tcPr>
-          <w:p>
-            <w:pPr>
-              <w:spacing w:after="0"/>
-              <w:jc w:val="right"/>
-              <w:bidi w:val="1"/>
-            </w:pPr>
-            <w:r>
-              <w:rPr>
-                <w:rFonts w:ascii="Arial" w:hAnsi="Arial" w:cs="Arial"/>
-                <w:b w:val="0"/>
-                <w:color w:val="0B2545"/>
-                <w:sz w:val="18"/>
-              </w:rPr>
-              <w:t>CYA נמוך גורם לשמש לפרק כלור מהר. CYA גבוה מחליש את פעולת הכלור.</w:t>
-            </w:r>
-          </w:p>
-        </w:tc>
-      </w:tr>
-    </w:tbl>
-    <w:p/>
-    <w:p>
-      <w:pPr>
-        <w:spacing w:after="100" w:line="276" w:lineRule="auto" w:before="240"/>
-        <w:jc w:val="right"/>
-        <w:bidi w:val="1"/>
-      </w:pPr>
-      <w:r>
-        <w:rPr>
-          <w:rFonts w:ascii="Arial" w:hAnsi="Arial" w:cs="Arial"/>
-          <w:b/>
-          <w:color w:val="11B5C8"/>
-          <w:sz w:val="34"/>
-        </w:rPr>
-        <w:t>5. סדר עדיפות שהאפליקציה מפעילה</w:t>
+        <w:t>4. סדר עדיפות שהאפליקציה מפעילה</w:t>
       </w:r>
     </w:p>
     <w:tbl>
@@ -5273,7 +8244,7 @@
                 <w:color w:val="0B2545"/>
                 <w:sz w:val="18"/>
               </w:rPr>
-              <w:t>משפיע על שמירת הכלור לאורך זמן, אך לרוב לא מטופל לפני pH ואלקליניות.</w:t>
+              <w:t>רק במותג סטיק שמודד CYA או לאחר הזנה ידנית; AquaChek Pro שבתמונה אינו מודד אותו.</w:t>
             </w:r>
           </w:p>
         </w:tc>
@@ -5293,7 +8264,7 @@
           <w:color w:val="11B5C8"/>
           <w:sz w:val="34"/>
         </w:rPr>
-        <w:t>6. חריגים חשובים</w:t>
+        <w:t>5. חריגים חשובים</w:t>
       </w:r>
     </w:p>
     <w:tbl>
@@ -5401,7 +8372,7 @@
           <w:color w:val="11B5C8"/>
           <w:sz w:val="34"/>
         </w:rPr>
-        <w:t>7. מה לבקש מבודק הבריכות לאשר</w:t>
+        <w:t>6. מה לבקש מבודק הבריכות לאשר</w:t>
       </w:r>
     </w:p>
     <w:p>
@@ -5418,7 +8389,41 @@
           <w:color w:val="0B2545"/>
           <w:sz w:val="20"/>
         </w:rPr>
-        <w:t>☐ האם הטווחים 1-3 כלור, 7.2-7.6 pH, 80-120 אלקליניות ו-30-50 CYA מתאימים לבריכות פרטיות בארץ?</w:t>
+        <w:t>☐ האם הטווחים 1-3 כלור חופשי, 7.2-7.6 pH ו-80-120 אלקליניות מתאימים לבריכות פרטיות בארץ?</w:t>
+      </w:r>
+    </w:p>
+    <w:p>
+      <w:pPr>
+        <w:spacing w:after="80" w:line="276" w:lineRule="auto"/>
+        <w:ind w:left="144"/>
+        <w:jc w:val="right"/>
+        <w:bidi w:val="1"/>
+      </w:pPr>
+      <w:r>
+        <w:rPr>
+          <w:rFonts w:ascii="Arial" w:hAnsi="Arial" w:cs="Arial"/>
+          <w:b w:val="0"/>
+          <w:color w:val="0B2545"/>
+          <w:sz w:val="20"/>
+        </w:rPr>
+        <w:t>☐ האם נכון לקרוא את הפד המשולב כ-TC 0/0.5/1/3/5/10 או TB 0/1/2/5/10/20 לפי סוג הבריכה?</w:t>
+      </w:r>
+    </w:p>
+    <w:p>
+      <w:pPr>
+        <w:spacing w:after="80" w:line="276" w:lineRule="auto"/>
+        <w:ind w:left="144"/>
+        <w:jc w:val="right"/>
+        <w:bidi w:val="1"/>
+      </w:pPr>
+      <w:r>
+        <w:rPr>
+          <w:rFonts w:ascii="Arial" w:hAnsi="Arial" w:cs="Arial"/>
+          <w:b w:val="0"/>
+          <w:color w:val="0B2545"/>
+          <w:sz w:val="20"/>
+        </w:rPr>
+        <w:t>☐ האם מוסכם שאין להציג CYA כתוצאה של AquaChek Pro, משום שאין בסטיק הזה פד CYA?</w:t>
       </w:r>
     </w:p>
     <w:p>

</xml_diff>